<commit_message>
technically finished with the doc but need touch ups and human read proof wtv its called
</commit_message>
<xml_diff>
--- a/2B21-04_group_submission.docx
+++ b/2B21-04_group_submission.docx
@@ -2,6 +2,7 @@
 <file path=word/document.xml><?xml version="1.0" encoding="utf-8"?>
 <w:document xmlns:wpc="http://schemas.microsoft.com/office/word/2010/wordprocessingCanvas" xmlns:cx="http://schemas.microsoft.com/office/drawing/2014/chartex" xmlns:cx1="http://schemas.microsoft.com/office/drawing/2015/9/8/chartex" xmlns:cx2="http://schemas.microsoft.com/office/drawing/2015/10/21/chartex" xmlns:cx3="http://schemas.microsoft.com/office/drawing/2016/5/9/chartex" xmlns:cx4="http://schemas.microsoft.com/office/drawing/2016/5/10/chartex" xmlns:cx5="http://schemas.microsoft.com/office/drawing/2016/5/11/chartex" xmlns:cx6="http://schemas.microsoft.com/office/drawing/2016/5/12/chartex" xmlns:cx7="http://schemas.microsoft.com/office/drawing/2016/5/13/chartex" xmlns:cx8="http://schemas.microsoft.com/office/drawing/2016/5/14/chartex" xmlns:mc="http://schemas.openxmlformats.org/markup-compatibility/2006" xmlns:aink="http://schemas.microsoft.com/office/drawing/2016/ink" xmlns:am3d="http://schemas.microsoft.com/office/drawing/2017/model3d" xmlns:o="urn:schemas-microsoft-com:office:office" xmlns:oel="http://schemas.microsoft.com/office/2019/extlst" xmlns:r="http://schemas.openxmlformats.org/officeDocument/2006/relationships" xmlns:m="http://schemas.openxmlformats.org/officeDocument/2006/math" xmlns:v="urn:schemas-microsoft-com:vml" xmlns:wp14="http://schemas.microsoft.com/office/word/2010/wordprocessingDrawing" xmlns:wp="http://schemas.openxmlformats.org/drawingml/2006/wordprocessingDrawing" xmlns:w10="urn:schemas-microsoft-com:office:word" xmlns:w="http://schemas.openxmlformats.org/wordprocessingml/2006/main" xmlns:w14="http://schemas.microsoft.com/office/word/2010/wordml" xmlns:w15="http://schemas.microsoft.com/office/word/2012/wordml" xmlns:w16cex="http://schemas.microsoft.com/office/word/2018/wordml/cex" xmlns:w16cid="http://schemas.microsoft.com/office/word/2016/wordml/cid" xmlns:w16="http://schemas.microsoft.com/office/word/2018/wordml" xmlns:w16du="http://schemas.microsoft.com/office/word/2023/wordml/word16du" xmlns:w16sdtdh="http://schemas.microsoft.com/office/word/2020/wordml/sdtdatahash" xmlns:w16sdtfl="http://schemas.microsoft.com/office/word/2024/wordml/sdtformatlock" xmlns:w16se="http://schemas.microsoft.com/office/word/2015/wordml/symex" xmlns:wpg="http://schemas.microsoft.com/office/word/2010/wordprocessingGroup" xmlns:wpi="http://schemas.microsoft.com/office/word/2010/wordprocessingInk" xmlns:wne="http://schemas.microsoft.com/office/word/2006/wordml" xmlns:wps="http://schemas.microsoft.com/office/word/2010/wordprocessingShape" mc:Ignorable="w14 w15 w16se w16cid w16 w16cex w16sdtdh w16sdtfl w16du wp14">
   <w:body>
+    <w:bookmarkStart w:id="0" w:name="_Hlk198869228"/>
     <w:p>
       <w:pPr>
         <w:pStyle w:val="NoSpacing"/>
@@ -14,7 +15,6 @@
           <w:lang w:eastAsia="en-SG" w:bidi="th-TH"/>
         </w:rPr>
       </w:pPr>
-      <w:bookmarkStart w:id="0" w:name="_Hlk198869228"/>
       <w:r>
         <w:rPr>
           <w:noProof/>
@@ -2765,6 +2765,9 @@
     </w:p>
     <w:p>
       <w:r>
+        <w:rPr>
+          <w:noProof/>
+        </w:rPr>
         <w:lastRenderedPageBreak/>
         <w:drawing>
           <wp:inline distT="0" distB="0" distL="0" distR="0" wp14:anchorId="165FDAE8" wp14:editId="23098F9E">
@@ -3050,27 +3053,1005 @@
       </w:r>
     </w:p>
     <w:p>
-      <w:r>
+      <w:pPr>
+        <w:pStyle w:val="ListParagraph"/>
         <w:rPr>
           <w:b/>
-          <w:sz w:val="20"/>
-        </w:rPr>
-        <w:t>&lt;&lt; PASTE MySQL Workbench reverse-engineered diagram of CA2DW2B2105 here &gt;&gt;</w:t>
-      </w:r>
+          <w:bCs/>
+        </w:rPr>
+      </w:pPr>
     </w:p>
     <w:p>
-      <w:r>
-        <w:rPr>
-          <w:sz w:val="20"/>
-        </w:rPr>
-        <w:t>ETL verification: (1) Row-count reconciliation - completed loans in OLTP (SELECT COUNT(*) FROM Loan WHERE ReturnDatetime IS NOT NULL) = 12,343 and FactLoan = 12,343; DimMember = Member = 301; DimBook = Book = 500; DimStaff = Staff = 51. (2) Measure reconciliation - SUM(DATEDIFF(ReturnDatetime, StartDatetime)) computed directly on the OLTP Loan table = 108,801 days, identical to SUM(LoanDurationDays) in FactLoan, proving the duration measure was derived correctly for every row. (3) Referential integrity - a LEFT JOIN from FactLoan to each dimension returns 0 orphan rows, and all foreign keys are enforced by constraints so no fact row can reference a missing dimension member. The verification queries are included at the bottom of DW_insert.sql.</w:t>
+      <w:pPr>
+        <w:pStyle w:val="ListParagraph"/>
+        <w:rPr>
+          <w:b/>
+          <w:bCs/>
+        </w:rPr>
+      </w:pPr>
+      <w:r>
+        <w:rPr>
+          <w:b/>
+          <w:bCs/>
+        </w:rPr>
+        <w:t>Creation of table statements:</w:t>
       </w:r>
     </w:p>
     <w:p>
+      <w:pPr>
+        <w:pStyle w:val="ListParagraph"/>
+        <w:rPr>
+          <w:lang w:val="en-SG"/>
+        </w:rPr>
+      </w:pPr>
+      <w:r>
+        <w:rPr>
+          <w:lang w:val="en-SG"/>
+        </w:rPr>
+        <w:t>-- Date dimension, day-level granularity</w:t>
+      </w:r>
+    </w:p>
+    <w:p>
+      <w:pPr>
+        <w:pStyle w:val="ListParagraph"/>
+        <w:rPr>
+          <w:lang w:val="en-SG"/>
+        </w:rPr>
+      </w:pPr>
+      <w:r>
+        <w:rPr>
+          <w:lang w:val="en-SG"/>
+        </w:rPr>
+        <w:t>CREATE TABLE DimDate (</w:t>
+      </w:r>
+    </w:p>
+    <w:p>
+      <w:pPr>
+        <w:pStyle w:val="ListParagraph"/>
+        <w:rPr>
+          <w:lang w:val="en-SG"/>
+        </w:rPr>
+      </w:pPr>
+      <w:r>
+        <w:rPr>
+          <w:lang w:val="en-SG"/>
+        </w:rPr>
+        <w:t>    DateKey INT AUTO_INCREMENT PRIMARY KEY,   -- surrogate key</w:t>
+      </w:r>
+    </w:p>
+    <w:p>
+      <w:pPr>
+        <w:pStyle w:val="ListParagraph"/>
+        <w:rPr>
+          <w:lang w:val="en-SG"/>
+        </w:rPr>
+      </w:pPr>
+      <w:r>
+        <w:rPr>
+          <w:lang w:val="en-SG"/>
+        </w:rPr>
+        <w:t>    FullDate DATE NOT NULL UNIQUE,</w:t>
+      </w:r>
+    </w:p>
+    <w:p>
+      <w:pPr>
+        <w:pStyle w:val="ListParagraph"/>
+        <w:rPr>
+          <w:lang w:val="en-SG"/>
+        </w:rPr>
+      </w:pPr>
+      <w:r>
+        <w:rPr>
+          <w:lang w:val="en-SG"/>
+        </w:rPr>
+        <w:t>    Day INT NOT NULL,</w:t>
+      </w:r>
+    </w:p>
+    <w:p>
+      <w:pPr>
+        <w:pStyle w:val="ListParagraph"/>
+        <w:rPr>
+          <w:lang w:val="en-SG"/>
+        </w:rPr>
+      </w:pPr>
+      <w:r>
+        <w:rPr>
+          <w:lang w:val="en-SG"/>
+        </w:rPr>
+        <w:t>    DayOfWeek VARCHAR(10) NOT NULL,</w:t>
+      </w:r>
+    </w:p>
+    <w:p>
+      <w:pPr>
+        <w:pStyle w:val="ListParagraph"/>
+        <w:rPr>
+          <w:lang w:val="en-SG"/>
+        </w:rPr>
+      </w:pPr>
+      <w:r>
+        <w:rPr>
+          <w:lang w:val="en-SG"/>
+        </w:rPr>
+        <w:t>    IsWeekend BOOLEAN NOT NULL,</w:t>
+      </w:r>
+    </w:p>
+    <w:p>
+      <w:pPr>
+        <w:pStyle w:val="ListParagraph"/>
+        <w:rPr>
+          <w:lang w:val="en-SG"/>
+        </w:rPr>
+      </w:pPr>
+      <w:r>
+        <w:rPr>
+          <w:lang w:val="en-SG"/>
+        </w:rPr>
+        <w:t>    Month INT NOT NULL,</w:t>
+      </w:r>
+    </w:p>
+    <w:p>
+      <w:pPr>
+        <w:pStyle w:val="ListParagraph"/>
+        <w:rPr>
+          <w:lang w:val="en-SG"/>
+        </w:rPr>
+      </w:pPr>
+      <w:r>
+        <w:rPr>
+          <w:lang w:val="en-SG"/>
+        </w:rPr>
+        <w:t>    MonthName VARCHAR(10) NOT NULL,</w:t>
+      </w:r>
+    </w:p>
+    <w:p>
+      <w:pPr>
+        <w:pStyle w:val="ListParagraph"/>
+        <w:rPr>
+          <w:lang w:val="en-SG"/>
+        </w:rPr>
+      </w:pPr>
+      <w:r>
+        <w:rPr>
+          <w:lang w:val="en-SG"/>
+        </w:rPr>
+        <w:t>    Quarter INT NOT NULL,</w:t>
+      </w:r>
+    </w:p>
+    <w:p>
+      <w:pPr>
+        <w:pStyle w:val="ListParagraph"/>
+        <w:rPr>
+          <w:lang w:val="en-SG"/>
+        </w:rPr>
+      </w:pPr>
+      <w:r>
+        <w:rPr>
+          <w:lang w:val="en-SG"/>
+        </w:rPr>
+        <w:t>    Year INT NOT NULL</w:t>
+      </w:r>
+    </w:p>
+    <w:p>
+      <w:pPr>
+        <w:pStyle w:val="ListParagraph"/>
+        <w:rPr>
+          <w:lang w:val="en-SG"/>
+        </w:rPr>
+      </w:pPr>
+      <w:r>
+        <w:rPr>
+          <w:lang w:val="en-SG"/>
+        </w:rPr>
+        <w:t>);</w:t>
+      </w:r>
+    </w:p>
+    <w:p>
+      <w:pPr>
+        <w:pStyle w:val="ListParagraph"/>
+        <w:rPr>
+          <w:lang w:val="en-SG"/>
+        </w:rPr>
+      </w:pPr>
+    </w:p>
+    <w:p>
+      <w:pPr>
+        <w:pStyle w:val="ListParagraph"/>
+        <w:rPr>
+          <w:lang w:val="en-SG"/>
+        </w:rPr>
+      </w:pPr>
+      <w:r>
+        <w:rPr>
+          <w:lang w:val="en-SG"/>
+        </w:rPr>
+        <w:t>CREATE TABLE DimMember (</w:t>
+      </w:r>
+    </w:p>
+    <w:p>
+      <w:pPr>
+        <w:pStyle w:val="ListParagraph"/>
+        <w:rPr>
+          <w:lang w:val="en-SG"/>
+        </w:rPr>
+      </w:pPr>
+      <w:r>
+        <w:rPr>
+          <w:lang w:val="en-SG"/>
+        </w:rPr>
+        <w:t>    MemberKey INT AUTO_INCREMENT PRIMARY KEY, -- surrogate key</w:t>
+      </w:r>
+    </w:p>
+    <w:p>
+      <w:pPr>
+        <w:pStyle w:val="ListParagraph"/>
+        <w:rPr>
+          <w:lang w:val="en-SG"/>
+        </w:rPr>
+      </w:pPr>
+      <w:r>
+        <w:rPr>
+          <w:lang w:val="en-SG"/>
+        </w:rPr>
+        <w:t>    MemberID CHAR(10) NOT NULL,               -- natural key</w:t>
+      </w:r>
+    </w:p>
+    <w:p>
+      <w:pPr>
+        <w:pStyle w:val="ListParagraph"/>
+        <w:rPr>
+          <w:lang w:val="en-SG"/>
+        </w:rPr>
+      </w:pPr>
+      <w:r>
+        <w:rPr>
+          <w:lang w:val="en-SG"/>
+        </w:rPr>
+        <w:t>    Name VARCHAR(100) NOT NULL,</w:t>
+      </w:r>
+    </w:p>
+    <w:p>
+      <w:pPr>
+        <w:pStyle w:val="ListParagraph"/>
+        <w:rPr>
+          <w:lang w:val="en-SG"/>
+        </w:rPr>
+      </w:pPr>
+      <w:r>
+        <w:rPr>
+          <w:lang w:val="en-SG"/>
+        </w:rPr>
+        <w:t>    Gender CHAR(1) NOT NULL,</w:t>
+      </w:r>
+    </w:p>
+    <w:p>
+      <w:pPr>
+        <w:pStyle w:val="ListParagraph"/>
+        <w:rPr>
+          <w:lang w:val="en-SG"/>
+        </w:rPr>
+      </w:pPr>
+      <w:r>
+        <w:rPr>
+          <w:lang w:val="en-SG"/>
+        </w:rPr>
+        <w:t>    Occupation VARCHAR(50) NULL,</w:t>
+      </w:r>
+    </w:p>
+    <w:p>
+      <w:pPr>
+        <w:pStyle w:val="ListParagraph"/>
+        <w:rPr>
+          <w:lang w:val="en-SG"/>
+        </w:rPr>
+      </w:pPr>
+      <w:r>
+        <w:rPr>
+          <w:lang w:val="en-SG"/>
+        </w:rPr>
+        <w:t>    RegistrationDate DATE NOT NULL,</w:t>
+      </w:r>
+    </w:p>
+    <w:p>
+      <w:pPr>
+        <w:pStyle w:val="ListParagraph"/>
+        <w:rPr>
+          <w:lang w:val="en-SG"/>
+        </w:rPr>
+      </w:pPr>
+      <w:r>
+        <w:rPr>
+          <w:lang w:val="en-SG"/>
+        </w:rPr>
+        <w:t>    TierName VARCHAR(20) NOT NULL,            -- denormalised tier attributes (star schema)</w:t>
+      </w:r>
+    </w:p>
+    <w:p>
+      <w:pPr>
+        <w:pStyle w:val="ListParagraph"/>
+        <w:rPr>
+          <w:lang w:val="en-SG"/>
+        </w:rPr>
+      </w:pPr>
+      <w:r>
+        <w:rPr>
+          <w:lang w:val="en-SG"/>
+        </w:rPr>
+        <w:t>    TierLevel INT NOT NULL,</w:t>
+      </w:r>
+    </w:p>
+    <w:p>
+      <w:pPr>
+        <w:pStyle w:val="ListParagraph"/>
+        <w:rPr>
+          <w:lang w:val="en-SG"/>
+        </w:rPr>
+      </w:pPr>
+      <w:r>
+        <w:rPr>
+          <w:lang w:val="en-SG"/>
+        </w:rPr>
+        <w:t>    BorrowLimit INT NOT NULL</w:t>
+      </w:r>
+    </w:p>
+    <w:p>
+      <w:pPr>
+        <w:pStyle w:val="ListParagraph"/>
+        <w:rPr>
+          <w:lang w:val="en-SG"/>
+        </w:rPr>
+      </w:pPr>
+      <w:r>
+        <w:rPr>
+          <w:lang w:val="en-SG"/>
+        </w:rPr>
+        <w:t>);</w:t>
+      </w:r>
+    </w:p>
+    <w:p>
+      <w:pPr>
+        <w:pStyle w:val="ListParagraph"/>
+        <w:rPr>
+          <w:lang w:val="en-SG"/>
+        </w:rPr>
+      </w:pPr>
+    </w:p>
+    <w:p>
+      <w:pPr>
+        <w:pStyle w:val="ListParagraph"/>
+        <w:rPr>
+          <w:lang w:val="en-SG"/>
+        </w:rPr>
+      </w:pPr>
+      <w:r>
+        <w:rPr>
+          <w:lang w:val="en-SG"/>
+        </w:rPr>
+        <w:t>CREATE TABLE DimStaff (</w:t>
+      </w:r>
+    </w:p>
+    <w:p>
+      <w:pPr>
+        <w:pStyle w:val="ListParagraph"/>
+        <w:rPr>
+          <w:lang w:val="en-SG"/>
+        </w:rPr>
+      </w:pPr>
+      <w:r>
+        <w:rPr>
+          <w:lang w:val="en-SG"/>
+        </w:rPr>
+        <w:t>    StaffKey INT AUTO_INCREMENT PRIMARY KEY,  -- surrogate key</w:t>
+      </w:r>
+    </w:p>
+    <w:p>
+      <w:pPr>
+        <w:pStyle w:val="ListParagraph"/>
+        <w:rPr>
+          <w:lang w:val="en-SG"/>
+        </w:rPr>
+      </w:pPr>
+      <w:r>
+        <w:rPr>
+          <w:lang w:val="en-SG"/>
+        </w:rPr>
+        <w:t>    StaffID CHAR(10) NOT NULL,                -- natural key</w:t>
+      </w:r>
+    </w:p>
+    <w:p>
+      <w:pPr>
+        <w:pStyle w:val="ListParagraph"/>
+        <w:rPr>
+          <w:lang w:val="en-SG"/>
+        </w:rPr>
+      </w:pPr>
+      <w:r>
+        <w:rPr>
+          <w:lang w:val="en-SG"/>
+        </w:rPr>
+        <w:t>    Name VARCHAR(100) NOT NULL,</w:t>
+      </w:r>
+    </w:p>
+    <w:p>
+      <w:pPr>
+        <w:pStyle w:val="ListParagraph"/>
+        <w:rPr>
+          <w:lang w:val="en-SG"/>
+        </w:rPr>
+      </w:pPr>
+      <w:r>
+        <w:rPr>
+          <w:lang w:val="en-SG"/>
+        </w:rPr>
+        <w:t>    Gender CHAR(1) NOT NULL,</w:t>
+      </w:r>
+    </w:p>
+    <w:p>
+      <w:pPr>
+        <w:pStyle w:val="ListParagraph"/>
+        <w:rPr>
+          <w:lang w:val="en-SG"/>
+        </w:rPr>
+      </w:pPr>
+      <w:r>
+        <w:rPr>
+          <w:lang w:val="en-SG"/>
+        </w:rPr>
+        <w:t>    EmploymentType VARCHAR(20) NOT NULL,</w:t>
+      </w:r>
+    </w:p>
+    <w:p>
+      <w:pPr>
+        <w:pStyle w:val="ListParagraph"/>
+        <w:rPr>
+          <w:lang w:val="en-SG"/>
+        </w:rPr>
+      </w:pPr>
+      <w:r>
+        <w:rPr>
+          <w:lang w:val="en-SG"/>
+        </w:rPr>
+        <w:t>    Department VARCHAR(50) NOT NULL,</w:t>
+      </w:r>
+    </w:p>
+    <w:p>
+      <w:pPr>
+        <w:pStyle w:val="ListParagraph"/>
+        <w:rPr>
+          <w:lang w:val="en-SG"/>
+        </w:rPr>
+      </w:pPr>
+      <w:r>
+        <w:rPr>
+          <w:lang w:val="en-SG"/>
+        </w:rPr>
+        <w:t>    StartDate DATE NOT NULL</w:t>
+      </w:r>
+    </w:p>
+    <w:p>
+      <w:pPr>
+        <w:pStyle w:val="ListParagraph"/>
+        <w:rPr>
+          <w:lang w:val="en-SG"/>
+        </w:rPr>
+      </w:pPr>
+      <w:r>
+        <w:rPr>
+          <w:lang w:val="en-SG"/>
+        </w:rPr>
+        <w:t>);</w:t>
+      </w:r>
+    </w:p>
+    <w:p>
+      <w:pPr>
+        <w:pStyle w:val="ListParagraph"/>
+        <w:rPr>
+          <w:lang w:val="en-SG"/>
+        </w:rPr>
+      </w:pPr>
+    </w:p>
+    <w:p>
+      <w:pPr>
+        <w:pStyle w:val="ListParagraph"/>
+        <w:rPr>
+          <w:lang w:val="en-SG"/>
+        </w:rPr>
+      </w:pPr>
+      <w:r>
+        <w:rPr>
+          <w:lang w:val="en-SG"/>
+        </w:rPr>
+        <w:t>CREATE TABLE DimBook (</w:t>
+      </w:r>
+    </w:p>
+    <w:p>
+      <w:pPr>
+        <w:pStyle w:val="ListParagraph"/>
+        <w:rPr>
+          <w:lang w:val="en-SG"/>
+        </w:rPr>
+      </w:pPr>
+      <w:r>
+        <w:rPr>
+          <w:lang w:val="en-SG"/>
+        </w:rPr>
+        <w:t>    BookKey INT AUTO_INCREMENT PRIMARY KEY,   -- surrogate key</w:t>
+      </w:r>
+    </w:p>
+    <w:p>
+      <w:pPr>
+        <w:pStyle w:val="ListParagraph"/>
+        <w:rPr>
+          <w:lang w:val="en-SG"/>
+        </w:rPr>
+      </w:pPr>
+      <w:r>
+        <w:rPr>
+          <w:lang w:val="en-SG"/>
+        </w:rPr>
+        <w:t>    BookID CHAR(10) NOT NULL,                 -- natural key</w:t>
+      </w:r>
+    </w:p>
+    <w:p>
+      <w:pPr>
+        <w:pStyle w:val="ListParagraph"/>
+        <w:rPr>
+          <w:lang w:val="en-SG"/>
+        </w:rPr>
+      </w:pPr>
+      <w:r>
+        <w:rPr>
+          <w:lang w:val="en-SG"/>
+        </w:rPr>
+        <w:t>    Title VARCHAR(200) NOT NULL,</w:t>
+      </w:r>
+    </w:p>
+    <w:p>
+      <w:pPr>
+        <w:pStyle w:val="ListParagraph"/>
+        <w:rPr>
+          <w:lang w:val="en-SG"/>
+        </w:rPr>
+      </w:pPr>
+      <w:r>
+        <w:rPr>
+          <w:lang w:val="en-SG"/>
+        </w:rPr>
+        <w:lastRenderedPageBreak/>
+        <w:t>    Author VARCHAR(100) NOT NULL,</w:t>
+      </w:r>
+    </w:p>
+    <w:p>
+      <w:pPr>
+        <w:pStyle w:val="ListParagraph"/>
+        <w:rPr>
+          <w:lang w:val="en-SG"/>
+        </w:rPr>
+      </w:pPr>
+      <w:r>
+        <w:rPr>
+          <w:lang w:val="en-SG"/>
+        </w:rPr>
+        <w:t>    Genre VARCHAR(50) NOT NULL,</w:t>
+      </w:r>
+    </w:p>
+    <w:p>
+      <w:pPr>
+        <w:pStyle w:val="ListParagraph"/>
+        <w:rPr>
+          <w:lang w:val="en-SG"/>
+        </w:rPr>
+      </w:pPr>
+      <w:r>
+        <w:rPr>
+          <w:lang w:val="en-SG"/>
+        </w:rPr>
+        <w:t>    MinTierName VARCHAR(20) NOT NULL,</w:t>
+      </w:r>
+    </w:p>
+    <w:p>
+      <w:pPr>
+        <w:pStyle w:val="ListParagraph"/>
+        <w:rPr>
+          <w:lang w:val="en-SG"/>
+        </w:rPr>
+      </w:pPr>
+      <w:r>
+        <w:rPr>
+          <w:lang w:val="en-SG"/>
+        </w:rPr>
+        <w:t>    MinTierLevel INT NOT NULL</w:t>
+      </w:r>
+    </w:p>
+    <w:p>
+      <w:pPr>
+        <w:pStyle w:val="ListParagraph"/>
+        <w:rPr>
+          <w:lang w:val="en-SG"/>
+        </w:rPr>
+      </w:pPr>
+      <w:r>
+        <w:rPr>
+          <w:lang w:val="en-SG"/>
+        </w:rPr>
+        <w:t>);</w:t>
+      </w:r>
+    </w:p>
+    <w:p>
+      <w:pPr>
+        <w:pStyle w:val="ListParagraph"/>
+        <w:rPr>
+          <w:lang w:val="en-SG"/>
+        </w:rPr>
+      </w:pPr>
+    </w:p>
+    <w:p>
+      <w:pPr>
+        <w:pStyle w:val="ListParagraph"/>
+        <w:rPr>
+          <w:lang w:val="en-SG"/>
+        </w:rPr>
+      </w:pPr>
+      <w:r>
+        <w:rPr>
+          <w:lang w:val="en-SG"/>
+        </w:rPr>
+        <w:t>-- Fact table: one row per completed loan transaction (borrowed and returned)</w:t>
+      </w:r>
+    </w:p>
+    <w:p>
+      <w:pPr>
+        <w:pStyle w:val="ListParagraph"/>
+        <w:rPr>
+          <w:lang w:val="en-SG"/>
+        </w:rPr>
+      </w:pPr>
+      <w:r>
+        <w:rPr>
+          <w:lang w:val="en-SG"/>
+        </w:rPr>
+        <w:t>CREATE TABLE FactLoan (</w:t>
+      </w:r>
+    </w:p>
+    <w:p>
+      <w:pPr>
+        <w:pStyle w:val="ListParagraph"/>
+        <w:rPr>
+          <w:lang w:val="en-SG"/>
+        </w:rPr>
+      </w:pPr>
+      <w:r>
+        <w:rPr>
+          <w:lang w:val="en-SG"/>
+        </w:rPr>
+        <w:t>    LoanKey INT AUTO_INCREMENT PRIMARY KEY,   -- surrogate key</w:t>
+      </w:r>
+    </w:p>
+    <w:p>
+      <w:pPr>
+        <w:pStyle w:val="ListParagraph"/>
+        <w:rPr>
+          <w:lang w:val="en-SG"/>
+        </w:rPr>
+      </w:pPr>
+      <w:r>
+        <w:rPr>
+          <w:lang w:val="en-SG"/>
+        </w:rPr>
+        <w:t>    MemberKey INT NOT NULL,</w:t>
+      </w:r>
+    </w:p>
+    <w:p>
+      <w:pPr>
+        <w:pStyle w:val="ListParagraph"/>
+        <w:rPr>
+          <w:lang w:val="en-SG"/>
+        </w:rPr>
+      </w:pPr>
+      <w:r>
+        <w:rPr>
+          <w:lang w:val="en-SG"/>
+        </w:rPr>
+        <w:t>    StaffKey INT NOT NULL,</w:t>
+      </w:r>
+    </w:p>
+    <w:p>
+      <w:pPr>
+        <w:pStyle w:val="ListParagraph"/>
+        <w:rPr>
+          <w:lang w:val="en-SG"/>
+        </w:rPr>
+      </w:pPr>
+      <w:r>
+        <w:rPr>
+          <w:lang w:val="en-SG"/>
+        </w:rPr>
+        <w:t>    BookKey INT NOT NULL,</w:t>
+      </w:r>
+    </w:p>
+    <w:p>
+      <w:pPr>
+        <w:pStyle w:val="ListParagraph"/>
+        <w:rPr>
+          <w:lang w:val="en-SG"/>
+        </w:rPr>
+      </w:pPr>
+      <w:r>
+        <w:rPr>
+          <w:lang w:val="en-SG"/>
+        </w:rPr>
+        <w:t>    BorrowDateKey INT NOT NULL,</w:t>
+      </w:r>
+    </w:p>
+    <w:p>
+      <w:pPr>
+        <w:pStyle w:val="ListParagraph"/>
+        <w:rPr>
+          <w:lang w:val="en-SG"/>
+        </w:rPr>
+      </w:pPr>
+      <w:r>
+        <w:rPr>
+          <w:lang w:val="en-SG"/>
+        </w:rPr>
+        <w:t>    ReturnDateKey INT NOT NULL,</w:t>
+      </w:r>
+    </w:p>
+    <w:p>
+      <w:pPr>
+        <w:pStyle w:val="ListParagraph"/>
+        <w:rPr>
+          <w:lang w:val="en-SG"/>
+        </w:rPr>
+      </w:pPr>
+      <w:r>
+        <w:rPr>
+          <w:lang w:val="en-SG"/>
+        </w:rPr>
+        <w:t>    CopySeqNo INT NOT NULL,                   -- degenerate dimension</w:t>
+      </w:r>
+    </w:p>
+    <w:p>
+      <w:pPr>
+        <w:pStyle w:val="ListParagraph"/>
+        <w:rPr>
+          <w:lang w:val="en-SG"/>
+        </w:rPr>
+      </w:pPr>
+      <w:r>
+        <w:rPr>
+          <w:lang w:val="en-SG"/>
+        </w:rPr>
+        <w:t>    LoanDurationDays INT NOT NULL,            -- return date - borrow date</w:t>
+      </w:r>
+    </w:p>
+    <w:p>
+      <w:pPr>
+        <w:pStyle w:val="ListParagraph"/>
+        <w:rPr>
+          <w:lang w:val="en-SG"/>
+        </w:rPr>
+      </w:pPr>
+      <w:r>
+        <w:rPr>
+          <w:lang w:val="en-SG"/>
+        </w:rPr>
+        <w:t>    DaysBeforeDue INT NOT NULL,               -- due date - return date (negative = late)</w:t>
+      </w:r>
+    </w:p>
+    <w:p>
+      <w:pPr>
+        <w:pStyle w:val="ListParagraph"/>
+        <w:rPr>
+          <w:lang w:val="en-SG"/>
+        </w:rPr>
+      </w:pPr>
+      <w:r>
+        <w:rPr>
+          <w:lang w:val="en-SG"/>
+        </w:rPr>
+        <w:t>    IsLate BOOLEAN NOT NULL,</w:t>
+      </w:r>
+    </w:p>
+    <w:p>
+      <w:pPr>
+        <w:pStyle w:val="ListParagraph"/>
+        <w:rPr>
+          <w:lang w:val="en-SG"/>
+        </w:rPr>
+      </w:pPr>
+      <w:r>
+        <w:rPr>
+          <w:lang w:val="en-SG"/>
+        </w:rPr>
+        <w:t>    FOREIGN KEY (MemberKey) REFERENCES DimMember(MemberKey),</w:t>
+      </w:r>
+    </w:p>
+    <w:p>
+      <w:pPr>
+        <w:pStyle w:val="ListParagraph"/>
+        <w:rPr>
+          <w:lang w:val="en-SG"/>
+        </w:rPr>
+      </w:pPr>
+      <w:r>
+        <w:rPr>
+          <w:lang w:val="en-SG"/>
+        </w:rPr>
+        <w:t>    FOREIGN KEY (StaffKey) REFERENCES DimStaff(StaffKey),</w:t>
+      </w:r>
+    </w:p>
+    <w:p>
+      <w:pPr>
+        <w:pStyle w:val="ListParagraph"/>
+        <w:rPr>
+          <w:lang w:val="en-SG"/>
+        </w:rPr>
+      </w:pPr>
+      <w:r>
+        <w:rPr>
+          <w:lang w:val="en-SG"/>
+        </w:rPr>
+        <w:t>    FOREIGN KEY (BookKey) REFERENCES DimBook(BookKey),</w:t>
+      </w:r>
+    </w:p>
+    <w:p>
+      <w:pPr>
+        <w:pStyle w:val="ListParagraph"/>
+        <w:rPr>
+          <w:lang w:val="en-SG"/>
+        </w:rPr>
+      </w:pPr>
+      <w:r>
+        <w:rPr>
+          <w:lang w:val="en-SG"/>
+        </w:rPr>
+        <w:t>    FOREIGN KEY (BorrowDateKey) REFERENCES DimDate(DateKey),</w:t>
+      </w:r>
+    </w:p>
+    <w:p>
+      <w:pPr>
+        <w:pStyle w:val="ListParagraph"/>
+        <w:rPr>
+          <w:lang w:val="en-SG"/>
+        </w:rPr>
+      </w:pPr>
+      <w:r>
+        <w:rPr>
+          <w:lang w:val="en-SG"/>
+        </w:rPr>
+        <w:t>    FOREIGN KEY (ReturnDateKey) REFERENCES DimDate(DateKey)</w:t>
+      </w:r>
+    </w:p>
+    <w:p>
+      <w:pPr>
+        <w:pStyle w:val="ListParagraph"/>
+        <w:rPr>
+          <w:lang w:val="en-SG"/>
+        </w:rPr>
+      </w:pPr>
+      <w:r>
+        <w:rPr>
+          <w:lang w:val="en-SG"/>
+        </w:rPr>
+        <w:t>);</w:t>
+      </w:r>
+    </w:p>
+    <w:p>
+      <w:pPr>
+        <w:rPr>
+          <w:b/>
+          <w:bCs/>
+          <w:lang w:val="en-SG"/>
+        </w:rPr>
+      </w:pPr>
+    </w:p>
+    <w:p>
+      <w:pPr>
+        <w:rPr>
+          <w:b/>
+          <w:bCs/>
+          <w:lang w:val="en-SG"/>
+        </w:rPr>
+      </w:pPr>
+      <w:r>
+        <w:rPr>
+          <w:b/>
+          <w:bCs/>
+          <w:lang w:val="en-SG"/>
+        </w:rPr>
+        <w:t>Reverse Engineered diagram:</w:t>
+      </w:r>
+    </w:p>
+    <w:p>
+      <w:pPr>
+        <w:rPr>
+          <w:b/>
+          <w:bCs/>
+          <w:lang w:val="en-SG"/>
+        </w:rPr>
+      </w:pPr>
+      <w:r>
+        <w:rPr>
+          <w:b/>
+          <w:bCs/>
+          <w:lang w:val="en-SG"/>
+        </w:rPr>
+        <w:lastRenderedPageBreak/>
+        <w:drawing>
+          <wp:inline distT="0" distB="0" distL="0" distR="0" wp14:anchorId="2AE2D5D6" wp14:editId="07B161E4">
+            <wp:extent cx="6190615" cy="4478655"/>
+            <wp:effectExtent l="0" t="0" r="635" b="0"/>
+            <wp:docPr id="358119578" name="Picture 1"/>
+            <wp:cNvGraphicFramePr>
+              <a:graphicFrameLocks xmlns:a="http://schemas.openxmlformats.org/drawingml/2006/main" noChangeAspect="1"/>
+            </wp:cNvGraphicFramePr>
+            <a:graphic xmlns:a="http://schemas.openxmlformats.org/drawingml/2006/main">
+              <a:graphicData uri="http://schemas.openxmlformats.org/drawingml/2006/picture">
+                <pic:pic xmlns:pic="http://schemas.openxmlformats.org/drawingml/2006/picture">
+                  <pic:nvPicPr>
+                    <pic:cNvPr id="358119578" name=""/>
+                    <pic:cNvPicPr/>
+                  </pic:nvPicPr>
+                  <pic:blipFill>
+                    <a:blip r:embed="rId13"/>
+                    <a:stretch>
+                      <a:fillRect/>
+                    </a:stretch>
+                  </pic:blipFill>
+                  <pic:spPr>
+                    <a:xfrm>
+                      <a:off x="0" y="0"/>
+                      <a:ext cx="6190615" cy="4478655"/>
+                    </a:xfrm>
+                    <a:prstGeom prst="rect">
+                      <a:avLst/>
+                    </a:prstGeom>
+                  </pic:spPr>
+                </pic:pic>
+              </a:graphicData>
+            </a:graphic>
+          </wp:inline>
+        </w:drawing>
+      </w:r>
+    </w:p>
+    <w:p>
+      <w:pPr>
+        <w:rPr>
+          <w:b/>
+          <w:bCs/>
+          <w:lang w:val="en-SG"/>
+        </w:rPr>
+      </w:pPr>
+    </w:p>
+    <w:p>
+      <w:pPr>
+        <w:rPr>
+          <w:b/>
+          <w:bCs/>
+        </w:rPr>
+      </w:pPr>
+      <w:r>
+        <w:rPr>
+          <w:b/>
+          <w:bCs/>
+        </w:rPr>
+        <w:t>How to verify successful insertion:</w:t>
+      </w:r>
+    </w:p>
+    <w:p>
+      <w:r>
+        <w:rPr>
+          <w:sz w:val="20"/>
+        </w:rPr>
+        <w:t>ETL verification: (1) Row-count reconciliation - completed loans in OLTP (SELECT COUNT(*) FROM Loan WHERE ReturnDatetime IS NOT NULL) = 12,343 and FactLoan = 12,343; DimMember = Member = 301; DimBook = Book = 500; DimStaff = Staff = 51. (2) Measure reconciliation - SUM(DATEDIFF(ReturnDatetime, StartDatetime)) computed directly on the OLTP Loan table = 108,801 days, identical to SUM(LoanDurationDays) in FactLoan, proving the duration measure was derived correctly for every row. (3) Referential integrity - a LEFT JOIN from FactLoan to each dimension returns 0 orphan rows, and all foreign keys are enforced by constraints so no fact row can reference a missing dimension member. The verification queries are included at the bottom of DW_insert.sql.</w:t>
+      </w:r>
+    </w:p>
+    <w:p>
       <w:r>
         <w:rPr>
           <w:noProof/>
         </w:rPr>
+        <w:lastRenderedPageBreak/>
         <mc:AlternateContent>
           <mc:Choice Requires="wps">
             <w:drawing>
@@ -3335,10 +4316,10 @@
       </w:pPr>
     </w:p>
     <w:sectPr>
-      <w:headerReference w:type="even" r:id="rId13"/>
-      <w:headerReference w:type="default" r:id="rId14"/>
-      <w:footerReference w:type="default" r:id="rId15"/>
-      <w:headerReference w:type="first" r:id="rId16"/>
+      <w:headerReference w:type="even" r:id="rId14"/>
+      <w:headerReference w:type="default" r:id="rId15"/>
+      <w:footerReference w:type="default" r:id="rId16"/>
+      <w:headerReference w:type="first" r:id="rId17"/>
       <w:pgSz w:w="11909" w:h="16834" w:code="9"/>
       <w:pgMar w:top="1440" w:right="1080" w:bottom="1440" w:left="1080" w:header="720" w:footer="720" w:gutter="0"/>
       <w:pgNumType w:start="0"/>
@@ -9089,6 +10070,7 @@
   <w:style w:type="character" w:default="1" w:styleId="DefaultParagraphFont">
     <w:name w:val="Default Paragraph Font"/>
     <w:uiPriority w:val="1"/>
+    <w:semiHidden/>
     <w:unhideWhenUsed/>
   </w:style>
   <w:style w:type="table" w:default="1" w:styleId="TableNormal">

</xml_diff>

<commit_message>
dewleted some useless files, added individual template (mongodb is untested) todo: update the dw schema image
</commit_message>
<xml_diff>
--- a/2B21-04_group_submission.docx
+++ b/2B21-04_group_submission.docx
@@ -194,7 +194,15 @@
           </w:tcPr>
           <w:p>
             <w:r>
-              <w:t xml:space="preserve">Kendrick Slamat </w:t>
+              <w:t xml:space="preserve">Kendrick </w:t>
+            </w:r>
+            <w:proofErr w:type="spellStart"/>
+            <w:r>
+              <w:t>Slamat</w:t>
+            </w:r>
+            <w:proofErr w:type="spellEnd"/>
+            <w:r>
+              <w:t xml:space="preserve"> </w:t>
             </w:r>
           </w:p>
         </w:tc>
@@ -2118,7 +2126,21 @@
               <w:rPr>
                 <w:sz w:val="18"/>
               </w:rPr>
-              <w:t>Invalid TierID 'T00001' (extra zero; no such tier exists)</w:t>
+              <w:t xml:space="preserve">Invalid </w:t>
+            </w:r>
+            <w:proofErr w:type="spellStart"/>
+            <w:r>
+              <w:rPr>
+                <w:sz w:val="18"/>
+              </w:rPr>
+              <w:t>TierID</w:t>
+            </w:r>
+            <w:proofErr w:type="spellEnd"/>
+            <w:r>
+              <w:rPr>
+                <w:sz w:val="18"/>
+              </w:rPr>
+              <w:t xml:space="preserve"> 'T00001' (extra zero; no such tier exists)</w:t>
             </w:r>
           </w:p>
         </w:tc>
@@ -2172,7 +2194,35 @@
               <w:rPr>
                 <w:sz w:val="18"/>
               </w:rPr>
-              <w:t>Gender stored as 'Male'/'Female' but schema requires CHAR(1)</w:t>
+              <w:t>Gender stored as 'Male'/'Female</w:t>
+            </w:r>
+            <w:proofErr w:type="gramStart"/>
+            <w:r>
+              <w:rPr>
+                <w:sz w:val="18"/>
+              </w:rPr>
+              <w:t>'</w:t>
+            </w:r>
+            <w:proofErr w:type="gramEnd"/>
+            <w:r>
+              <w:rPr>
+                <w:sz w:val="18"/>
+              </w:rPr>
+              <w:t xml:space="preserve"> but schema requires </w:t>
+            </w:r>
+            <w:proofErr w:type="gramStart"/>
+            <w:r>
+              <w:rPr>
+                <w:sz w:val="18"/>
+              </w:rPr>
+              <w:t>CHAR(</w:t>
+            </w:r>
+            <w:proofErr w:type="gramEnd"/>
+            <w:r>
+              <w:rPr>
+                <w:sz w:val="18"/>
+              </w:rPr>
+              <w:t>1)</w:t>
             </w:r>
           </w:p>
         </w:tc>
@@ -2185,7 +2235,21 @@
               <w:rPr>
                 <w:sz w:val="18"/>
               </w:rPr>
-              <w:t>Mapped to 'M'/'F'</w:t>
+              <w:t>Mapped to 'M</w:t>
+            </w:r>
+            <w:proofErr w:type="gramStart"/>
+            <w:r>
+              <w:rPr>
+                <w:sz w:val="18"/>
+              </w:rPr>
+              <w:t>'/'</w:t>
+            </w:r>
+            <w:proofErr w:type="gramEnd"/>
+            <w:r>
+              <w:rPr>
+                <w:sz w:val="18"/>
+              </w:rPr>
+              <w:t>F'</w:t>
             </w:r>
           </w:p>
         </w:tc>
@@ -2222,11 +2286,19 @@
             <w:tcW w:w="2700" w:type="dxa"/>
           </w:tcPr>
           <w:p>
+            <w:proofErr w:type="spellStart"/>
             <w:r>
               <w:rPr>
                 <w:sz w:val="18"/>
               </w:rPr>
-              <w:t>DateOfBirth stored as datetime '1990-05-08 00:00:00' instead of a date</w:t>
+              <w:t>DateOfBirth</w:t>
+            </w:r>
+            <w:proofErr w:type="spellEnd"/>
+            <w:r>
+              <w:rPr>
+                <w:sz w:val="18"/>
+              </w:rPr>
+              <w:t xml:space="preserve"> stored as datetime '1990-05-08 00:00:00' instead of a date</w:t>
             </w:r>
           </w:p>
         </w:tc>
@@ -2280,7 +2352,21 @@
               <w:rPr>
                 <w:sz w:val="18"/>
               </w:rPr>
-              <w:t>Two contact fields (ContactNo, Email) but Member table has a single Contact column</w:t>
+              <w:t>Two contact fields (</w:t>
+            </w:r>
+            <w:proofErr w:type="spellStart"/>
+            <w:r>
+              <w:rPr>
+                <w:sz w:val="18"/>
+              </w:rPr>
+              <w:t>ContactNo</w:t>
+            </w:r>
+            <w:proofErr w:type="spellEnd"/>
+            <w:r>
+              <w:rPr>
+                <w:sz w:val="18"/>
+              </w:rPr>
+              <w:t>, Email) but Member table has a single Contact column</w:t>
             </w:r>
           </w:p>
         </w:tc>
@@ -2347,7 +2433,31 @@
               <w:rPr>
                 <w:sz w:val="18"/>
               </w:rPr>
-              <w:t>Kept as NULL (column is nullable; value genuinely unknown)</w:t>
+              <w:t xml:space="preserve">Kept as NULL (column is nullable; </w:t>
+            </w:r>
+            <w:r>
+              <w:rPr>
+                <w:sz w:val="18"/>
+              </w:rPr>
+              <w:t xml:space="preserve">true </w:t>
+            </w:r>
+            <w:r>
+              <w:rPr>
+                <w:sz w:val="18"/>
+              </w:rPr>
+              <w:t>value</w:t>
+            </w:r>
+            <w:r>
+              <w:rPr>
+                <w:sz w:val="18"/>
+              </w:rPr>
+              <w:t xml:space="preserve"> is</w:t>
+            </w:r>
+            <w:r>
+              <w:rPr>
+                <w:sz w:val="18"/>
+              </w:rPr>
+              <w:t xml:space="preserve"> unknown)</w:t>
             </w:r>
           </w:p>
         </w:tc>
@@ -2388,7 +2498,35 @@
               <w:rPr>
                 <w:sz w:val="18"/>
               </w:rPr>
-              <w:t>Gender stored as 'Male'/'Female' but schema requires CHAR(1)</w:t>
+              <w:t>Gender stored as 'Male'/'Female</w:t>
+            </w:r>
+            <w:proofErr w:type="gramStart"/>
+            <w:r>
+              <w:rPr>
+                <w:sz w:val="18"/>
+              </w:rPr>
+              <w:t>'</w:t>
+            </w:r>
+            <w:proofErr w:type="gramEnd"/>
+            <w:r>
+              <w:rPr>
+                <w:sz w:val="18"/>
+              </w:rPr>
+              <w:t xml:space="preserve"> but schema requires </w:t>
+            </w:r>
+            <w:proofErr w:type="gramStart"/>
+            <w:r>
+              <w:rPr>
+                <w:sz w:val="18"/>
+              </w:rPr>
+              <w:t>CHAR(</w:t>
+            </w:r>
+            <w:proofErr w:type="gramEnd"/>
+            <w:r>
+              <w:rPr>
+                <w:sz w:val="18"/>
+              </w:rPr>
+              <w:t>1)</w:t>
             </w:r>
           </w:p>
         </w:tc>
@@ -2401,7 +2539,21 @@
               <w:rPr>
                 <w:sz w:val="18"/>
               </w:rPr>
-              <w:t>Mapped to 'M'/'F'</w:t>
+              <w:t>Mapped to 'M</w:t>
+            </w:r>
+            <w:proofErr w:type="gramStart"/>
+            <w:r>
+              <w:rPr>
+                <w:sz w:val="18"/>
+              </w:rPr>
+              <w:t>'/'</w:t>
+            </w:r>
+            <w:proofErr w:type="gramEnd"/>
+            <w:r>
+              <w:rPr>
+                <w:sz w:val="18"/>
+              </w:rPr>
+              <w:t>F'</w:t>
             </w:r>
           </w:p>
         </w:tc>
@@ -2524,8 +2676,16 @@
               <w:rPr>
                 <w:sz w:val="18"/>
               </w:rPr>
-              <w:t>data.xlsx / BookCopies</w:t>
+              <w:t xml:space="preserve">data.xlsx / </w:t>
             </w:r>
+            <w:proofErr w:type="spellStart"/>
+            <w:r>
+              <w:rPr>
+                <w:sz w:val="18"/>
+              </w:rPr>
+              <w:t>BookCopies</w:t>
+            </w:r>
+            <w:proofErr w:type="spellEnd"/>
           </w:p>
         </w:tc>
         <w:tc>
@@ -2550,7 +2710,21 @@
               <w:rPr>
                 <w:sz w:val="18"/>
               </w:rPr>
-              <w:t>Status misspelled as 'Availble'</w:t>
+              <w:t>Status misspelled as '</w:t>
+            </w:r>
+            <w:proofErr w:type="spellStart"/>
+            <w:r>
+              <w:rPr>
+                <w:sz w:val="18"/>
+              </w:rPr>
+              <w:t>Availble</w:t>
+            </w:r>
+            <w:proofErr w:type="spellEnd"/>
+            <w:r>
+              <w:rPr>
+                <w:sz w:val="18"/>
+              </w:rPr>
+              <w:t>'</w:t>
             </w:r>
           </w:p>
         </w:tc>
@@ -2578,8 +2752,16 @@
               <w:rPr>
                 <w:sz w:val="18"/>
               </w:rPr>
-              <w:t>data.xlsx / BookCopies</w:t>
+              <w:t xml:space="preserve">data.xlsx / </w:t>
             </w:r>
+            <w:proofErr w:type="spellStart"/>
+            <w:r>
+              <w:rPr>
+                <w:sz w:val="18"/>
+              </w:rPr>
+              <w:t>BookCopies</w:t>
+            </w:r>
+            <w:proofErr w:type="spellEnd"/>
           </w:p>
         </w:tc>
         <w:tc>
@@ -2658,7 +2840,63 @@
               <w:rPr>
                 <w:sz w:val="18"/>
               </w:rPr>
-              <w:t>Row references StaffID 'S0101' (staff run S0001-S0051) and CopySeqNo 8 (book has 3 copies); DueDate 2023-04-02 precedes LoanDatetime 2024-07-04</w:t>
+              <w:t xml:space="preserve">Row references </w:t>
+            </w:r>
+            <w:proofErr w:type="spellStart"/>
+            <w:r>
+              <w:rPr>
+                <w:sz w:val="18"/>
+              </w:rPr>
+              <w:t>StaffID</w:t>
+            </w:r>
+            <w:proofErr w:type="spellEnd"/>
+            <w:r>
+              <w:rPr>
+                <w:sz w:val="18"/>
+              </w:rPr>
+              <w:t xml:space="preserve"> 'S0101' (staff run S0001-S0051) and </w:t>
+            </w:r>
+            <w:proofErr w:type="spellStart"/>
+            <w:r>
+              <w:rPr>
+                <w:sz w:val="18"/>
+              </w:rPr>
+              <w:t>CopySeqNo</w:t>
+            </w:r>
+            <w:proofErr w:type="spellEnd"/>
+            <w:r>
+              <w:rPr>
+                <w:sz w:val="18"/>
+              </w:rPr>
+              <w:t xml:space="preserve"> 8 (book has 3 copies); </w:t>
+            </w:r>
+            <w:proofErr w:type="spellStart"/>
+            <w:r>
+              <w:rPr>
+                <w:sz w:val="18"/>
+              </w:rPr>
+              <w:t>DueDate</w:t>
+            </w:r>
+            <w:proofErr w:type="spellEnd"/>
+            <w:r>
+              <w:rPr>
+                <w:sz w:val="18"/>
+              </w:rPr>
+              <w:t xml:space="preserve"> 2023-04-02 precedes </w:t>
+            </w:r>
+            <w:proofErr w:type="spellStart"/>
+            <w:r>
+              <w:rPr>
+                <w:sz w:val="18"/>
+              </w:rPr>
+              <w:t>LoanDatetime</w:t>
+            </w:r>
+            <w:proofErr w:type="spellEnd"/>
+            <w:r>
+              <w:rPr>
+                <w:sz w:val="18"/>
+              </w:rPr>
+              <w:t xml:space="preserve"> 2024-07-04</w:t>
             </w:r>
           </w:p>
         </w:tc>
@@ -2712,7 +2950,21 @@
               <w:rPr>
                 <w:sz w:val="18"/>
               </w:rPr>
-              <w:t>Missing LoanStatus (6 returned, 1 outstanding)</w:t>
+              <w:t xml:space="preserve">Missing </w:t>
+            </w:r>
+            <w:proofErr w:type="spellStart"/>
+            <w:r>
+              <w:rPr>
+                <w:sz w:val="18"/>
+              </w:rPr>
+              <w:t>LoanStatus</w:t>
+            </w:r>
+            <w:proofErr w:type="spellEnd"/>
+            <w:r>
+              <w:rPr>
+                <w:sz w:val="18"/>
+              </w:rPr>
+              <w:t xml:space="preserve"> (6 returned, 1 outstanding)</w:t>
             </w:r>
           </w:p>
         </w:tc>
@@ -2725,8 +2977,30 @@
               <w:rPr>
                 <w:sz w:val="18"/>
               </w:rPr>
-              <w:t>No correction needed for insertion: LoanStatus is not a column in the Loan table; status is derivable from ReturnDatetime</w:t>
+              <w:t xml:space="preserve">No correction needed for insertion: </w:t>
             </w:r>
+            <w:proofErr w:type="spellStart"/>
+            <w:r>
+              <w:rPr>
+                <w:sz w:val="18"/>
+              </w:rPr>
+              <w:t>LoanStatus</w:t>
+            </w:r>
+            <w:proofErr w:type="spellEnd"/>
+            <w:r>
+              <w:rPr>
+                <w:sz w:val="18"/>
+              </w:rPr>
+              <w:t xml:space="preserve"> is not a column in the Loan table; status is derivable from </w:t>
+            </w:r>
+            <w:proofErr w:type="spellStart"/>
+            <w:r>
+              <w:rPr>
+                <w:sz w:val="18"/>
+              </w:rPr>
+              <w:t>ReturnDatetime</w:t>
+            </w:r>
+            <w:proofErr w:type="spellEnd"/>
           </w:p>
         </w:tc>
       </w:tr>
@@ -2741,7 +3015,15 @@
         <w:pStyle w:val="ListParagraph"/>
       </w:pPr>
       <w:r>
-        <w:t>Submit your SQL INSERT statements for data insertion to the OLTP tables in OLTP_insert.sql. If you apply bulk loading, submit each of the cleaned data files used during insertion as well.</w:t>
+        <w:t xml:space="preserve">Submit your SQL INSERT statements for data insertion to the OLTP tables in </w:t>
+      </w:r>
+      <w:proofErr w:type="spellStart"/>
+      <w:r>
+        <w:t>OLTP_insert.sql</w:t>
+      </w:r>
+      <w:proofErr w:type="spellEnd"/>
+      <w:r>
+        <w:t>. If you apply bulk loading, submit each of the cleaned data files used during insertion as well.</w:t>
       </w:r>
     </w:p>
     <w:p>
@@ -2892,7 +3174,91 @@
         <w:rPr>
           <w:lang w:val="en-SG"/>
         </w:rPr>
-        <w:t>We used a Star Schema with one fact table, called FactLoan. The grain of this table is one completed loan transaction, meaning one book that has been borrowed and returned. FactLoan is connected to four-dimension tables: DimMember, DimStaff, DimBook and DimDate.</w:t>
+        <w:t xml:space="preserve">We used a Star Schema with one fact table, called </w:t>
+      </w:r>
+      <w:proofErr w:type="spellStart"/>
+      <w:r>
+        <w:rPr>
+          <w:lang w:val="en-SG"/>
+        </w:rPr>
+        <w:t>FactLoan</w:t>
+      </w:r>
+      <w:proofErr w:type="spellEnd"/>
+      <w:r>
+        <w:rPr>
+          <w:lang w:val="en-SG"/>
+        </w:rPr>
+        <w:t xml:space="preserve">. The grain of this table is one completed loan transaction, meaning one book that has been borrowed and returned. </w:t>
+      </w:r>
+      <w:proofErr w:type="spellStart"/>
+      <w:r>
+        <w:rPr>
+          <w:lang w:val="en-SG"/>
+        </w:rPr>
+        <w:t>FactLoan</w:t>
+      </w:r>
+      <w:proofErr w:type="spellEnd"/>
+      <w:r>
+        <w:rPr>
+          <w:lang w:val="en-SG"/>
+        </w:rPr>
+        <w:t xml:space="preserve"> is connected to four-dimension tables: </w:t>
+      </w:r>
+      <w:proofErr w:type="spellStart"/>
+      <w:r>
+        <w:rPr>
+          <w:lang w:val="en-SG"/>
+        </w:rPr>
+        <w:t>DimMember</w:t>
+      </w:r>
+      <w:proofErr w:type="spellEnd"/>
+      <w:r>
+        <w:rPr>
+          <w:lang w:val="en-SG"/>
+        </w:rPr>
+        <w:t xml:space="preserve">, </w:t>
+      </w:r>
+      <w:proofErr w:type="spellStart"/>
+      <w:r>
+        <w:rPr>
+          <w:lang w:val="en-SG"/>
+        </w:rPr>
+        <w:t>DimStaff</w:t>
+      </w:r>
+      <w:proofErr w:type="spellEnd"/>
+      <w:r>
+        <w:rPr>
+          <w:lang w:val="en-SG"/>
+        </w:rPr>
+        <w:t xml:space="preserve">, </w:t>
+      </w:r>
+      <w:proofErr w:type="spellStart"/>
+      <w:r>
+        <w:rPr>
+          <w:lang w:val="en-SG"/>
+        </w:rPr>
+        <w:t>DimBook</w:t>
+      </w:r>
+      <w:proofErr w:type="spellEnd"/>
+      <w:r>
+        <w:rPr>
+          <w:lang w:val="en-SG"/>
+        </w:rPr>
+        <w:t xml:space="preserve"> and </w:t>
+      </w:r>
+      <w:proofErr w:type="spellStart"/>
+      <w:r>
+        <w:rPr>
+          <w:lang w:val="en-SG"/>
+        </w:rPr>
+        <w:t>DimDate</w:t>
+      </w:r>
+      <w:proofErr w:type="spellEnd"/>
+      <w:r>
+        <w:rPr>
+          <w:lang w:val="en-SG"/>
+        </w:rPr>
+        <w:t>.</w:t>
       </w:r>
     </w:p>
     <w:p>
@@ -2912,7 +3278,77 @@
         <w:rPr>
           <w:lang w:val="en-SG"/>
         </w:rPr>
-        <w:t>All tables use an AUTO_INCREMENT surrogate key, including the fact table and date dimension. The membership tier details, such as TierName, TierLevel and BorrowLimit, are included directly in DimMember. The minimum membership tier required to borrow a book is also included in DimBook. This avoids the need for a snowflake schema and keeps the database structure simpler by reducing the number of joins needed.</w:t>
+        <w:t xml:space="preserve">All tables use an AUTO_INCREMENT surrogate key, including the fact table and date dimension. The membership tier details, such as </w:t>
+      </w:r>
+      <w:proofErr w:type="spellStart"/>
+      <w:r>
+        <w:rPr>
+          <w:lang w:val="en-SG"/>
+        </w:rPr>
+        <w:t>TierName</w:t>
+      </w:r>
+      <w:proofErr w:type="spellEnd"/>
+      <w:r>
+        <w:rPr>
+          <w:lang w:val="en-SG"/>
+        </w:rPr>
+        <w:t xml:space="preserve">, </w:t>
+      </w:r>
+      <w:proofErr w:type="spellStart"/>
+      <w:r>
+        <w:rPr>
+          <w:lang w:val="en-SG"/>
+        </w:rPr>
+        <w:t>TierLevel</w:t>
+      </w:r>
+      <w:proofErr w:type="spellEnd"/>
+      <w:r>
+        <w:rPr>
+          <w:lang w:val="en-SG"/>
+        </w:rPr>
+        <w:t xml:space="preserve"> and </w:t>
+      </w:r>
+      <w:proofErr w:type="spellStart"/>
+      <w:r>
+        <w:rPr>
+          <w:lang w:val="en-SG"/>
+        </w:rPr>
+        <w:t>BorrowLimit</w:t>
+      </w:r>
+      <w:proofErr w:type="spellEnd"/>
+      <w:r>
+        <w:rPr>
+          <w:lang w:val="en-SG"/>
+        </w:rPr>
+        <w:t xml:space="preserve">, are included directly in </w:t>
+      </w:r>
+      <w:proofErr w:type="spellStart"/>
+      <w:r>
+        <w:rPr>
+          <w:lang w:val="en-SG"/>
+        </w:rPr>
+        <w:t>DimMember</w:t>
+      </w:r>
+      <w:proofErr w:type="spellEnd"/>
+      <w:r>
+        <w:rPr>
+          <w:lang w:val="en-SG"/>
+        </w:rPr>
+        <w:t xml:space="preserve">. The minimum membership tier required to borrow a book is also included in </w:t>
+      </w:r>
+      <w:proofErr w:type="spellStart"/>
+      <w:r>
+        <w:rPr>
+          <w:lang w:val="en-SG"/>
+        </w:rPr>
+        <w:t>DimBook</w:t>
+      </w:r>
+      <w:proofErr w:type="spellEnd"/>
+      <w:r>
+        <w:rPr>
+          <w:lang w:val="en-SG"/>
+        </w:rPr>
+        <w:t>. This avoids the need for a snowflake schema and keeps the database structure simpler by reducing the number of joins needed.</w:t>
       </w:r>
     </w:p>
     <w:p>
@@ -2928,11 +3364,47 @@
           <w:lang w:val="en-SG"/>
         </w:rPr>
       </w:pPr>
-      <w:r>
-        <w:rPr>
-          <w:lang w:val="en-SG"/>
-        </w:rPr>
-        <w:t>DimDate is stored at day-level granularity, as required in the assignment. It contains attributes such as the full date, day of the week, weekend indicator, month, quarter and year. FactLoan uses DimDate twice: once for the borrow date and once for the return date.</w:t>
+      <w:proofErr w:type="spellStart"/>
+      <w:r>
+        <w:rPr>
+          <w:lang w:val="en-SG"/>
+        </w:rPr>
+        <w:t>DimDate</w:t>
+      </w:r>
+      <w:proofErr w:type="spellEnd"/>
+      <w:r>
+        <w:rPr>
+          <w:lang w:val="en-SG"/>
+        </w:rPr>
+        <w:t xml:space="preserve"> is stored at day-level granularity, as required in the assignment. It contains attributes such as the full date, day of the week, weekend indicator, month, quarter and year. </w:t>
+      </w:r>
+      <w:proofErr w:type="spellStart"/>
+      <w:r>
+        <w:rPr>
+          <w:lang w:val="en-SG"/>
+        </w:rPr>
+        <w:t>FactLoan</w:t>
+      </w:r>
+      <w:proofErr w:type="spellEnd"/>
+      <w:r>
+        <w:rPr>
+          <w:lang w:val="en-SG"/>
+        </w:rPr>
+        <w:t xml:space="preserve"> uses </w:t>
+      </w:r>
+      <w:proofErr w:type="spellStart"/>
+      <w:r>
+        <w:rPr>
+          <w:lang w:val="en-SG"/>
+        </w:rPr>
+        <w:t>DimDate</w:t>
+      </w:r>
+      <w:proofErr w:type="spellEnd"/>
+      <w:r>
+        <w:rPr>
+          <w:lang w:val="en-SG"/>
+        </w:rPr>
+        <w:t xml:space="preserve"> twice: once for the borrow date and once for the return date.</w:t>
       </w:r>
     </w:p>
     <w:p>
@@ -2941,11 +3413,19 @@
           <w:lang w:val="en-SG"/>
         </w:rPr>
       </w:pPr>
-      <w:r>
-        <w:rPr>
-          <w:lang w:val="en-SG"/>
-        </w:rPr>
-        <w:t>CopySeqNo is stored in the fact table as a degenerate dimension. This allows each loan transaction to be traced back to the specific physical copy of the book without creating another dimension table.</w:t>
+      <w:proofErr w:type="spellStart"/>
+      <w:r>
+        <w:rPr>
+          <w:lang w:val="en-SG"/>
+        </w:rPr>
+        <w:t>CopySeqNo</w:t>
+      </w:r>
+      <w:proofErr w:type="spellEnd"/>
+      <w:r>
+        <w:rPr>
+          <w:lang w:val="en-SG"/>
+        </w:rPr>
+        <w:t xml:space="preserve"> is stored in the fact table as a degenerate dimension. This allows each loan transaction to be traced back to the specific physical copy of the book without creating another dimension table.</w:t>
       </w:r>
     </w:p>
     <w:p>
@@ -2965,14 +3445,56 @@
         <w:rPr>
           <w:lang w:val="en-SG"/>
         </w:rPr>
-        <w:t xml:space="preserve">Several values are calculated before being loaded into the fact table. LoanDurationDays shows the number of days between the borrow and return dates. DaysBeforeDue is calculated by subtracting </w:t>
+        <w:t xml:space="preserve">Several values are calculated before being loaded into the fact table. </w:t>
+      </w:r>
+      <w:proofErr w:type="spellStart"/>
+      <w:r>
+        <w:rPr>
+          <w:lang w:val="en-SG"/>
+        </w:rPr>
+        <w:t>LoanDurationDays</w:t>
+      </w:r>
+      <w:proofErr w:type="spellEnd"/>
+      <w:r>
+        <w:rPr>
+          <w:lang w:val="en-SG"/>
+        </w:rPr>
+        <w:t xml:space="preserve"> shows the number of days between the borrow and return dates. </w:t>
+      </w:r>
+      <w:proofErr w:type="spellStart"/>
+      <w:r>
+        <w:rPr>
+          <w:lang w:val="en-SG"/>
+        </w:rPr>
+        <w:t>DaysBeforeDue</w:t>
+      </w:r>
+      <w:proofErr w:type="spellEnd"/>
+      <w:r>
+        <w:rPr>
+          <w:lang w:val="en-SG"/>
+        </w:rPr>
+        <w:t xml:space="preserve"> is calculated by subtracting </w:t>
       </w:r>
       <w:r>
         <w:rPr>
           <w:lang w:val="en-SG"/>
         </w:rPr>
         <w:lastRenderedPageBreak/>
-        <w:t>the return date from the due date, where a negative value means that the book was returned late. An IsLate flag is also included to clearly show whether a loan was overdue. These pre-calculated values make common analysis easier because date calculations do not need to be repeated in every query.</w:t>
+        <w:t xml:space="preserve">the return date from the due date, where a negative value means that the book was returned late. An </w:t>
+      </w:r>
+      <w:proofErr w:type="spellStart"/>
+      <w:r>
+        <w:rPr>
+          <w:lang w:val="en-SG"/>
+        </w:rPr>
+        <w:t>IsLate</w:t>
+      </w:r>
+      <w:proofErr w:type="spellEnd"/>
+      <w:r>
+        <w:rPr>
+          <w:lang w:val="en-SG"/>
+        </w:rPr>
+        <w:t xml:space="preserve"> flag is also included to clearly show whether a loan was overdue. These pre-calculated values make common analysis easier because date calculations do not need to be repeated in every query.</w:t>
       </w:r>
       <w:r>
         <w:rPr>
@@ -2991,7 +3513,35 @@
         <w:rPr>
           <w:lang w:val="en-SG"/>
         </w:rPr>
-        <w:t>We assumed that only completed loans would be loaded into FactLoan. Therefore, the single loan that is still open is excluded. Slowly changing dimensions are also outside the scope of this assignment. However, if changes to a member’s membership tier needed to be tracked in the future, DimMember could be changed into a Slowly Changing Dimension Type 2 by adding effective-date and expiry-date columns.</w:t>
+        <w:t xml:space="preserve">We assumed that only completed loans would be loaded into </w:t>
+      </w:r>
+      <w:proofErr w:type="spellStart"/>
+      <w:r>
+        <w:rPr>
+          <w:lang w:val="en-SG"/>
+        </w:rPr>
+        <w:t>FactLoan</w:t>
+      </w:r>
+      <w:proofErr w:type="spellEnd"/>
+      <w:r>
+        <w:rPr>
+          <w:lang w:val="en-SG"/>
+        </w:rPr>
+        <w:t xml:space="preserve">. Therefore, the single loan that is still open is excluded. Slowly changing dimensions are also outside the scope of this assignment. However, if changes to a member’s membership tier needed to be tracked in the future, </w:t>
+      </w:r>
+      <w:proofErr w:type="spellStart"/>
+      <w:r>
+        <w:rPr>
+          <w:lang w:val="en-SG"/>
+        </w:rPr>
+        <w:t>DimMember</w:t>
+      </w:r>
+      <w:proofErr w:type="spellEnd"/>
+      <w:r>
+        <w:rPr>
+          <w:lang w:val="en-SG"/>
+        </w:rPr>
+        <w:t xml:space="preserve"> could be changed into a Slowly Changing Dimension Type 2 by adding effective-date and expiry-date columns.</w:t>
       </w:r>
     </w:p>
     <w:p>
@@ -3009,13 +3559,45 @@
       </w:pPr>
       <w:r>
         <w:lastRenderedPageBreak/>
-        <w:t xml:space="preserve">Submit your CREATE table statements for DW table creations in DW_create.sql. Use appropriate SQL statements to extract and load data from OLTP tables to the </w:t>
-      </w:r>
-      <w:r>
-        <w:t>DW and</w:t>
-      </w:r>
-      <w:r>
-        <w:t xml:space="preserve"> submit all your queries in DW_insert.sql.</w:t>
+        <w:t xml:space="preserve">Submit your </w:t>
+      </w:r>
+      <w:proofErr w:type="gramStart"/>
+      <w:r>
+        <w:t>CREATE table</w:t>
+      </w:r>
+      <w:proofErr w:type="gramEnd"/>
+      <w:r>
+        <w:t xml:space="preserve"> statements for DW table creations in </w:t>
+      </w:r>
+      <w:proofErr w:type="spellStart"/>
+      <w:r>
+        <w:t>DW_create.sql</w:t>
+      </w:r>
+      <w:proofErr w:type="spellEnd"/>
+      <w:r>
+        <w:t xml:space="preserve">. Use appropriate SQL statements to extract and load data from OLTP tables to </w:t>
+      </w:r>
+      <w:proofErr w:type="gramStart"/>
+      <w:r>
+        <w:t xml:space="preserve">the </w:t>
+      </w:r>
+      <w:r>
+        <w:t>DW</w:t>
+      </w:r>
+      <w:proofErr w:type="gramEnd"/>
+      <w:r>
+        <w:t xml:space="preserve"> and</w:t>
+      </w:r>
+      <w:r>
+        <w:t xml:space="preserve"> submit all your queries in </w:t>
+      </w:r>
+      <w:proofErr w:type="spellStart"/>
+      <w:r>
+        <w:t>DW_insert.sql</w:t>
+      </w:r>
+      <w:proofErr w:type="spellEnd"/>
+      <w:r>
+        <w:t>.</w:t>
       </w:r>
     </w:p>
     <w:bookmarkEnd w:id="1"/>
@@ -3102,7 +3684,21 @@
         <w:rPr>
           <w:lang w:val="en-SG"/>
         </w:rPr>
-        <w:t>CREATE TABLE DimDate (</w:t>
+        <w:t xml:space="preserve">CREATE TABLE </w:t>
+      </w:r>
+      <w:proofErr w:type="spellStart"/>
+      <w:r>
+        <w:rPr>
+          <w:lang w:val="en-SG"/>
+        </w:rPr>
+        <w:t>DimDate</w:t>
+      </w:r>
+      <w:proofErr w:type="spellEnd"/>
+      <w:r>
+        <w:rPr>
+          <w:lang w:val="en-SG"/>
+        </w:rPr>
+        <w:t xml:space="preserve"> (</w:t>
       </w:r>
     </w:p>
     <w:p>
@@ -3116,7 +3712,35 @@
         <w:rPr>
           <w:lang w:val="en-SG"/>
         </w:rPr>
-        <w:t>    DateKey INT AUTO_INCREMENT PRIMARY KEY,   -- surrogate key</w:t>
+        <w:t xml:space="preserve">    </w:t>
+      </w:r>
+      <w:proofErr w:type="spellStart"/>
+      <w:r>
+        <w:rPr>
+          <w:lang w:val="en-SG"/>
+        </w:rPr>
+        <w:t>DateKey</w:t>
+      </w:r>
+      <w:proofErr w:type="spellEnd"/>
+      <w:r>
+        <w:rPr>
+          <w:lang w:val="en-SG"/>
+        </w:rPr>
+        <w:t xml:space="preserve"> INT AUTO_INCREMENT PRIMARY </w:t>
+      </w:r>
+      <w:proofErr w:type="gramStart"/>
+      <w:r>
+        <w:rPr>
+          <w:lang w:val="en-SG"/>
+        </w:rPr>
+        <w:t xml:space="preserve">KEY,   </w:t>
+      </w:r>
+      <w:proofErr w:type="gramEnd"/>
+      <w:r>
+        <w:rPr>
+          <w:lang w:val="en-SG"/>
+        </w:rPr>
+        <w:t>-- surrogate key</w:t>
       </w:r>
     </w:p>
     <w:p>
@@ -3130,7 +3754,21 @@
         <w:rPr>
           <w:lang w:val="en-SG"/>
         </w:rPr>
-        <w:t>    FullDate DATE NOT NULL UNIQUE,</w:t>
+        <w:t xml:space="preserve">    </w:t>
+      </w:r>
+      <w:proofErr w:type="spellStart"/>
+      <w:r>
+        <w:rPr>
+          <w:lang w:val="en-SG"/>
+        </w:rPr>
+        <w:t>FullDate</w:t>
+      </w:r>
+      <w:proofErr w:type="spellEnd"/>
+      <w:r>
+        <w:rPr>
+          <w:lang w:val="en-SG"/>
+        </w:rPr>
+        <w:t xml:space="preserve"> DATE NOT NULL UNIQUE,</w:t>
       </w:r>
     </w:p>
     <w:p>
@@ -3158,7 +3796,35 @@
         <w:rPr>
           <w:lang w:val="en-SG"/>
         </w:rPr>
-        <w:t>    DayOfWeek VARCHAR(10) NOT NULL,</w:t>
+        <w:t xml:space="preserve">    </w:t>
+      </w:r>
+      <w:proofErr w:type="spellStart"/>
+      <w:r>
+        <w:rPr>
+          <w:lang w:val="en-SG"/>
+        </w:rPr>
+        <w:t>DayOfWeek</w:t>
+      </w:r>
+      <w:proofErr w:type="spellEnd"/>
+      <w:r>
+        <w:rPr>
+          <w:lang w:val="en-SG"/>
+        </w:rPr>
+        <w:t xml:space="preserve"> </w:t>
+      </w:r>
+      <w:proofErr w:type="gramStart"/>
+      <w:r>
+        <w:rPr>
+          <w:lang w:val="en-SG"/>
+        </w:rPr>
+        <w:t>VARCHAR(</w:t>
+      </w:r>
+      <w:proofErr w:type="gramEnd"/>
+      <w:r>
+        <w:rPr>
+          <w:lang w:val="en-SG"/>
+        </w:rPr>
+        <w:t>10) NOT NULL,</w:t>
       </w:r>
     </w:p>
     <w:p>
@@ -3172,7 +3838,21 @@
         <w:rPr>
           <w:lang w:val="en-SG"/>
         </w:rPr>
-        <w:t>    IsWeekend BOOLEAN NOT NULL,</w:t>
+        <w:t xml:space="preserve">    </w:t>
+      </w:r>
+      <w:proofErr w:type="spellStart"/>
+      <w:r>
+        <w:rPr>
+          <w:lang w:val="en-SG"/>
+        </w:rPr>
+        <w:t>IsWeekend</w:t>
+      </w:r>
+      <w:proofErr w:type="spellEnd"/>
+      <w:r>
+        <w:rPr>
+          <w:lang w:val="en-SG"/>
+        </w:rPr>
+        <w:t xml:space="preserve"> BOOLEAN NOT NULL,</w:t>
       </w:r>
     </w:p>
     <w:p>
@@ -3200,7 +3880,35 @@
         <w:rPr>
           <w:lang w:val="en-SG"/>
         </w:rPr>
-        <w:t>    MonthName VARCHAR(10) NOT NULL,</w:t>
+        <w:t xml:space="preserve">    </w:t>
+      </w:r>
+      <w:proofErr w:type="spellStart"/>
+      <w:r>
+        <w:rPr>
+          <w:lang w:val="en-SG"/>
+        </w:rPr>
+        <w:t>MonthName</w:t>
+      </w:r>
+      <w:proofErr w:type="spellEnd"/>
+      <w:r>
+        <w:rPr>
+          <w:lang w:val="en-SG"/>
+        </w:rPr>
+        <w:t xml:space="preserve"> </w:t>
+      </w:r>
+      <w:proofErr w:type="gramStart"/>
+      <w:r>
+        <w:rPr>
+          <w:lang w:val="en-SG"/>
+        </w:rPr>
+        <w:t>VARCHAR(</w:t>
+      </w:r>
+      <w:proofErr w:type="gramEnd"/>
+      <w:r>
+        <w:rPr>
+          <w:lang w:val="en-SG"/>
+        </w:rPr>
+        <w:t>10) NOT NULL,</w:t>
       </w:r>
     </w:p>
     <w:p>
@@ -3264,7 +3972,21 @@
         <w:rPr>
           <w:lang w:val="en-SG"/>
         </w:rPr>
-        <w:t>CREATE TABLE DimMember (</w:t>
+        <w:t xml:space="preserve">CREATE TABLE </w:t>
+      </w:r>
+      <w:proofErr w:type="spellStart"/>
+      <w:r>
+        <w:rPr>
+          <w:lang w:val="en-SG"/>
+        </w:rPr>
+        <w:t>DimMember</w:t>
+      </w:r>
+      <w:proofErr w:type="spellEnd"/>
+      <w:r>
+        <w:rPr>
+          <w:lang w:val="en-SG"/>
+        </w:rPr>
+        <w:t xml:space="preserve"> (</w:t>
       </w:r>
     </w:p>
     <w:p>
@@ -3278,7 +4000,21 @@
         <w:rPr>
           <w:lang w:val="en-SG"/>
         </w:rPr>
-        <w:t>    MemberKey INT AUTO_INCREMENT PRIMARY KEY, -- surrogate key</w:t>
+        <w:t xml:space="preserve">    </w:t>
+      </w:r>
+      <w:proofErr w:type="spellStart"/>
+      <w:r>
+        <w:rPr>
+          <w:lang w:val="en-SG"/>
+        </w:rPr>
+        <w:t>MemberKey</w:t>
+      </w:r>
+      <w:proofErr w:type="spellEnd"/>
+      <w:r>
+        <w:rPr>
+          <w:lang w:val="en-SG"/>
+        </w:rPr>
+        <w:t xml:space="preserve"> INT AUTO_INCREMENT PRIMARY KEY, -- surrogate key</w:t>
       </w:r>
     </w:p>
     <w:p>
@@ -3292,7 +4028,49 @@
         <w:rPr>
           <w:lang w:val="en-SG"/>
         </w:rPr>
-        <w:t>    MemberID CHAR(10) NOT NULL,               -- natural key</w:t>
+        <w:t xml:space="preserve">    </w:t>
+      </w:r>
+      <w:proofErr w:type="spellStart"/>
+      <w:r>
+        <w:rPr>
+          <w:lang w:val="en-SG"/>
+        </w:rPr>
+        <w:t>MemberID</w:t>
+      </w:r>
+      <w:proofErr w:type="spellEnd"/>
+      <w:r>
+        <w:rPr>
+          <w:lang w:val="en-SG"/>
+        </w:rPr>
+        <w:t xml:space="preserve"> </w:t>
+      </w:r>
+      <w:proofErr w:type="gramStart"/>
+      <w:r>
+        <w:rPr>
+          <w:lang w:val="en-SG"/>
+        </w:rPr>
+        <w:t>CHAR(</w:t>
+      </w:r>
+      <w:proofErr w:type="gramEnd"/>
+      <w:r>
+        <w:rPr>
+          <w:lang w:val="en-SG"/>
+        </w:rPr>
+        <w:t xml:space="preserve">10) NOT </w:t>
+      </w:r>
+      <w:proofErr w:type="gramStart"/>
+      <w:r>
+        <w:rPr>
+          <w:lang w:val="en-SG"/>
+        </w:rPr>
+        <w:t xml:space="preserve">NULL,   </w:t>
+      </w:r>
+      <w:proofErr w:type="gramEnd"/>
+      <w:r>
+        <w:rPr>
+          <w:lang w:val="en-SG"/>
+        </w:rPr>
+        <w:t>            -- natural key</w:t>
       </w:r>
     </w:p>
     <w:p>
@@ -3306,7 +4084,21 @@
         <w:rPr>
           <w:lang w:val="en-SG"/>
         </w:rPr>
-        <w:t>    Name VARCHAR(100) NOT NULL,</w:t>
+        <w:t xml:space="preserve">    Name </w:t>
+      </w:r>
+      <w:proofErr w:type="gramStart"/>
+      <w:r>
+        <w:rPr>
+          <w:lang w:val="en-SG"/>
+        </w:rPr>
+        <w:t>VARCHAR(</w:t>
+      </w:r>
+      <w:proofErr w:type="gramEnd"/>
+      <w:r>
+        <w:rPr>
+          <w:lang w:val="en-SG"/>
+        </w:rPr>
+        <w:t>100) NOT NULL,</w:t>
       </w:r>
     </w:p>
     <w:p>
@@ -3320,7 +4112,21 @@
         <w:rPr>
           <w:lang w:val="en-SG"/>
         </w:rPr>
-        <w:t>    Gender CHAR(1) NOT NULL,</w:t>
+        <w:t xml:space="preserve">    Gender </w:t>
+      </w:r>
+      <w:proofErr w:type="gramStart"/>
+      <w:r>
+        <w:rPr>
+          <w:lang w:val="en-SG"/>
+        </w:rPr>
+        <w:t>CHAR(</w:t>
+      </w:r>
+      <w:proofErr w:type="gramEnd"/>
+      <w:r>
+        <w:rPr>
+          <w:lang w:val="en-SG"/>
+        </w:rPr>
+        <w:t>1) NOT NULL,</w:t>
       </w:r>
     </w:p>
     <w:p>
@@ -3334,7 +4140,21 @@
         <w:rPr>
           <w:lang w:val="en-SG"/>
         </w:rPr>
-        <w:t>    Occupation VARCHAR(50) NULL,</w:t>
+        <w:t xml:space="preserve">    Occupation </w:t>
+      </w:r>
+      <w:proofErr w:type="gramStart"/>
+      <w:r>
+        <w:rPr>
+          <w:lang w:val="en-SG"/>
+        </w:rPr>
+        <w:t>VARCHAR(</w:t>
+      </w:r>
+      <w:proofErr w:type="gramEnd"/>
+      <w:r>
+        <w:rPr>
+          <w:lang w:val="en-SG"/>
+        </w:rPr>
+        <w:t>50) NULL,</w:t>
       </w:r>
     </w:p>
     <w:p>
@@ -3348,7 +4168,21 @@
         <w:rPr>
           <w:lang w:val="en-SG"/>
         </w:rPr>
-        <w:t>    RegistrationDate DATE NOT NULL,</w:t>
+        <w:t xml:space="preserve">    </w:t>
+      </w:r>
+      <w:proofErr w:type="spellStart"/>
+      <w:r>
+        <w:rPr>
+          <w:lang w:val="en-SG"/>
+        </w:rPr>
+        <w:t>RegistrationDate</w:t>
+      </w:r>
+      <w:proofErr w:type="spellEnd"/>
+      <w:r>
+        <w:rPr>
+          <w:lang w:val="en-SG"/>
+        </w:rPr>
+        <w:t xml:space="preserve"> DATE NOT NULL,</w:t>
       </w:r>
     </w:p>
     <w:p>
@@ -3362,7 +4196,63 @@
         <w:rPr>
           <w:lang w:val="en-SG"/>
         </w:rPr>
-        <w:t>    TierName VARCHAR(20) NOT NULL,            -- denormalised tier attributes (star schema)</w:t>
+        <w:t xml:space="preserve">    </w:t>
+      </w:r>
+      <w:proofErr w:type="spellStart"/>
+      <w:r>
+        <w:rPr>
+          <w:lang w:val="en-SG"/>
+        </w:rPr>
+        <w:t>TierName</w:t>
+      </w:r>
+      <w:proofErr w:type="spellEnd"/>
+      <w:r>
+        <w:rPr>
+          <w:lang w:val="en-SG"/>
+        </w:rPr>
+        <w:t xml:space="preserve"> </w:t>
+      </w:r>
+      <w:proofErr w:type="gramStart"/>
+      <w:r>
+        <w:rPr>
+          <w:lang w:val="en-SG"/>
+        </w:rPr>
+        <w:t>VARCHAR(</w:t>
+      </w:r>
+      <w:proofErr w:type="gramEnd"/>
+      <w:r>
+        <w:rPr>
+          <w:lang w:val="en-SG"/>
+        </w:rPr>
+        <w:t xml:space="preserve">20) NOT </w:t>
+      </w:r>
+      <w:proofErr w:type="gramStart"/>
+      <w:r>
+        <w:rPr>
+          <w:lang w:val="en-SG"/>
+        </w:rPr>
+        <w:t xml:space="preserve">NULL,   </w:t>
+      </w:r>
+      <w:proofErr w:type="gramEnd"/>
+      <w:r>
+        <w:rPr>
+          <w:lang w:val="en-SG"/>
+        </w:rPr>
+        <w:t xml:space="preserve">         -- </w:t>
+      </w:r>
+      <w:proofErr w:type="spellStart"/>
+      <w:r>
+        <w:rPr>
+          <w:lang w:val="en-SG"/>
+        </w:rPr>
+        <w:t>denormalised</w:t>
+      </w:r>
+      <w:proofErr w:type="spellEnd"/>
+      <w:r>
+        <w:rPr>
+          <w:lang w:val="en-SG"/>
+        </w:rPr>
+        <w:t xml:space="preserve"> tier attributes (star schema)</w:t>
       </w:r>
     </w:p>
     <w:p>
@@ -3376,7 +4266,21 @@
         <w:rPr>
           <w:lang w:val="en-SG"/>
         </w:rPr>
-        <w:t>    TierLevel INT NOT NULL,</w:t>
+        <w:t xml:space="preserve">    </w:t>
+      </w:r>
+      <w:proofErr w:type="spellStart"/>
+      <w:r>
+        <w:rPr>
+          <w:lang w:val="en-SG"/>
+        </w:rPr>
+        <w:t>TierLevel</w:t>
+      </w:r>
+      <w:proofErr w:type="spellEnd"/>
+      <w:r>
+        <w:rPr>
+          <w:lang w:val="en-SG"/>
+        </w:rPr>
+        <w:t xml:space="preserve"> INT NOT NULL,</w:t>
       </w:r>
     </w:p>
     <w:p>
@@ -3390,7 +4294,21 @@
         <w:rPr>
           <w:lang w:val="en-SG"/>
         </w:rPr>
-        <w:t>    BorrowLimit INT NOT NULL</w:t>
+        <w:t xml:space="preserve">    </w:t>
+      </w:r>
+      <w:proofErr w:type="spellStart"/>
+      <w:r>
+        <w:rPr>
+          <w:lang w:val="en-SG"/>
+        </w:rPr>
+        <w:t>BorrowLimit</w:t>
+      </w:r>
+      <w:proofErr w:type="spellEnd"/>
+      <w:r>
+        <w:rPr>
+          <w:lang w:val="en-SG"/>
+        </w:rPr>
+        <w:t xml:space="preserve"> INT NOT NULL</w:t>
       </w:r>
     </w:p>
     <w:p>
@@ -3426,7 +4344,21 @@
         <w:rPr>
           <w:lang w:val="en-SG"/>
         </w:rPr>
-        <w:t>CREATE TABLE DimStaff (</w:t>
+        <w:t xml:space="preserve">CREATE TABLE </w:t>
+      </w:r>
+      <w:proofErr w:type="spellStart"/>
+      <w:r>
+        <w:rPr>
+          <w:lang w:val="en-SG"/>
+        </w:rPr>
+        <w:t>DimStaff</w:t>
+      </w:r>
+      <w:proofErr w:type="spellEnd"/>
+      <w:r>
+        <w:rPr>
+          <w:lang w:val="en-SG"/>
+        </w:rPr>
+        <w:t xml:space="preserve"> (</w:t>
       </w:r>
     </w:p>
     <w:p>
@@ -3440,7 +4372,35 @@
         <w:rPr>
           <w:lang w:val="en-SG"/>
         </w:rPr>
-        <w:t>    StaffKey INT AUTO_INCREMENT PRIMARY KEY,  -- surrogate key</w:t>
+        <w:t xml:space="preserve">    </w:t>
+      </w:r>
+      <w:proofErr w:type="spellStart"/>
+      <w:r>
+        <w:rPr>
+          <w:lang w:val="en-SG"/>
+        </w:rPr>
+        <w:t>StaffKey</w:t>
+      </w:r>
+      <w:proofErr w:type="spellEnd"/>
+      <w:r>
+        <w:rPr>
+          <w:lang w:val="en-SG"/>
+        </w:rPr>
+        <w:t xml:space="preserve"> INT AUTO_INCREMENT PRIMARY </w:t>
+      </w:r>
+      <w:proofErr w:type="gramStart"/>
+      <w:r>
+        <w:rPr>
+          <w:lang w:val="en-SG"/>
+        </w:rPr>
+        <w:t>KEY,  --</w:t>
+      </w:r>
+      <w:proofErr w:type="gramEnd"/>
+      <w:r>
+        <w:rPr>
+          <w:lang w:val="en-SG"/>
+        </w:rPr>
+        <w:t xml:space="preserve"> surrogate key</w:t>
       </w:r>
     </w:p>
     <w:p>
@@ -3454,7 +4414,49 @@
         <w:rPr>
           <w:lang w:val="en-SG"/>
         </w:rPr>
-        <w:t>    StaffID CHAR(10) NOT NULL,                -- natural key</w:t>
+        <w:t xml:space="preserve">    </w:t>
+      </w:r>
+      <w:proofErr w:type="spellStart"/>
+      <w:r>
+        <w:rPr>
+          <w:lang w:val="en-SG"/>
+        </w:rPr>
+        <w:t>StaffID</w:t>
+      </w:r>
+      <w:proofErr w:type="spellEnd"/>
+      <w:r>
+        <w:rPr>
+          <w:lang w:val="en-SG"/>
+        </w:rPr>
+        <w:t xml:space="preserve"> </w:t>
+      </w:r>
+      <w:proofErr w:type="gramStart"/>
+      <w:r>
+        <w:rPr>
+          <w:lang w:val="en-SG"/>
+        </w:rPr>
+        <w:t>CHAR(</w:t>
+      </w:r>
+      <w:proofErr w:type="gramEnd"/>
+      <w:r>
+        <w:rPr>
+          <w:lang w:val="en-SG"/>
+        </w:rPr>
+        <w:t xml:space="preserve">10) NOT </w:t>
+      </w:r>
+      <w:proofErr w:type="gramStart"/>
+      <w:r>
+        <w:rPr>
+          <w:lang w:val="en-SG"/>
+        </w:rPr>
+        <w:t xml:space="preserve">NULL,   </w:t>
+      </w:r>
+      <w:proofErr w:type="gramEnd"/>
+      <w:r>
+        <w:rPr>
+          <w:lang w:val="en-SG"/>
+        </w:rPr>
+        <w:t>             -- natural key</w:t>
       </w:r>
     </w:p>
     <w:p>
@@ -3468,7 +4470,21 @@
         <w:rPr>
           <w:lang w:val="en-SG"/>
         </w:rPr>
-        <w:t>    Name VARCHAR(100) NOT NULL,</w:t>
+        <w:t xml:space="preserve">    Name </w:t>
+      </w:r>
+      <w:proofErr w:type="gramStart"/>
+      <w:r>
+        <w:rPr>
+          <w:lang w:val="en-SG"/>
+        </w:rPr>
+        <w:t>VARCHAR(</w:t>
+      </w:r>
+      <w:proofErr w:type="gramEnd"/>
+      <w:r>
+        <w:rPr>
+          <w:lang w:val="en-SG"/>
+        </w:rPr>
+        <w:t>100) NOT NULL,</w:t>
       </w:r>
     </w:p>
     <w:p>
@@ -3482,7 +4498,21 @@
         <w:rPr>
           <w:lang w:val="en-SG"/>
         </w:rPr>
-        <w:t>    Gender CHAR(1) NOT NULL,</w:t>
+        <w:t xml:space="preserve">    Gender </w:t>
+      </w:r>
+      <w:proofErr w:type="gramStart"/>
+      <w:r>
+        <w:rPr>
+          <w:lang w:val="en-SG"/>
+        </w:rPr>
+        <w:t>CHAR(</w:t>
+      </w:r>
+      <w:proofErr w:type="gramEnd"/>
+      <w:r>
+        <w:rPr>
+          <w:lang w:val="en-SG"/>
+        </w:rPr>
+        <w:t>1) NOT NULL,</w:t>
       </w:r>
     </w:p>
     <w:p>
@@ -3496,7 +4526,35 @@
         <w:rPr>
           <w:lang w:val="en-SG"/>
         </w:rPr>
-        <w:t>    EmploymentType VARCHAR(20) NOT NULL,</w:t>
+        <w:t xml:space="preserve">    </w:t>
+      </w:r>
+      <w:proofErr w:type="spellStart"/>
+      <w:r>
+        <w:rPr>
+          <w:lang w:val="en-SG"/>
+        </w:rPr>
+        <w:t>EmploymentType</w:t>
+      </w:r>
+      <w:proofErr w:type="spellEnd"/>
+      <w:r>
+        <w:rPr>
+          <w:lang w:val="en-SG"/>
+        </w:rPr>
+        <w:t xml:space="preserve"> </w:t>
+      </w:r>
+      <w:proofErr w:type="gramStart"/>
+      <w:r>
+        <w:rPr>
+          <w:lang w:val="en-SG"/>
+        </w:rPr>
+        <w:t>VARCHAR(</w:t>
+      </w:r>
+      <w:proofErr w:type="gramEnd"/>
+      <w:r>
+        <w:rPr>
+          <w:lang w:val="en-SG"/>
+        </w:rPr>
+        <w:t>20) NOT NULL,</w:t>
       </w:r>
     </w:p>
     <w:p>
@@ -3510,7 +4568,21 @@
         <w:rPr>
           <w:lang w:val="en-SG"/>
         </w:rPr>
-        <w:t>    Department VARCHAR(50) NOT NULL,</w:t>
+        <w:t xml:space="preserve">    Department </w:t>
+      </w:r>
+      <w:proofErr w:type="gramStart"/>
+      <w:r>
+        <w:rPr>
+          <w:lang w:val="en-SG"/>
+        </w:rPr>
+        <w:t>VARCHAR(</w:t>
+      </w:r>
+      <w:proofErr w:type="gramEnd"/>
+      <w:r>
+        <w:rPr>
+          <w:lang w:val="en-SG"/>
+        </w:rPr>
+        <w:t>50) NOT NULL,</w:t>
       </w:r>
     </w:p>
     <w:p>
@@ -3560,7 +4632,21 @@
         <w:rPr>
           <w:lang w:val="en-SG"/>
         </w:rPr>
-        <w:t>CREATE TABLE DimBook (</w:t>
+        <w:t xml:space="preserve">CREATE TABLE </w:t>
+      </w:r>
+      <w:proofErr w:type="spellStart"/>
+      <w:r>
+        <w:rPr>
+          <w:lang w:val="en-SG"/>
+        </w:rPr>
+        <w:t>DimBook</w:t>
+      </w:r>
+      <w:proofErr w:type="spellEnd"/>
+      <w:r>
+        <w:rPr>
+          <w:lang w:val="en-SG"/>
+        </w:rPr>
+        <w:t xml:space="preserve"> (</w:t>
       </w:r>
     </w:p>
     <w:p>
@@ -3574,7 +4660,21 @@
         <w:rPr>
           <w:lang w:val="en-SG"/>
         </w:rPr>
-        <w:t>    BookKey INT AUTO_INCREMENT PRIMARY KEY,   -- surrogate key</w:t>
+        <w:t xml:space="preserve">    BookKey INT AUTO_INCREMENT PRIMARY </w:t>
+      </w:r>
+      <w:proofErr w:type="gramStart"/>
+      <w:r>
+        <w:rPr>
+          <w:lang w:val="en-SG"/>
+        </w:rPr>
+        <w:t xml:space="preserve">KEY,   </w:t>
+      </w:r>
+      <w:proofErr w:type="gramEnd"/>
+      <w:r>
+        <w:rPr>
+          <w:lang w:val="en-SG"/>
+        </w:rPr>
+        <w:t>-- surrogate key</w:t>
       </w:r>
     </w:p>
     <w:p>
@@ -3588,7 +4688,49 @@
         <w:rPr>
           <w:lang w:val="en-SG"/>
         </w:rPr>
-        <w:t>    BookID CHAR(10) NOT NULL,                 -- natural key</w:t>
+        <w:t xml:space="preserve">    </w:t>
+      </w:r>
+      <w:proofErr w:type="spellStart"/>
+      <w:r>
+        <w:rPr>
+          <w:lang w:val="en-SG"/>
+        </w:rPr>
+        <w:t>BookID</w:t>
+      </w:r>
+      <w:proofErr w:type="spellEnd"/>
+      <w:r>
+        <w:rPr>
+          <w:lang w:val="en-SG"/>
+        </w:rPr>
+        <w:t xml:space="preserve"> </w:t>
+      </w:r>
+      <w:proofErr w:type="gramStart"/>
+      <w:r>
+        <w:rPr>
+          <w:lang w:val="en-SG"/>
+        </w:rPr>
+        <w:t>CHAR(</w:t>
+      </w:r>
+      <w:proofErr w:type="gramEnd"/>
+      <w:r>
+        <w:rPr>
+          <w:lang w:val="en-SG"/>
+        </w:rPr>
+        <w:t xml:space="preserve">10) NOT </w:t>
+      </w:r>
+      <w:proofErr w:type="gramStart"/>
+      <w:r>
+        <w:rPr>
+          <w:lang w:val="en-SG"/>
+        </w:rPr>
+        <w:t xml:space="preserve">NULL,   </w:t>
+      </w:r>
+      <w:proofErr w:type="gramEnd"/>
+      <w:r>
+        <w:rPr>
+          <w:lang w:val="en-SG"/>
+        </w:rPr>
+        <w:t>              -- natural key</w:t>
       </w:r>
     </w:p>
     <w:p>
@@ -3602,7 +4744,21 @@
         <w:rPr>
           <w:lang w:val="en-SG"/>
         </w:rPr>
-        <w:t>    Title VARCHAR(200) NOT NULL,</w:t>
+        <w:t xml:space="preserve">    Title </w:t>
+      </w:r>
+      <w:proofErr w:type="gramStart"/>
+      <w:r>
+        <w:rPr>
+          <w:lang w:val="en-SG"/>
+        </w:rPr>
+        <w:t>VARCHAR(</w:t>
+      </w:r>
+      <w:proofErr w:type="gramEnd"/>
+      <w:r>
+        <w:rPr>
+          <w:lang w:val="en-SG"/>
+        </w:rPr>
+        <w:t>200) NOT NULL,</w:t>
       </w:r>
     </w:p>
     <w:p>
@@ -3617,7 +4773,21 @@
           <w:lang w:val="en-SG"/>
         </w:rPr>
         <w:lastRenderedPageBreak/>
-        <w:t>    Author VARCHAR(100) NOT NULL,</w:t>
+        <w:t xml:space="preserve">    Author </w:t>
+      </w:r>
+      <w:proofErr w:type="gramStart"/>
+      <w:r>
+        <w:rPr>
+          <w:lang w:val="en-SG"/>
+        </w:rPr>
+        <w:t>VARCHAR(</w:t>
+      </w:r>
+      <w:proofErr w:type="gramEnd"/>
+      <w:r>
+        <w:rPr>
+          <w:lang w:val="en-SG"/>
+        </w:rPr>
+        <w:t>100) NOT NULL,</w:t>
       </w:r>
     </w:p>
     <w:p>
@@ -3631,7 +4801,21 @@
         <w:rPr>
           <w:lang w:val="en-SG"/>
         </w:rPr>
-        <w:t>    Genre VARCHAR(50) NOT NULL,</w:t>
+        <w:t xml:space="preserve">    Genre </w:t>
+      </w:r>
+      <w:proofErr w:type="gramStart"/>
+      <w:r>
+        <w:rPr>
+          <w:lang w:val="en-SG"/>
+        </w:rPr>
+        <w:t>VARCHAR(</w:t>
+      </w:r>
+      <w:proofErr w:type="gramEnd"/>
+      <w:r>
+        <w:rPr>
+          <w:lang w:val="en-SG"/>
+        </w:rPr>
+        <w:t>50) NOT NULL,</w:t>
       </w:r>
     </w:p>
     <w:p>
@@ -3645,7 +4829,35 @@
         <w:rPr>
           <w:lang w:val="en-SG"/>
         </w:rPr>
-        <w:t>    MinTierName VARCHAR(20) NOT NULL,</w:t>
+        <w:t xml:space="preserve">    </w:t>
+      </w:r>
+      <w:proofErr w:type="spellStart"/>
+      <w:r>
+        <w:rPr>
+          <w:lang w:val="en-SG"/>
+        </w:rPr>
+        <w:t>MinTierName</w:t>
+      </w:r>
+      <w:proofErr w:type="spellEnd"/>
+      <w:r>
+        <w:rPr>
+          <w:lang w:val="en-SG"/>
+        </w:rPr>
+        <w:t xml:space="preserve"> </w:t>
+      </w:r>
+      <w:proofErr w:type="gramStart"/>
+      <w:r>
+        <w:rPr>
+          <w:lang w:val="en-SG"/>
+        </w:rPr>
+        <w:t>VARCHAR(</w:t>
+      </w:r>
+      <w:proofErr w:type="gramEnd"/>
+      <w:r>
+        <w:rPr>
+          <w:lang w:val="en-SG"/>
+        </w:rPr>
+        <w:t>20) NOT NULL,</w:t>
       </w:r>
     </w:p>
     <w:p>
@@ -3659,7 +4871,21 @@
         <w:rPr>
           <w:lang w:val="en-SG"/>
         </w:rPr>
-        <w:t>    MinTierLevel INT NOT NULL</w:t>
+        <w:t xml:space="preserve">    </w:t>
+      </w:r>
+      <w:proofErr w:type="spellStart"/>
+      <w:r>
+        <w:rPr>
+          <w:lang w:val="en-SG"/>
+        </w:rPr>
+        <w:t>MinTierLevel</w:t>
+      </w:r>
+      <w:proofErr w:type="spellEnd"/>
+      <w:r>
+        <w:rPr>
+          <w:lang w:val="en-SG"/>
+        </w:rPr>
+        <w:t xml:space="preserve"> INT NOT NULL</w:t>
       </w:r>
     </w:p>
     <w:p>
@@ -3709,7 +4935,21 @@
         <w:rPr>
           <w:lang w:val="en-SG"/>
         </w:rPr>
-        <w:t>CREATE TABLE FactLoan (</w:t>
+        <w:t xml:space="preserve">CREATE TABLE </w:t>
+      </w:r>
+      <w:proofErr w:type="spellStart"/>
+      <w:r>
+        <w:rPr>
+          <w:lang w:val="en-SG"/>
+        </w:rPr>
+        <w:t>FactLoan</w:t>
+      </w:r>
+      <w:proofErr w:type="spellEnd"/>
+      <w:r>
+        <w:rPr>
+          <w:lang w:val="en-SG"/>
+        </w:rPr>
+        <w:t xml:space="preserve"> (</w:t>
       </w:r>
     </w:p>
     <w:p>
@@ -3723,7 +4963,35 @@
         <w:rPr>
           <w:lang w:val="en-SG"/>
         </w:rPr>
-        <w:t>    LoanKey INT AUTO_INCREMENT PRIMARY KEY,   -- surrogate key</w:t>
+        <w:t xml:space="preserve">    </w:t>
+      </w:r>
+      <w:proofErr w:type="spellStart"/>
+      <w:r>
+        <w:rPr>
+          <w:lang w:val="en-SG"/>
+        </w:rPr>
+        <w:t>LoanKey</w:t>
+      </w:r>
+      <w:proofErr w:type="spellEnd"/>
+      <w:r>
+        <w:rPr>
+          <w:lang w:val="en-SG"/>
+        </w:rPr>
+        <w:t xml:space="preserve"> INT AUTO_INCREMENT PRIMARY </w:t>
+      </w:r>
+      <w:proofErr w:type="gramStart"/>
+      <w:r>
+        <w:rPr>
+          <w:lang w:val="en-SG"/>
+        </w:rPr>
+        <w:t xml:space="preserve">KEY,   </w:t>
+      </w:r>
+      <w:proofErr w:type="gramEnd"/>
+      <w:r>
+        <w:rPr>
+          <w:lang w:val="en-SG"/>
+        </w:rPr>
+        <w:t>-- surrogate key</w:t>
       </w:r>
     </w:p>
     <w:p>
@@ -3737,7 +5005,21 @@
         <w:rPr>
           <w:lang w:val="en-SG"/>
         </w:rPr>
-        <w:t>    MemberKey INT NOT NULL,</w:t>
+        <w:t xml:space="preserve">    </w:t>
+      </w:r>
+      <w:proofErr w:type="spellStart"/>
+      <w:r>
+        <w:rPr>
+          <w:lang w:val="en-SG"/>
+        </w:rPr>
+        <w:t>MemberKey</w:t>
+      </w:r>
+      <w:proofErr w:type="spellEnd"/>
+      <w:r>
+        <w:rPr>
+          <w:lang w:val="en-SG"/>
+        </w:rPr>
+        <w:t xml:space="preserve"> INT NOT NULL,</w:t>
       </w:r>
     </w:p>
     <w:p>
@@ -3751,7 +5033,21 @@
         <w:rPr>
           <w:lang w:val="en-SG"/>
         </w:rPr>
-        <w:t>    StaffKey INT NOT NULL,</w:t>
+        <w:t xml:space="preserve">    </w:t>
+      </w:r>
+      <w:proofErr w:type="spellStart"/>
+      <w:r>
+        <w:rPr>
+          <w:lang w:val="en-SG"/>
+        </w:rPr>
+        <w:t>StaffKey</w:t>
+      </w:r>
+      <w:proofErr w:type="spellEnd"/>
+      <w:r>
+        <w:rPr>
+          <w:lang w:val="en-SG"/>
+        </w:rPr>
+        <w:t xml:space="preserve"> INT NOT NULL,</w:t>
       </w:r>
     </w:p>
     <w:p>
@@ -3779,7 +5075,21 @@
         <w:rPr>
           <w:lang w:val="en-SG"/>
         </w:rPr>
-        <w:t>    BorrowDateKey INT NOT NULL,</w:t>
+        <w:t xml:space="preserve">    </w:t>
+      </w:r>
+      <w:proofErr w:type="spellStart"/>
+      <w:r>
+        <w:rPr>
+          <w:lang w:val="en-SG"/>
+        </w:rPr>
+        <w:t>BorrowDateKey</w:t>
+      </w:r>
+      <w:proofErr w:type="spellEnd"/>
+      <w:r>
+        <w:rPr>
+          <w:lang w:val="en-SG"/>
+        </w:rPr>
+        <w:t xml:space="preserve"> INT NOT NULL,</w:t>
       </w:r>
     </w:p>
     <w:p>
@@ -3793,7 +5103,21 @@
         <w:rPr>
           <w:lang w:val="en-SG"/>
         </w:rPr>
-        <w:t>    ReturnDateKey INT NOT NULL,</w:t>
+        <w:t xml:space="preserve">    </w:t>
+      </w:r>
+      <w:proofErr w:type="spellStart"/>
+      <w:r>
+        <w:rPr>
+          <w:lang w:val="en-SG"/>
+        </w:rPr>
+        <w:t>ReturnDateKey</w:t>
+      </w:r>
+      <w:proofErr w:type="spellEnd"/>
+      <w:r>
+        <w:rPr>
+          <w:lang w:val="en-SG"/>
+        </w:rPr>
+        <w:t xml:space="preserve"> INT NOT NULL,</w:t>
       </w:r>
     </w:p>
     <w:p>
@@ -3807,7 +5131,35 @@
         <w:rPr>
           <w:lang w:val="en-SG"/>
         </w:rPr>
-        <w:t>    CopySeqNo INT NOT NULL,                   -- degenerate dimension</w:t>
+        <w:t xml:space="preserve">    </w:t>
+      </w:r>
+      <w:proofErr w:type="spellStart"/>
+      <w:r>
+        <w:rPr>
+          <w:lang w:val="en-SG"/>
+        </w:rPr>
+        <w:t>CopySeqNo</w:t>
+      </w:r>
+      <w:proofErr w:type="spellEnd"/>
+      <w:r>
+        <w:rPr>
+          <w:lang w:val="en-SG"/>
+        </w:rPr>
+        <w:t xml:space="preserve"> INT NOT </w:t>
+      </w:r>
+      <w:proofErr w:type="gramStart"/>
+      <w:r>
+        <w:rPr>
+          <w:lang w:val="en-SG"/>
+        </w:rPr>
+        <w:t xml:space="preserve">NULL,   </w:t>
+      </w:r>
+      <w:proofErr w:type="gramEnd"/>
+      <w:r>
+        <w:rPr>
+          <w:lang w:val="en-SG"/>
+        </w:rPr>
+        <w:t>                -- degenerate dimension</w:t>
       </w:r>
     </w:p>
     <w:p>
@@ -3821,7 +5173,35 @@
         <w:rPr>
           <w:lang w:val="en-SG"/>
         </w:rPr>
-        <w:t>    LoanDurationDays INT NOT NULL,            -- return date - borrow date</w:t>
+        <w:t xml:space="preserve">    </w:t>
+      </w:r>
+      <w:proofErr w:type="spellStart"/>
+      <w:r>
+        <w:rPr>
+          <w:lang w:val="en-SG"/>
+        </w:rPr>
+        <w:t>LoanDurationDays</w:t>
+      </w:r>
+      <w:proofErr w:type="spellEnd"/>
+      <w:r>
+        <w:rPr>
+          <w:lang w:val="en-SG"/>
+        </w:rPr>
+        <w:t xml:space="preserve"> INT NOT </w:t>
+      </w:r>
+      <w:proofErr w:type="gramStart"/>
+      <w:r>
+        <w:rPr>
+          <w:lang w:val="en-SG"/>
+        </w:rPr>
+        <w:t xml:space="preserve">NULL,   </w:t>
+      </w:r>
+      <w:proofErr w:type="gramEnd"/>
+      <w:r>
+        <w:rPr>
+          <w:lang w:val="en-SG"/>
+        </w:rPr>
+        <w:t>         -- return date - borrow date</w:t>
       </w:r>
     </w:p>
     <w:p>
@@ -3835,7 +5215,35 @@
         <w:rPr>
           <w:lang w:val="en-SG"/>
         </w:rPr>
-        <w:t>    DaysBeforeDue INT NOT NULL,               -- due date - return date (negative = late)</w:t>
+        <w:t xml:space="preserve">    </w:t>
+      </w:r>
+      <w:proofErr w:type="spellStart"/>
+      <w:r>
+        <w:rPr>
+          <w:lang w:val="en-SG"/>
+        </w:rPr>
+        <w:t>DaysBeforeDue</w:t>
+      </w:r>
+      <w:proofErr w:type="spellEnd"/>
+      <w:r>
+        <w:rPr>
+          <w:lang w:val="en-SG"/>
+        </w:rPr>
+        <w:t xml:space="preserve"> INT NOT </w:t>
+      </w:r>
+      <w:proofErr w:type="gramStart"/>
+      <w:r>
+        <w:rPr>
+          <w:lang w:val="en-SG"/>
+        </w:rPr>
+        <w:t xml:space="preserve">NULL,   </w:t>
+      </w:r>
+      <w:proofErr w:type="gramEnd"/>
+      <w:r>
+        <w:rPr>
+          <w:lang w:val="en-SG"/>
+        </w:rPr>
+        <w:t>            -- due date - return date (negative = late)</w:t>
       </w:r>
     </w:p>
     <w:p>
@@ -3849,7 +5257,21 @@
         <w:rPr>
           <w:lang w:val="en-SG"/>
         </w:rPr>
-        <w:t>    IsLate BOOLEAN NOT NULL,</w:t>
+        <w:t xml:space="preserve">    </w:t>
+      </w:r>
+      <w:proofErr w:type="spellStart"/>
+      <w:r>
+        <w:rPr>
+          <w:lang w:val="en-SG"/>
+        </w:rPr>
+        <w:t>IsLate</w:t>
+      </w:r>
+      <w:proofErr w:type="spellEnd"/>
+      <w:r>
+        <w:rPr>
+          <w:lang w:val="en-SG"/>
+        </w:rPr>
+        <w:t xml:space="preserve"> BOOLEAN NOT NULL,</w:t>
       </w:r>
     </w:p>
     <w:p>
@@ -3863,7 +5285,51 @@
         <w:rPr>
           <w:lang w:val="en-SG"/>
         </w:rPr>
-        <w:t>    FOREIGN KEY (MemberKey) REFERENCES DimMember(MemberKey),</w:t>
+        <w:t>    FOREIGN KEY (</w:t>
+      </w:r>
+      <w:proofErr w:type="spellStart"/>
+      <w:r>
+        <w:rPr>
+          <w:lang w:val="en-SG"/>
+        </w:rPr>
+        <w:t>MemberKey</w:t>
+      </w:r>
+      <w:proofErr w:type="spellEnd"/>
+      <w:r>
+        <w:rPr>
+          <w:lang w:val="en-SG"/>
+        </w:rPr>
+        <w:t xml:space="preserve">) REFERENCES </w:t>
+      </w:r>
+      <w:proofErr w:type="spellStart"/>
+      <w:proofErr w:type="gramStart"/>
+      <w:r>
+        <w:rPr>
+          <w:lang w:val="en-SG"/>
+        </w:rPr>
+        <w:t>DimMember</w:t>
+      </w:r>
+      <w:proofErr w:type="spellEnd"/>
+      <w:r>
+        <w:rPr>
+          <w:lang w:val="en-SG"/>
+        </w:rPr>
+        <w:t>(</w:t>
+      </w:r>
+      <w:proofErr w:type="spellStart"/>
+      <w:proofErr w:type="gramEnd"/>
+      <w:r>
+        <w:rPr>
+          <w:lang w:val="en-SG"/>
+        </w:rPr>
+        <w:t>MemberKey</w:t>
+      </w:r>
+      <w:proofErr w:type="spellEnd"/>
+      <w:r>
+        <w:rPr>
+          <w:lang w:val="en-SG"/>
+        </w:rPr>
+        <w:t>),</w:t>
       </w:r>
     </w:p>
     <w:p>
@@ -3877,7 +5343,51 @@
         <w:rPr>
           <w:lang w:val="en-SG"/>
         </w:rPr>
-        <w:t>    FOREIGN KEY (StaffKey) REFERENCES DimStaff(StaffKey),</w:t>
+        <w:t>    FOREIGN KEY (</w:t>
+      </w:r>
+      <w:proofErr w:type="spellStart"/>
+      <w:r>
+        <w:rPr>
+          <w:lang w:val="en-SG"/>
+        </w:rPr>
+        <w:t>StaffKey</w:t>
+      </w:r>
+      <w:proofErr w:type="spellEnd"/>
+      <w:r>
+        <w:rPr>
+          <w:lang w:val="en-SG"/>
+        </w:rPr>
+        <w:t xml:space="preserve">) REFERENCES </w:t>
+      </w:r>
+      <w:proofErr w:type="spellStart"/>
+      <w:proofErr w:type="gramStart"/>
+      <w:r>
+        <w:rPr>
+          <w:lang w:val="en-SG"/>
+        </w:rPr>
+        <w:t>DimStaff</w:t>
+      </w:r>
+      <w:proofErr w:type="spellEnd"/>
+      <w:r>
+        <w:rPr>
+          <w:lang w:val="en-SG"/>
+        </w:rPr>
+        <w:t>(</w:t>
+      </w:r>
+      <w:proofErr w:type="spellStart"/>
+      <w:proofErr w:type="gramEnd"/>
+      <w:r>
+        <w:rPr>
+          <w:lang w:val="en-SG"/>
+        </w:rPr>
+        <w:t>StaffKey</w:t>
+      </w:r>
+      <w:proofErr w:type="spellEnd"/>
+      <w:r>
+        <w:rPr>
+          <w:lang w:val="en-SG"/>
+        </w:rPr>
+        <w:t>),</w:t>
       </w:r>
     </w:p>
     <w:p>
@@ -3891,7 +5401,29 @@
         <w:rPr>
           <w:lang w:val="en-SG"/>
         </w:rPr>
-        <w:t>    FOREIGN KEY (BookKey) REFERENCES DimBook(BookKey),</w:t>
+        <w:t xml:space="preserve">    FOREIGN KEY (BookKey) REFERENCES </w:t>
+      </w:r>
+      <w:proofErr w:type="spellStart"/>
+      <w:proofErr w:type="gramStart"/>
+      <w:r>
+        <w:rPr>
+          <w:lang w:val="en-SG"/>
+        </w:rPr>
+        <w:t>DimBook</w:t>
+      </w:r>
+      <w:proofErr w:type="spellEnd"/>
+      <w:r>
+        <w:rPr>
+          <w:lang w:val="en-SG"/>
+        </w:rPr>
+        <w:t>(</w:t>
+      </w:r>
+      <w:proofErr w:type="gramEnd"/>
+      <w:r>
+        <w:rPr>
+          <w:lang w:val="en-SG"/>
+        </w:rPr>
+        <w:t>BookKey),</w:t>
       </w:r>
     </w:p>
     <w:p>
@@ -3905,7 +5437,51 @@
         <w:rPr>
           <w:lang w:val="en-SG"/>
         </w:rPr>
-        <w:t>    FOREIGN KEY (BorrowDateKey) REFERENCES DimDate(DateKey),</w:t>
+        <w:t>    FOREIGN KEY (</w:t>
+      </w:r>
+      <w:proofErr w:type="spellStart"/>
+      <w:r>
+        <w:rPr>
+          <w:lang w:val="en-SG"/>
+        </w:rPr>
+        <w:t>BorrowDateKey</w:t>
+      </w:r>
+      <w:proofErr w:type="spellEnd"/>
+      <w:r>
+        <w:rPr>
+          <w:lang w:val="en-SG"/>
+        </w:rPr>
+        <w:t xml:space="preserve">) REFERENCES </w:t>
+      </w:r>
+      <w:proofErr w:type="spellStart"/>
+      <w:proofErr w:type="gramStart"/>
+      <w:r>
+        <w:rPr>
+          <w:lang w:val="en-SG"/>
+        </w:rPr>
+        <w:t>DimDate</w:t>
+      </w:r>
+      <w:proofErr w:type="spellEnd"/>
+      <w:r>
+        <w:rPr>
+          <w:lang w:val="en-SG"/>
+        </w:rPr>
+        <w:t>(</w:t>
+      </w:r>
+      <w:proofErr w:type="spellStart"/>
+      <w:proofErr w:type="gramEnd"/>
+      <w:r>
+        <w:rPr>
+          <w:lang w:val="en-SG"/>
+        </w:rPr>
+        <w:t>DateKey</w:t>
+      </w:r>
+      <w:proofErr w:type="spellEnd"/>
+      <w:r>
+        <w:rPr>
+          <w:lang w:val="en-SG"/>
+        </w:rPr>
+        <w:t>),</w:t>
       </w:r>
     </w:p>
     <w:p>
@@ -3919,7 +5495,51 @@
         <w:rPr>
           <w:lang w:val="en-SG"/>
         </w:rPr>
-        <w:t>    FOREIGN KEY (ReturnDateKey) REFERENCES DimDate(DateKey)</w:t>
+        <w:t>    FOREIGN KEY (</w:t>
+      </w:r>
+      <w:proofErr w:type="spellStart"/>
+      <w:r>
+        <w:rPr>
+          <w:lang w:val="en-SG"/>
+        </w:rPr>
+        <w:t>ReturnDateKey</w:t>
+      </w:r>
+      <w:proofErr w:type="spellEnd"/>
+      <w:r>
+        <w:rPr>
+          <w:lang w:val="en-SG"/>
+        </w:rPr>
+        <w:t xml:space="preserve">) REFERENCES </w:t>
+      </w:r>
+      <w:proofErr w:type="spellStart"/>
+      <w:proofErr w:type="gramStart"/>
+      <w:r>
+        <w:rPr>
+          <w:lang w:val="en-SG"/>
+        </w:rPr>
+        <w:t>DimDate</w:t>
+      </w:r>
+      <w:proofErr w:type="spellEnd"/>
+      <w:r>
+        <w:rPr>
+          <w:lang w:val="en-SG"/>
+        </w:rPr>
+        <w:t>(</w:t>
+      </w:r>
+      <w:proofErr w:type="spellStart"/>
+      <w:proofErr w:type="gramEnd"/>
+      <w:r>
+        <w:rPr>
+          <w:lang w:val="en-SG"/>
+        </w:rPr>
+        <w:t>DateKey</w:t>
+      </w:r>
+      <w:proofErr w:type="spellEnd"/>
+      <w:r>
+        <w:rPr>
+          <w:lang w:val="en-SG"/>
+        </w:rPr>
+        <w:t>)</w:t>
       </w:r>
     </w:p>
     <w:p>
@@ -3974,6 +5594,7 @@
         <w:rPr>
           <w:b/>
           <w:bCs/>
+          <w:noProof/>
           <w:lang w:val="en-SG"/>
         </w:rPr>
         <w:lastRenderedPageBreak/>
@@ -4043,7 +5664,169 @@
         <w:rPr>
           <w:sz w:val="20"/>
         </w:rPr>
-        <w:t>ETL verification: (1) Row-count reconciliation - completed loans in OLTP (SELECT COUNT(*) FROM Loan WHERE ReturnDatetime IS NOT NULL) = 12,343 and FactLoan = 12,343; DimMember = Member = 301; DimBook = Book = 500; DimStaff = Staff = 51. (2) Measure reconciliation - SUM(DATEDIFF(ReturnDatetime, StartDatetime)) computed directly on the OLTP Loan table = 108,801 days, identical to SUM(LoanDurationDays) in FactLoan, proving the duration measure was derived correctly for every row. (3) Referential integrity - a LEFT JOIN from FactLoan to each dimension returns 0 orphan rows, and all foreign keys are enforced by constraints so no fact row can reference a missing dimension member. The verification queries are included at the bottom of DW_insert.sql.</w:t>
+        <w:t xml:space="preserve">ETL verification: (1) Row-count reconciliation - completed loans in OLTP (SELECT </w:t>
+      </w:r>
+      <w:proofErr w:type="gramStart"/>
+      <w:r>
+        <w:rPr>
+          <w:sz w:val="20"/>
+        </w:rPr>
+        <w:t>COUNT(</w:t>
+      </w:r>
+      <w:proofErr w:type="gramEnd"/>
+      <w:r>
+        <w:rPr>
+          <w:sz w:val="20"/>
+        </w:rPr>
+        <w:t xml:space="preserve">*) FROM Loan WHERE </w:t>
+      </w:r>
+      <w:proofErr w:type="spellStart"/>
+      <w:r>
+        <w:rPr>
+          <w:sz w:val="20"/>
+        </w:rPr>
+        <w:t>ReturnDatetime</w:t>
+      </w:r>
+      <w:proofErr w:type="spellEnd"/>
+      <w:r>
+        <w:rPr>
+          <w:sz w:val="20"/>
+        </w:rPr>
+        <w:t xml:space="preserve"> IS NOT NULL) = 12,343 and </w:t>
+      </w:r>
+      <w:proofErr w:type="spellStart"/>
+      <w:r>
+        <w:rPr>
+          <w:sz w:val="20"/>
+        </w:rPr>
+        <w:t>FactLoan</w:t>
+      </w:r>
+      <w:proofErr w:type="spellEnd"/>
+      <w:r>
+        <w:rPr>
+          <w:sz w:val="20"/>
+        </w:rPr>
+        <w:t xml:space="preserve"> = 12,343; </w:t>
+      </w:r>
+      <w:proofErr w:type="spellStart"/>
+      <w:r>
+        <w:rPr>
+          <w:sz w:val="20"/>
+        </w:rPr>
+        <w:t>DimMember</w:t>
+      </w:r>
+      <w:proofErr w:type="spellEnd"/>
+      <w:r>
+        <w:rPr>
+          <w:sz w:val="20"/>
+        </w:rPr>
+        <w:t xml:space="preserve"> = Member = 301; </w:t>
+      </w:r>
+      <w:proofErr w:type="spellStart"/>
+      <w:r>
+        <w:rPr>
+          <w:sz w:val="20"/>
+        </w:rPr>
+        <w:t>DimBook</w:t>
+      </w:r>
+      <w:proofErr w:type="spellEnd"/>
+      <w:r>
+        <w:rPr>
+          <w:sz w:val="20"/>
+        </w:rPr>
+        <w:t xml:space="preserve"> = Book = 500; </w:t>
+      </w:r>
+      <w:proofErr w:type="spellStart"/>
+      <w:r>
+        <w:rPr>
+          <w:sz w:val="20"/>
+        </w:rPr>
+        <w:t>DimStaff</w:t>
+      </w:r>
+      <w:proofErr w:type="spellEnd"/>
+      <w:r>
+        <w:rPr>
+          <w:sz w:val="20"/>
+        </w:rPr>
+        <w:t xml:space="preserve"> = Staff = 51. (2) Measure reconciliation - </w:t>
+      </w:r>
+      <w:proofErr w:type="gramStart"/>
+      <w:r>
+        <w:rPr>
+          <w:sz w:val="20"/>
+        </w:rPr>
+        <w:t>SUM(DATEDIFF(</w:t>
+      </w:r>
+      <w:proofErr w:type="spellStart"/>
+      <w:proofErr w:type="gramEnd"/>
+      <w:r>
+        <w:rPr>
+          <w:sz w:val="20"/>
+        </w:rPr>
+        <w:t>ReturnDatetime</w:t>
+      </w:r>
+      <w:proofErr w:type="spellEnd"/>
+      <w:r>
+        <w:rPr>
+          <w:sz w:val="20"/>
+        </w:rPr>
+        <w:t>, StartDatetime)) computed directly on the OLTP Loan table = 108,801 days, identical to SUM(</w:t>
+      </w:r>
+      <w:proofErr w:type="spellStart"/>
+      <w:r>
+        <w:rPr>
+          <w:sz w:val="20"/>
+        </w:rPr>
+        <w:t>LoanDurationDays</w:t>
+      </w:r>
+      <w:proofErr w:type="spellEnd"/>
+      <w:r>
+        <w:rPr>
+          <w:sz w:val="20"/>
+        </w:rPr>
+        <w:t xml:space="preserve">) in </w:t>
+      </w:r>
+      <w:proofErr w:type="spellStart"/>
+      <w:r>
+        <w:rPr>
+          <w:sz w:val="20"/>
+        </w:rPr>
+        <w:t>FactLoan</w:t>
+      </w:r>
+      <w:proofErr w:type="spellEnd"/>
+      <w:r>
+        <w:rPr>
+          <w:sz w:val="20"/>
+        </w:rPr>
+        <w:t xml:space="preserve">, proving the duration measure was derived correctly for every row. (3) Referential integrity - a LEFT JOIN from </w:t>
+      </w:r>
+      <w:proofErr w:type="spellStart"/>
+      <w:r>
+        <w:rPr>
+          <w:sz w:val="20"/>
+        </w:rPr>
+        <w:t>FactLoan</w:t>
+      </w:r>
+      <w:proofErr w:type="spellEnd"/>
+      <w:r>
+        <w:rPr>
+          <w:sz w:val="20"/>
+        </w:rPr>
+        <w:t xml:space="preserve"> to each dimension returns 0 orphan rows, and all foreign keys are enforced by constraints so no fact row can reference a missing dimension member. The verification queries are included at the bottom of </w:t>
+      </w:r>
+      <w:proofErr w:type="spellStart"/>
+      <w:r>
+        <w:rPr>
+          <w:sz w:val="20"/>
+        </w:rPr>
+        <w:t>DW_insert.sql</w:t>
+      </w:r>
+      <w:proofErr w:type="spellEnd"/>
+      <w:r>
+        <w:rPr>
+          <w:sz w:val="20"/>
+        </w:rPr>
+        <w:t>.</w:t>
       </w:r>
     </w:p>
     <w:p>
@@ -4145,7 +5928,15 @@
       </w:pPr>
       <w:r>
         <w:lastRenderedPageBreak/>
-        <w:t xml:space="preserve">Describe and discuss your analysis done using the DW. </w:t>
+        <w:t xml:space="preserve">Describe and discuss your analysis done using </w:t>
+      </w:r>
+      <w:proofErr w:type="gramStart"/>
+      <w:r>
+        <w:t>the DW</w:t>
+      </w:r>
+      <w:proofErr w:type="gramEnd"/>
+      <w:r>
+        <w:t xml:space="preserve">. </w:t>
       </w:r>
       <w:r>
         <w:t>Briefly e</w:t>
@@ -4172,7 +5963,15 @@
         <w:t xml:space="preserve"> if group size is 4.</w:t>
       </w:r>
       <w:r>
-        <w:t xml:space="preserve"> Separately submit all your queries in DW_query.sql. (So do not include </w:t>
+        <w:t xml:space="preserve"> Separately submit all your queries in </w:t>
+      </w:r>
+      <w:proofErr w:type="spellStart"/>
+      <w:r>
+        <w:t>DW_query.sql</w:t>
+      </w:r>
+      <w:proofErr w:type="spellEnd"/>
+      <w:r>
+        <w:t xml:space="preserve">. (So do not include </w:t>
       </w:r>
       <w:r>
         <w:t>your</w:t>
@@ -4194,7 +5993,21 @@
         <w:rPr>
           <w:sz w:val="20"/>
         </w:rPr>
-        <w:t>Objective: identify long-term and seasonal trends in loan volume by month and year (time dimension). Results: monthly completed loans grew from ~35/month in 2020 to 2,838 in December 2025, with a clear year-end surge every year (Dec 2022: 90 vs Nov 57; Dec 2024: 235 vs Nov 177; Dec 2025: 2,838 vs Nov 1,188). Average loan duration stays stable at 8-9.5 days throughout. Insight: borrowing activity is growing rapidly (roughly doubling year on year since 2023) and peaks sharply in November-December. Staffing and stock planning should anticipate the December peak; the stable duration shows the 14-day policy comfortably covers actual reading time.</w:t>
+        <w:t xml:space="preserve">Objective: identify long-term and seasonal trends in loan volume by month and year (time dimension). Results: monthly completed loans grew from ~35/month in 2020 to 2,838 in December 2025, with a clear year-end surge every year (Dec 2022: 90 vs Nov 57; Dec 2024: 235 vs Nov 177; Dec 2025: 2,838 vs Nov 1,188). Average loan duration stays stable at 8-9.5 days throughout. Insight: borrowing activity is growing rapidly (roughly doubling year on year since 2023) and peaks sharply in November-December. </w:t>
+      </w:r>
+      <w:proofErr w:type="gramStart"/>
+      <w:r>
+        <w:rPr>
+          <w:sz w:val="20"/>
+        </w:rPr>
+        <w:t>Staffing</w:t>
+      </w:r>
+      <w:proofErr w:type="gramEnd"/>
+      <w:r>
+        <w:rPr>
+          <w:sz w:val="20"/>
+        </w:rPr>
+        <w:t xml:space="preserve"> and stock planning should anticipate the December peak; the stable duration shows the 14-day policy comfortably covers actual reading time.</w:t>
       </w:r>
     </w:p>
     <w:p>
@@ -4239,7 +6052,21 @@
         <w:rPr>
           <w:sz w:val="20"/>
         </w:rPr>
-        <w:t>Objective: compare genre popularity in absolute loans and loans per title, plus reading pace (book dimension). Results: Research Journal has the most total loans (2,093) but only 21.8 loans per title, while Young Adult has the highest intensity (31.2 loans per title from just 39 titles); Children is high on both (1,873 loans, 28.0 per title). Average duration is similar across genres (8.4-9.3 days). Insight: Research Journal's volume comes from its large catalogue (96 titles), whereas Young Adult and Children titles are individually in much higher demand - these genres are the best candidates for additional copies.</w:t>
+        <w:t xml:space="preserve">Objective: compare genre popularity in absolute loans and loans per title, plus reading pace (book dimension). Results: Research Journal has the most total loans (2,093) but only 21.8 loans per title, while Young Adult has the highest intensity (31.2 loans per title from just 39 titles); Children </w:t>
+      </w:r>
+      <w:proofErr w:type="gramStart"/>
+      <w:r>
+        <w:rPr>
+          <w:sz w:val="20"/>
+        </w:rPr>
+        <w:t>is</w:t>
+      </w:r>
+      <w:proofErr w:type="gramEnd"/>
+      <w:r>
+        <w:rPr>
+          <w:sz w:val="20"/>
+        </w:rPr>
+        <w:t xml:space="preserve"> high on both (1,873 loans, 28.0 per title). Average duration is similar across genres (8.4-9.3 days). Insight: Research Journal's volume comes from its large catalogue (96 titles), whereas Young Adult and Children titles are individually in much higher demand - these genres are the best candidates for additional copies.</w:t>
       </w:r>
     </w:p>
     <w:p>
@@ -4260,7 +6087,21 @@
         <w:rPr>
           <w:sz w:val="20"/>
         </w:rPr>
-        <w:t>Objective: detect outstanding members with significantly higher/lower activity (member dimension; loan count and total duration measures). Results: the top borrower, Evan Seah (Premium), completed 454 loans; Isaac Wilson (Premium) holds books longest in aggregate (5,726 days over 409 loans). Two of the top five are only Basic tier (Jasper Johnson 331, Theodore Campbell 324 loans). The least active members completed only 9-11 loans. Insight: activity varies by a factor of ~50 between the most and least active members. The heavy Basic-tier borrowers are prime candidates for tier upgrades, and the low-activity group could be targeted with re-engagement campaigns.</w:t>
+        <w:t xml:space="preserve">Objective: detect outstanding members with significantly higher/lower activity (member dimension; loan count and total duration measures). Results: the top borrower, Evan Seah (Premium), completed 454 loans; Isaac Wilson (Premium) holds books longest in aggregate (5,726 days over 409 loans). Two of the top five are only Basic tier (Jasper Johnson 331, Theodore Campbell 324 loans). The least active members completed only 9-11 loans. Insight: activity varies by a factor of ~50 </w:t>
+      </w:r>
+      <w:proofErr w:type="gramStart"/>
+      <w:r>
+        <w:rPr>
+          <w:sz w:val="20"/>
+        </w:rPr>
+        <w:t>between</w:t>
+      </w:r>
+      <w:proofErr w:type="gramEnd"/>
+      <w:r>
+        <w:rPr>
+          <w:sz w:val="20"/>
+        </w:rPr>
+        <w:t xml:space="preserve"> the most and least active members. The heavy Basic-tier borrowers are prime candidates for tier upgrades, and the low-activity group could be targeted with re-engagement campaigns.</w:t>
       </w:r>
     </w:p>
     <w:p>
@@ -4281,7 +6122,21 @@
         <w:rPr>
           <w:sz w:val="20"/>
         </w:rPr>
-        <w:t>Objective: examine whether membership tier relates to return discipline (member dimension x lateness measures). Results: late-return rate falls as tier rises - Basic 8.94%, Advanced 8.12%, Premium 7.94% - while average loan duration rises with tier (8.54 to 9.39 days). Insight: higher-tier members keep books slightly longer but return them more punctually, so the higher borrow limits given to upper tiers are not causing overdue problems. Late-return interventions (reminders, penalties) would be most effective aimed at Basic members.</w:t>
+        <w:t xml:space="preserve">Objective: examine whether membership tier relates to return discipline (member dimension x lateness measures). Results: late-return rate falls as tier rises - Basic 8.94%, Advanced 8.12%, Premium 7.94% - while average loan duration rises with tier (8.54 to 9.39 days). Insight: higher-tier members keep books slightly longer but return them more punctually, so the higher borrow limits given to upper tiers are not causing overdue problems. Late-return interventions (reminders, penalties) would be most </w:t>
+      </w:r>
+      <w:proofErr w:type="gramStart"/>
+      <w:r>
+        <w:rPr>
+          <w:sz w:val="20"/>
+        </w:rPr>
+        <w:t>effective</w:t>
+      </w:r>
+      <w:proofErr w:type="gramEnd"/>
+      <w:r>
+        <w:rPr>
+          <w:sz w:val="20"/>
+        </w:rPr>
+        <w:t xml:space="preserve"> aimed at Basic members.</w:t>
       </w:r>
     </w:p>
     <w:p>
@@ -4302,7 +6157,35 @@
         <w:rPr>
           <w:sz w:val="20"/>
         </w:rPr>
-        <w:t>Objective: multi-dimensional analysis (genre x month) - do Children and Young Adult loans spike in school-holiday months? Results: Children loans climb from 65 in January to 486 in December (7.5x), with secondary highs in June-July (126/131); Young Adult mirrors this (51 in January to 301 in December). Insight: youth borrowing is strongly seasonal and concentrated in the November-December school holidays, compounding the overall year-end surge from Analysis 1. The library should time children's programmes, new acquisitions and extra copies of popular youth titles for Q4.</w:t>
+        <w:t xml:space="preserve">Objective: multi-dimensional analysis (genre x month) - do Children and Young Adult loans spike in school-holiday months? Results: Children loans climb from 65 in January to 486 in December (7.5x), with secondary highs in June-July (126/131); Young Adult mirrors this (51 in January to 301 in December). Insight: </w:t>
+      </w:r>
+      <w:proofErr w:type="gramStart"/>
+      <w:r>
+        <w:rPr>
+          <w:sz w:val="20"/>
+        </w:rPr>
+        <w:t>youth</w:t>
+      </w:r>
+      <w:proofErr w:type="gramEnd"/>
+      <w:r>
+        <w:rPr>
+          <w:sz w:val="20"/>
+        </w:rPr>
+        <w:t xml:space="preserve"> borrowing is strongly seasonal and concentrated in the November-December school holidays, compounding the overall year-end surge from Analysis 1. The library should time children's </w:t>
+      </w:r>
+      <w:proofErr w:type="spellStart"/>
+      <w:r>
+        <w:rPr>
+          <w:sz w:val="20"/>
+        </w:rPr>
+        <w:t>programmes</w:t>
+      </w:r>
+      <w:proofErr w:type="spellEnd"/>
+      <w:r>
+        <w:rPr>
+          <w:sz w:val="20"/>
+        </w:rPr>
+        <w:t>, new acquisitions and extra copies of popular youth titles for Q4.</w:t>
       </w:r>
     </w:p>
     <w:p>
@@ -11761,12 +13644,7 @@
 </file>
 
 <file path=customXml/item1.xml><?xml version="1.0" encoding="utf-8"?>
-<?mso-contentType ?>
-<FormTemplates xmlns="http://schemas.microsoft.com/sharepoint/v3/contenttype/forms">
-  <Display>DocumentLibraryForm</Display>
-  <Edit>DocumentLibraryForm</Edit>
-  <New>DocumentLibraryForm</New>
-</FormTemplates>
+<b:Sources xmlns:b="http://schemas.openxmlformats.org/officeDocument/2006/bibliography" xmlns="http://schemas.openxmlformats.org/officeDocument/2006/bibliography" SelectedStyle="\MLA.XSL" StyleName="MLA"/>
 </file>
 
 <file path=customXml/item2.xml><?xml version="1.0" encoding="utf-8"?>
@@ -11783,7 +13661,12 @@
 </file>
 
 <file path=customXml/item3.xml><?xml version="1.0" encoding="utf-8"?>
-<b:Sources xmlns:b="http://schemas.openxmlformats.org/officeDocument/2006/bibliography" xmlns="http://schemas.openxmlformats.org/officeDocument/2006/bibliography" SelectedStyle="\MLA.XSL" StyleName="MLA"/>
+<?mso-contentType ?>
+<FormTemplates xmlns="http://schemas.microsoft.com/sharepoint/v3/contenttype/forms">
+  <Display>DocumentLibraryForm</Display>
+  <Edit>DocumentLibraryForm</Edit>
+  <New>DocumentLibraryForm</New>
+</FormTemplates>
 </file>
 
 <file path=customXml/item4.xml><?xml version="1.0" encoding="utf-8"?>
@@ -11999,9 +13882,9 @@
 </file>
 
 <file path=customXml/itemProps1.xml><?xml version="1.0" encoding="utf-8"?>
-<ds:datastoreItem xmlns:ds="http://schemas.openxmlformats.org/officeDocument/2006/customXml" ds:itemID="{C793F174-B33D-4AAE-9E3B-9A362A6F4892}">
+<ds:datastoreItem xmlns:ds="http://schemas.openxmlformats.org/officeDocument/2006/customXml" ds:itemID="{6A404842-743E-4BBC-99A7-70A911F17733}">
   <ds:schemaRefs>
-    <ds:schemaRef ds:uri="http://schemas.microsoft.com/sharepoint/v3/contenttype/forms"/>
+    <ds:schemaRef ds:uri="http://schemas.openxmlformats.org/officeDocument/2006/bibliography"/>
   </ds:schemaRefs>
 </ds:datastoreItem>
 </file>
@@ -12019,9 +13902,9 @@
 </file>
 
 <file path=customXml/itemProps3.xml><?xml version="1.0" encoding="utf-8"?>
-<ds:datastoreItem xmlns:ds="http://schemas.openxmlformats.org/officeDocument/2006/customXml" ds:itemID="{6A404842-743E-4BBC-99A7-70A911F17733}">
+<ds:datastoreItem xmlns:ds="http://schemas.openxmlformats.org/officeDocument/2006/customXml" ds:itemID="{C793F174-B33D-4AAE-9E3B-9A362A6F4892}">
   <ds:schemaRefs>
-    <ds:schemaRef ds:uri="http://schemas.openxmlformats.org/officeDocument/2006/bibliography"/>
+    <ds:schemaRef ds:uri="http://schemas.microsoft.com/sharepoint/v3/contenttype/forms"/>
   </ds:schemaRefs>
 </ds:datastoreItem>
 </file>

</xml_diff>

<commit_message>
more on doc, extra sql file to run
</commit_message>
<xml_diff>
--- a/2B21-04_group_submission.docx
+++ b/2B21-04_group_submission.docx
@@ -194,15 +194,7 @@
           </w:tcPr>
           <w:p>
             <w:r>
-              <w:t xml:space="preserve">Kendrick </w:t>
-            </w:r>
-            <w:proofErr w:type="spellStart"/>
-            <w:r>
-              <w:t>Slamat</w:t>
-            </w:r>
-            <w:proofErr w:type="spellEnd"/>
-            <w:r>
-              <w:t xml:space="preserve"> </w:t>
+              <w:t xml:space="preserve">Kendrick Slamat </w:t>
             </w:r>
           </w:p>
         </w:tc>
@@ -2126,21 +2118,7 @@
               <w:rPr>
                 <w:sz w:val="18"/>
               </w:rPr>
-              <w:t xml:space="preserve">Invalid </w:t>
-            </w:r>
-            <w:proofErr w:type="spellStart"/>
-            <w:r>
-              <w:rPr>
-                <w:sz w:val="18"/>
-              </w:rPr>
-              <w:t>TierID</w:t>
-            </w:r>
-            <w:proofErr w:type="spellEnd"/>
-            <w:r>
-              <w:rPr>
-                <w:sz w:val="18"/>
-              </w:rPr>
-              <w:t xml:space="preserve"> 'T00001' (extra zero; no such tier exists)</w:t>
+              <w:t>Invalid TierID 'T00001' (extra zero; no such tier exists)</w:t>
             </w:r>
           </w:p>
         </w:tc>
@@ -2194,35 +2172,7 @@
               <w:rPr>
                 <w:sz w:val="18"/>
               </w:rPr>
-              <w:t>Gender stored as 'Male'/'Female</w:t>
-            </w:r>
-            <w:proofErr w:type="gramStart"/>
-            <w:r>
-              <w:rPr>
-                <w:sz w:val="18"/>
-              </w:rPr>
-              <w:t>'</w:t>
-            </w:r>
-            <w:proofErr w:type="gramEnd"/>
-            <w:r>
-              <w:rPr>
-                <w:sz w:val="18"/>
-              </w:rPr>
-              <w:t xml:space="preserve"> but schema requires </w:t>
-            </w:r>
-            <w:proofErr w:type="gramStart"/>
-            <w:r>
-              <w:rPr>
-                <w:sz w:val="18"/>
-              </w:rPr>
-              <w:t>CHAR(</w:t>
-            </w:r>
-            <w:proofErr w:type="gramEnd"/>
-            <w:r>
-              <w:rPr>
-                <w:sz w:val="18"/>
-              </w:rPr>
-              <w:t>1)</w:t>
+              <w:t>Gender stored as 'Male'/'Female' but schema requires CHAR(1)</w:t>
             </w:r>
           </w:p>
         </w:tc>
@@ -2235,21 +2185,7 @@
               <w:rPr>
                 <w:sz w:val="18"/>
               </w:rPr>
-              <w:t>Mapped to 'M</w:t>
-            </w:r>
-            <w:proofErr w:type="gramStart"/>
-            <w:r>
-              <w:rPr>
-                <w:sz w:val="18"/>
-              </w:rPr>
-              <w:t>'/'</w:t>
-            </w:r>
-            <w:proofErr w:type="gramEnd"/>
-            <w:r>
-              <w:rPr>
-                <w:sz w:val="18"/>
-              </w:rPr>
-              <w:t>F'</w:t>
+              <w:t>Mapped to 'M'/'F'</w:t>
             </w:r>
           </w:p>
         </w:tc>
@@ -2286,19 +2222,11 @@
             <w:tcW w:w="2700" w:type="dxa"/>
           </w:tcPr>
           <w:p>
-            <w:proofErr w:type="spellStart"/>
             <w:r>
               <w:rPr>
                 <w:sz w:val="18"/>
               </w:rPr>
-              <w:t>DateOfBirth</w:t>
-            </w:r>
-            <w:proofErr w:type="spellEnd"/>
-            <w:r>
-              <w:rPr>
-                <w:sz w:val="18"/>
-              </w:rPr>
-              <w:t xml:space="preserve"> stored as datetime '1990-05-08 00:00:00' instead of a date</w:t>
+              <w:t>DateOfBirth stored as datetime '1990-05-08 00:00:00' instead of a date</w:t>
             </w:r>
           </w:p>
         </w:tc>
@@ -2352,21 +2280,7 @@
               <w:rPr>
                 <w:sz w:val="18"/>
               </w:rPr>
-              <w:t>Two contact fields (</w:t>
-            </w:r>
-            <w:proofErr w:type="spellStart"/>
-            <w:r>
-              <w:rPr>
-                <w:sz w:val="18"/>
-              </w:rPr>
-              <w:t>ContactNo</w:t>
-            </w:r>
-            <w:proofErr w:type="spellEnd"/>
-            <w:r>
-              <w:rPr>
-                <w:sz w:val="18"/>
-              </w:rPr>
-              <w:t>, Email) but Member table has a single Contact column</w:t>
+              <w:t>Two contact fields (ContactNo, Email) but Member table has a single Contact column</w:t>
             </w:r>
           </w:p>
         </w:tc>
@@ -2498,35 +2412,7 @@
               <w:rPr>
                 <w:sz w:val="18"/>
               </w:rPr>
-              <w:t>Gender stored as 'Male'/'Female</w:t>
-            </w:r>
-            <w:proofErr w:type="gramStart"/>
-            <w:r>
-              <w:rPr>
-                <w:sz w:val="18"/>
-              </w:rPr>
-              <w:t>'</w:t>
-            </w:r>
-            <w:proofErr w:type="gramEnd"/>
-            <w:r>
-              <w:rPr>
-                <w:sz w:val="18"/>
-              </w:rPr>
-              <w:t xml:space="preserve"> but schema requires </w:t>
-            </w:r>
-            <w:proofErr w:type="gramStart"/>
-            <w:r>
-              <w:rPr>
-                <w:sz w:val="18"/>
-              </w:rPr>
-              <w:t>CHAR(</w:t>
-            </w:r>
-            <w:proofErr w:type="gramEnd"/>
-            <w:r>
-              <w:rPr>
-                <w:sz w:val="18"/>
-              </w:rPr>
-              <w:t>1)</w:t>
+              <w:t>Gender stored as 'Male'/'Female' but schema requires CHAR(1)</w:t>
             </w:r>
           </w:p>
         </w:tc>
@@ -2539,21 +2425,7 @@
               <w:rPr>
                 <w:sz w:val="18"/>
               </w:rPr>
-              <w:t>Mapped to 'M</w:t>
-            </w:r>
-            <w:proofErr w:type="gramStart"/>
-            <w:r>
-              <w:rPr>
-                <w:sz w:val="18"/>
-              </w:rPr>
-              <w:t>'/'</w:t>
-            </w:r>
-            <w:proofErr w:type="gramEnd"/>
-            <w:r>
-              <w:rPr>
-                <w:sz w:val="18"/>
-              </w:rPr>
-              <w:t>F'</w:t>
+              <w:t>Mapped to 'M'/'F'</w:t>
             </w:r>
           </w:p>
         </w:tc>
@@ -2676,16 +2548,8 @@
               <w:rPr>
                 <w:sz w:val="18"/>
               </w:rPr>
-              <w:t xml:space="preserve">data.xlsx / </w:t>
+              <w:t>data.xlsx / BookCopies</w:t>
             </w:r>
-            <w:proofErr w:type="spellStart"/>
-            <w:r>
-              <w:rPr>
-                <w:sz w:val="18"/>
-              </w:rPr>
-              <w:t>BookCopies</w:t>
-            </w:r>
-            <w:proofErr w:type="spellEnd"/>
           </w:p>
         </w:tc>
         <w:tc>
@@ -2710,21 +2574,7 @@
               <w:rPr>
                 <w:sz w:val="18"/>
               </w:rPr>
-              <w:t>Status misspelled as '</w:t>
-            </w:r>
-            <w:proofErr w:type="spellStart"/>
-            <w:r>
-              <w:rPr>
-                <w:sz w:val="18"/>
-              </w:rPr>
-              <w:t>Availble</w:t>
-            </w:r>
-            <w:proofErr w:type="spellEnd"/>
-            <w:r>
-              <w:rPr>
-                <w:sz w:val="18"/>
-              </w:rPr>
-              <w:t>'</w:t>
+              <w:t>Status misspelled as 'Availble'</w:t>
             </w:r>
           </w:p>
         </w:tc>
@@ -2752,16 +2602,8 @@
               <w:rPr>
                 <w:sz w:val="18"/>
               </w:rPr>
-              <w:t xml:space="preserve">data.xlsx / </w:t>
+              <w:t>data.xlsx / BookCopies</w:t>
             </w:r>
-            <w:proofErr w:type="spellStart"/>
-            <w:r>
-              <w:rPr>
-                <w:sz w:val="18"/>
-              </w:rPr>
-              <w:t>BookCopies</w:t>
-            </w:r>
-            <w:proofErr w:type="spellEnd"/>
           </w:p>
         </w:tc>
         <w:tc>
@@ -2840,63 +2682,7 @@
               <w:rPr>
                 <w:sz w:val="18"/>
               </w:rPr>
-              <w:t xml:space="preserve">Row references </w:t>
-            </w:r>
-            <w:proofErr w:type="spellStart"/>
-            <w:r>
-              <w:rPr>
-                <w:sz w:val="18"/>
-              </w:rPr>
-              <w:t>StaffID</w:t>
-            </w:r>
-            <w:proofErr w:type="spellEnd"/>
-            <w:r>
-              <w:rPr>
-                <w:sz w:val="18"/>
-              </w:rPr>
-              <w:t xml:space="preserve"> 'S0101' (staff run S0001-S0051) and </w:t>
-            </w:r>
-            <w:proofErr w:type="spellStart"/>
-            <w:r>
-              <w:rPr>
-                <w:sz w:val="18"/>
-              </w:rPr>
-              <w:t>CopySeqNo</w:t>
-            </w:r>
-            <w:proofErr w:type="spellEnd"/>
-            <w:r>
-              <w:rPr>
-                <w:sz w:val="18"/>
-              </w:rPr>
-              <w:t xml:space="preserve"> 8 (book has 3 copies); </w:t>
-            </w:r>
-            <w:proofErr w:type="spellStart"/>
-            <w:r>
-              <w:rPr>
-                <w:sz w:val="18"/>
-              </w:rPr>
-              <w:t>DueDate</w:t>
-            </w:r>
-            <w:proofErr w:type="spellEnd"/>
-            <w:r>
-              <w:rPr>
-                <w:sz w:val="18"/>
-              </w:rPr>
-              <w:t xml:space="preserve"> 2023-04-02 precedes </w:t>
-            </w:r>
-            <w:proofErr w:type="spellStart"/>
-            <w:r>
-              <w:rPr>
-                <w:sz w:val="18"/>
-              </w:rPr>
-              <w:t>LoanDatetime</w:t>
-            </w:r>
-            <w:proofErr w:type="spellEnd"/>
-            <w:r>
-              <w:rPr>
-                <w:sz w:val="18"/>
-              </w:rPr>
-              <w:t xml:space="preserve"> 2024-07-04</w:t>
+              <w:t>Row references StaffID 'S0101' (staff run S0001-S0051) and CopySeqNo 8 (book has 3 copies); DueDate 2023-04-02 precedes LoanDatetime 2024-07-04</w:t>
             </w:r>
           </w:p>
         </w:tc>
@@ -2950,21 +2736,7 @@
               <w:rPr>
                 <w:sz w:val="18"/>
               </w:rPr>
-              <w:t xml:space="preserve">Missing </w:t>
-            </w:r>
-            <w:proofErr w:type="spellStart"/>
-            <w:r>
-              <w:rPr>
-                <w:sz w:val="18"/>
-              </w:rPr>
-              <w:t>LoanStatus</w:t>
-            </w:r>
-            <w:proofErr w:type="spellEnd"/>
-            <w:r>
-              <w:rPr>
-                <w:sz w:val="18"/>
-              </w:rPr>
-              <w:t xml:space="preserve"> (6 returned, 1 outstanding)</w:t>
+              <w:t>Missing LoanStatus (6 returned, 1 outstanding)</w:t>
             </w:r>
           </w:p>
         </w:tc>
@@ -2977,30 +2749,8 @@
               <w:rPr>
                 <w:sz w:val="18"/>
               </w:rPr>
-              <w:t xml:space="preserve">No correction needed for insertion: </w:t>
+              <w:t>No correction needed for insertion: LoanStatus is not a column in the Loan table; status is derivable from ReturnDatetime</w:t>
             </w:r>
-            <w:proofErr w:type="spellStart"/>
-            <w:r>
-              <w:rPr>
-                <w:sz w:val="18"/>
-              </w:rPr>
-              <w:t>LoanStatus</w:t>
-            </w:r>
-            <w:proofErr w:type="spellEnd"/>
-            <w:r>
-              <w:rPr>
-                <w:sz w:val="18"/>
-              </w:rPr>
-              <w:t xml:space="preserve"> is not a column in the Loan table; status is derivable from </w:t>
-            </w:r>
-            <w:proofErr w:type="spellStart"/>
-            <w:r>
-              <w:rPr>
-                <w:sz w:val="18"/>
-              </w:rPr>
-              <w:t>ReturnDatetime</w:t>
-            </w:r>
-            <w:proofErr w:type="spellEnd"/>
           </w:p>
         </w:tc>
       </w:tr>
@@ -3015,15 +2765,7 @@
         <w:pStyle w:val="ListParagraph"/>
       </w:pPr>
       <w:r>
-        <w:t xml:space="preserve">Submit your SQL INSERT statements for data insertion to the OLTP tables in </w:t>
-      </w:r>
-      <w:proofErr w:type="spellStart"/>
-      <w:r>
-        <w:t>OLTP_insert.sql</w:t>
-      </w:r>
-      <w:proofErr w:type="spellEnd"/>
-      <w:r>
-        <w:t>. If you apply bulk loading, submit each of the cleaned data files used during insertion as well.</w:t>
+        <w:t>Submit your SQL INSERT statements for data insertion to the OLTP tables in OLTP_insert.sql. If you apply bulk loading, submit each of the cleaned data files used during insertion as well.</w:t>
       </w:r>
     </w:p>
     <w:p>
@@ -3115,16 +2857,14 @@
         <w:t>Design your DW using star or snowflake schema. Paste your ERD that illustrates your design in the box below, with a short explanation of key design focus and considerations.</w:t>
       </w:r>
     </w:p>
-    <w:p>
-      <w:r>
-        <w:rPr>
-          <w:noProof/>
-        </w:rPr>
+    <w:p/>
+    <w:p>
+      <w:r>
         <w:drawing>
-          <wp:inline distT="0" distB="0" distL="0" distR="0" wp14:anchorId="41FA5CCD" wp14:editId="3CC6EC54">
-            <wp:extent cx="5943600" cy="4157628"/>
-            <wp:effectExtent l="0" t="0" r="0" b="0"/>
-            <wp:docPr id="1960066386" name="Picture 1960066386"/>
+          <wp:inline distT="0" distB="0" distL="0" distR="0" wp14:anchorId="49AEF5C3" wp14:editId="70D661C0">
+            <wp:extent cx="6190615" cy="5367020"/>
+            <wp:effectExtent l="0" t="0" r="635" b="5080"/>
+            <wp:docPr id="37492876" name="Picture 1"/>
             <wp:cNvGraphicFramePr>
               <a:graphicFrameLocks xmlns:a="http://schemas.openxmlformats.org/drawingml/2006/main" noChangeAspect="1"/>
             </wp:cNvGraphicFramePr>
@@ -3132,7 +2872,7 @@
               <a:graphicData uri="http://schemas.openxmlformats.org/drawingml/2006/picture">
                 <pic:pic xmlns:pic="http://schemas.openxmlformats.org/drawingml/2006/picture">
                   <pic:nvPicPr>
-                    <pic:cNvPr id="0" name="dw_erd.png"/>
+                    <pic:cNvPr id="37492876" name=""/>
                     <pic:cNvPicPr/>
                   </pic:nvPicPr>
                   <pic:blipFill>
@@ -3144,7 +2884,7 @@
                   <pic:spPr>
                     <a:xfrm>
                       <a:off x="0" y="0"/>
-                      <a:ext cx="5943600" cy="4157628"/>
+                      <a:ext cx="6190615" cy="5367020"/>
                     </a:xfrm>
                     <a:prstGeom prst="rect">
                       <a:avLst/>
@@ -3174,327 +2914,81 @@
         <w:rPr>
           <w:lang w:val="en-SG"/>
         </w:rPr>
-        <w:t xml:space="preserve">We used a Star Schema with one fact table, called </w:t>
-      </w:r>
-      <w:proofErr w:type="spellStart"/>
-      <w:r>
-        <w:rPr>
-          <w:lang w:val="en-SG"/>
-        </w:rPr>
-        <w:t>FactLoan</w:t>
-      </w:r>
-      <w:proofErr w:type="spellEnd"/>
-      <w:r>
-        <w:rPr>
-          <w:lang w:val="en-SG"/>
-        </w:rPr>
-        <w:t xml:space="preserve">. The grain of this table is one completed loan transaction, meaning one book that has been borrowed and returned. </w:t>
-      </w:r>
-      <w:proofErr w:type="spellStart"/>
-      <w:r>
-        <w:rPr>
-          <w:lang w:val="en-SG"/>
-        </w:rPr>
-        <w:t>FactLoan</w:t>
-      </w:r>
-      <w:proofErr w:type="spellEnd"/>
-      <w:r>
-        <w:rPr>
-          <w:lang w:val="en-SG"/>
-        </w:rPr>
-        <w:t xml:space="preserve"> is connected to four-dimension tables: </w:t>
-      </w:r>
-      <w:proofErr w:type="spellStart"/>
-      <w:r>
-        <w:rPr>
-          <w:lang w:val="en-SG"/>
-        </w:rPr>
-        <w:t>DimMember</w:t>
-      </w:r>
-      <w:proofErr w:type="spellEnd"/>
-      <w:r>
-        <w:rPr>
-          <w:lang w:val="en-SG"/>
-        </w:rPr>
-        <w:t xml:space="preserve">, </w:t>
-      </w:r>
-      <w:proofErr w:type="spellStart"/>
-      <w:r>
-        <w:rPr>
-          <w:lang w:val="en-SG"/>
-        </w:rPr>
-        <w:t>DimStaff</w:t>
-      </w:r>
-      <w:proofErr w:type="spellEnd"/>
-      <w:r>
-        <w:rPr>
-          <w:lang w:val="en-SG"/>
-        </w:rPr>
-        <w:t xml:space="preserve">, </w:t>
-      </w:r>
-      <w:proofErr w:type="spellStart"/>
-      <w:r>
-        <w:rPr>
-          <w:lang w:val="en-SG"/>
-        </w:rPr>
-        <w:t>DimBook</w:t>
-      </w:r>
-      <w:proofErr w:type="spellEnd"/>
-      <w:r>
-        <w:rPr>
-          <w:lang w:val="en-SG"/>
-        </w:rPr>
-        <w:t xml:space="preserve"> and </w:t>
-      </w:r>
-      <w:proofErr w:type="spellStart"/>
-      <w:r>
-        <w:rPr>
-          <w:lang w:val="en-SG"/>
-        </w:rPr>
-        <w:t>DimDate</w:t>
-      </w:r>
-      <w:proofErr w:type="spellEnd"/>
-      <w:r>
-        <w:rPr>
-          <w:lang w:val="en-SG"/>
-        </w:rPr>
-        <w:t>.</w:t>
-      </w:r>
-    </w:p>
-    <w:p>
-      <w:pPr>
-        <w:rPr>
-          <w:lang w:val="en-SG"/>
-        </w:rPr>
-      </w:pPr>
-    </w:p>
-    <w:p>
-      <w:pPr>
-        <w:rPr>
-          <w:lang w:val="en-SG"/>
-        </w:rPr>
-      </w:pPr>
-      <w:r>
-        <w:rPr>
-          <w:lang w:val="en-SG"/>
-        </w:rPr>
-        <w:t xml:space="preserve">All tables use an AUTO_INCREMENT surrogate key, including the fact table and date dimension. The membership tier details, such as </w:t>
-      </w:r>
-      <w:proofErr w:type="spellStart"/>
-      <w:r>
-        <w:rPr>
-          <w:lang w:val="en-SG"/>
-        </w:rPr>
-        <w:t>TierName</w:t>
-      </w:r>
-      <w:proofErr w:type="spellEnd"/>
-      <w:r>
-        <w:rPr>
-          <w:lang w:val="en-SG"/>
-        </w:rPr>
-        <w:t xml:space="preserve">, </w:t>
-      </w:r>
-      <w:proofErr w:type="spellStart"/>
-      <w:r>
-        <w:rPr>
-          <w:lang w:val="en-SG"/>
-        </w:rPr>
-        <w:t>TierLevel</w:t>
-      </w:r>
-      <w:proofErr w:type="spellEnd"/>
-      <w:r>
-        <w:rPr>
-          <w:lang w:val="en-SG"/>
-        </w:rPr>
-        <w:t xml:space="preserve"> and </w:t>
-      </w:r>
-      <w:proofErr w:type="spellStart"/>
-      <w:r>
-        <w:rPr>
-          <w:lang w:val="en-SG"/>
-        </w:rPr>
-        <w:t>BorrowLimit</w:t>
-      </w:r>
-      <w:proofErr w:type="spellEnd"/>
-      <w:r>
-        <w:rPr>
-          <w:lang w:val="en-SG"/>
-        </w:rPr>
-        <w:t xml:space="preserve">, are included directly in </w:t>
-      </w:r>
-      <w:proofErr w:type="spellStart"/>
-      <w:r>
-        <w:rPr>
-          <w:lang w:val="en-SG"/>
-        </w:rPr>
-        <w:t>DimMember</w:t>
-      </w:r>
-      <w:proofErr w:type="spellEnd"/>
-      <w:r>
-        <w:rPr>
-          <w:lang w:val="en-SG"/>
-        </w:rPr>
-        <w:t xml:space="preserve">. The minimum membership tier required to borrow a book is also included in </w:t>
-      </w:r>
-      <w:proofErr w:type="spellStart"/>
-      <w:r>
-        <w:rPr>
-          <w:lang w:val="en-SG"/>
-        </w:rPr>
-        <w:t>DimBook</w:t>
-      </w:r>
-      <w:proofErr w:type="spellEnd"/>
-      <w:r>
-        <w:rPr>
-          <w:lang w:val="en-SG"/>
-        </w:rPr>
-        <w:t>. This avoids the need for a snowflake schema and keeps the database structure simpler by reducing the number of joins needed.</w:t>
-      </w:r>
-    </w:p>
-    <w:p>
-      <w:pPr>
-        <w:rPr>
-          <w:lang w:val="en-SG"/>
-        </w:rPr>
-      </w:pPr>
-    </w:p>
-    <w:p>
-      <w:pPr>
-        <w:rPr>
-          <w:lang w:val="en-SG"/>
-        </w:rPr>
-      </w:pPr>
-      <w:proofErr w:type="spellStart"/>
-      <w:r>
-        <w:rPr>
-          <w:lang w:val="en-SG"/>
-        </w:rPr>
-        <w:t>DimDate</w:t>
-      </w:r>
-      <w:proofErr w:type="spellEnd"/>
-      <w:r>
-        <w:rPr>
-          <w:lang w:val="en-SG"/>
-        </w:rPr>
-        <w:t xml:space="preserve"> is stored at day-level granularity, as required in the assignment. It contains attributes such as the full date, day of the week, weekend indicator, month, quarter and year. </w:t>
-      </w:r>
-      <w:proofErr w:type="spellStart"/>
-      <w:r>
-        <w:rPr>
-          <w:lang w:val="en-SG"/>
-        </w:rPr>
-        <w:t>FactLoan</w:t>
-      </w:r>
-      <w:proofErr w:type="spellEnd"/>
-      <w:r>
-        <w:rPr>
-          <w:lang w:val="en-SG"/>
-        </w:rPr>
-        <w:t xml:space="preserve"> uses </w:t>
-      </w:r>
-      <w:proofErr w:type="spellStart"/>
-      <w:r>
-        <w:rPr>
-          <w:lang w:val="en-SG"/>
-        </w:rPr>
-        <w:t>DimDate</w:t>
-      </w:r>
-      <w:proofErr w:type="spellEnd"/>
-      <w:r>
-        <w:rPr>
-          <w:lang w:val="en-SG"/>
-        </w:rPr>
-        <w:t xml:space="preserve"> twice: once for the borrow date and once for the return date.</w:t>
-      </w:r>
-    </w:p>
-    <w:p>
-      <w:pPr>
-        <w:rPr>
-          <w:lang w:val="en-SG"/>
-        </w:rPr>
-      </w:pPr>
-      <w:proofErr w:type="spellStart"/>
-      <w:r>
-        <w:rPr>
-          <w:lang w:val="en-SG"/>
-        </w:rPr>
-        <w:t>CopySeqNo</w:t>
-      </w:r>
-      <w:proofErr w:type="spellEnd"/>
-      <w:r>
-        <w:rPr>
-          <w:lang w:val="en-SG"/>
-        </w:rPr>
-        <w:t xml:space="preserve"> is stored in the fact table as a degenerate dimension. This allows each loan transaction to be traced back to the specific physical copy of the book without creating another dimension table.</w:t>
-      </w:r>
-    </w:p>
-    <w:p>
-      <w:pPr>
-        <w:rPr>
-          <w:lang w:val="en-SG"/>
-        </w:rPr>
-      </w:pPr>
-    </w:p>
-    <w:p>
-      <w:pPr>
-        <w:rPr>
-          <w:lang w:val="en-SG"/>
-        </w:rPr>
-      </w:pPr>
-      <w:r>
-        <w:rPr>
-          <w:lang w:val="en-SG"/>
-        </w:rPr>
-        <w:t xml:space="preserve">Several values are calculated before being loaded into the fact table. </w:t>
-      </w:r>
-      <w:proofErr w:type="spellStart"/>
-      <w:r>
-        <w:rPr>
-          <w:lang w:val="en-SG"/>
-        </w:rPr>
-        <w:t>LoanDurationDays</w:t>
-      </w:r>
-      <w:proofErr w:type="spellEnd"/>
-      <w:r>
-        <w:rPr>
-          <w:lang w:val="en-SG"/>
-        </w:rPr>
-        <w:t xml:space="preserve"> shows the number of days between the borrow and return dates. </w:t>
-      </w:r>
-      <w:proofErr w:type="spellStart"/>
-      <w:r>
-        <w:rPr>
-          <w:lang w:val="en-SG"/>
-        </w:rPr>
-        <w:t>DaysBeforeDue</w:t>
-      </w:r>
-      <w:proofErr w:type="spellEnd"/>
-      <w:r>
-        <w:rPr>
-          <w:lang w:val="en-SG"/>
-        </w:rPr>
-        <w:t xml:space="preserve"> is calculated by subtracting </w:t>
-      </w:r>
+        <w:t>We used a Star Schema with one fact table, called FactLoan. The grain of this table is one completed loan transaction, meaning one book that has been borrowed and returned. FactLoan is connected to four-dimension tables: DimMember, DimStaff, DimBook and DimDate.</w:t>
+      </w:r>
+    </w:p>
+    <w:p>
+      <w:pPr>
+        <w:rPr>
+          <w:lang w:val="en-SG"/>
+        </w:rPr>
+      </w:pPr>
+    </w:p>
+    <w:p>
+      <w:pPr>
+        <w:rPr>
+          <w:lang w:val="en-SG"/>
+        </w:rPr>
+      </w:pPr>
+      <w:r>
+        <w:rPr>
+          <w:lang w:val="en-SG"/>
+        </w:rPr>
+        <w:t>All tables use an AUTO_INCREMENT surrogate key, including the fact table and date dimension. The membership tier details, such as TierName, TierLevel and BorrowLimit, are included directly in DimMember. The minimum membership tier required to borrow a book is also included in DimBook. This avoids the need for a snowflake schema and keeps the database structure simpler by reducing the number of joins needed.</w:t>
+      </w:r>
+    </w:p>
+    <w:p>
+      <w:pPr>
+        <w:rPr>
+          <w:lang w:val="en-SG"/>
+        </w:rPr>
+      </w:pPr>
+    </w:p>
+    <w:p>
+      <w:pPr>
+        <w:rPr>
+          <w:lang w:val="en-SG"/>
+        </w:rPr>
+      </w:pPr>
       <w:r>
         <w:rPr>
           <w:lang w:val="en-SG"/>
         </w:rPr>
         <w:lastRenderedPageBreak/>
-        <w:t xml:space="preserve">the return date from the due date, where a negative value means that the book was returned late. An </w:t>
-      </w:r>
-      <w:proofErr w:type="spellStart"/>
-      <w:r>
-        <w:rPr>
-          <w:lang w:val="en-SG"/>
-        </w:rPr>
-        <w:t>IsLate</w:t>
-      </w:r>
-      <w:proofErr w:type="spellEnd"/>
-      <w:r>
-        <w:rPr>
-          <w:lang w:val="en-SG"/>
-        </w:rPr>
-        <w:t xml:space="preserve"> flag is also included to clearly show whether a loan was overdue. These pre-calculated values make common analysis easier because date calculations do not need to be repeated in every query.</w:t>
+        <w:t>DimDate is stored at day-level granularity, as required in the assignment. It contains attributes such as the full date, day of the week, weekend indicator, month, quarter and year. FactLoan uses DimDate twice: once for the borrow date and once for the return date.</w:t>
+      </w:r>
+    </w:p>
+    <w:p>
+      <w:pPr>
+        <w:rPr>
+          <w:lang w:val="en-SG"/>
+        </w:rPr>
+      </w:pPr>
+      <w:r>
+        <w:rPr>
+          <w:lang w:val="en-SG"/>
+        </w:rPr>
+        <w:t>CopySeqNo is stored in the fact table as a degenerate dimension. This allows each loan transaction to be traced back to the specific physical copy of the book without creating another dimension table.</w:t>
+      </w:r>
+    </w:p>
+    <w:p>
+      <w:pPr>
+        <w:rPr>
+          <w:lang w:val="en-SG"/>
+        </w:rPr>
+      </w:pPr>
+    </w:p>
+    <w:p>
+      <w:pPr>
+        <w:rPr>
+          <w:lang w:val="en-SG"/>
+        </w:rPr>
+      </w:pPr>
+      <w:r>
+        <w:rPr>
+          <w:lang w:val="en-SG"/>
+        </w:rPr>
+        <w:t>Several values are calculated before being loaded into the fact table. LoanDurationDays shows the number of days between the borrow and return dates. DaysBeforeDue is calculated by subtracting the return date from the due date, where a negative value means that the book was returned late. An IsLate flag is also included to clearly show whether a loan was overdue. These pre-calculated values make common analysis easier because date calculations do not need to be repeated in every query.</w:t>
       </w:r>
       <w:r>
         <w:rPr>
@@ -3513,35 +3007,7 @@
         <w:rPr>
           <w:lang w:val="en-SG"/>
         </w:rPr>
-        <w:t xml:space="preserve">We assumed that only completed loans would be loaded into </w:t>
-      </w:r>
-      <w:proofErr w:type="spellStart"/>
-      <w:r>
-        <w:rPr>
-          <w:lang w:val="en-SG"/>
-        </w:rPr>
-        <w:t>FactLoan</w:t>
-      </w:r>
-      <w:proofErr w:type="spellEnd"/>
-      <w:r>
-        <w:rPr>
-          <w:lang w:val="en-SG"/>
-        </w:rPr>
-        <w:t xml:space="preserve">. Therefore, the single loan that is still open is excluded. Slowly changing dimensions are also outside the scope of this assignment. However, if changes to a member’s membership tier needed to be tracked in the future, </w:t>
-      </w:r>
-      <w:proofErr w:type="spellStart"/>
-      <w:r>
-        <w:rPr>
-          <w:lang w:val="en-SG"/>
-        </w:rPr>
-        <w:t>DimMember</w:t>
-      </w:r>
-      <w:proofErr w:type="spellEnd"/>
-      <w:r>
-        <w:rPr>
-          <w:lang w:val="en-SG"/>
-        </w:rPr>
-        <w:t xml:space="preserve"> could be changed into a Slowly Changing Dimension Type 2 by adding effective-date and expiry-date columns.</w:t>
+        <w:t>We assumed that only completed loans would be loaded into FactLoan. Therefore, the single loan that is still open is excluded. Slowly changing dimensions are also outside the scope of this assignment. However, if changes to a member’s membership tier needed to be tracked in the future, DimMember could be changed into a Slowly Changing Dimension Type 2 by adding effective-date and expiry-date columns.</w:t>
       </w:r>
     </w:p>
     <w:p>
@@ -3559,45 +3025,13 @@
       </w:pPr>
       <w:r>
         <w:lastRenderedPageBreak/>
-        <w:t xml:space="preserve">Submit your </w:t>
-      </w:r>
-      <w:proofErr w:type="gramStart"/>
-      <w:r>
-        <w:t>CREATE table</w:t>
-      </w:r>
-      <w:proofErr w:type="gramEnd"/>
-      <w:r>
-        <w:t xml:space="preserve"> statements for DW table creations in </w:t>
-      </w:r>
-      <w:proofErr w:type="spellStart"/>
-      <w:r>
-        <w:t>DW_create.sql</w:t>
-      </w:r>
-      <w:proofErr w:type="spellEnd"/>
-      <w:r>
-        <w:t xml:space="preserve">. Use appropriate SQL statements to extract and load data from OLTP tables to </w:t>
-      </w:r>
-      <w:proofErr w:type="gramStart"/>
-      <w:r>
-        <w:t xml:space="preserve">the </w:t>
-      </w:r>
-      <w:r>
-        <w:t>DW</w:t>
-      </w:r>
-      <w:proofErr w:type="gramEnd"/>
-      <w:r>
-        <w:t xml:space="preserve"> and</w:t>
-      </w:r>
-      <w:r>
-        <w:t xml:space="preserve"> submit all your queries in </w:t>
-      </w:r>
-      <w:proofErr w:type="spellStart"/>
-      <w:r>
-        <w:t>DW_insert.sql</w:t>
-      </w:r>
-      <w:proofErr w:type="spellEnd"/>
-      <w:r>
-        <w:t>.</w:t>
+        <w:t xml:space="preserve">Submit your CREATE table statements for DW table creations in DW_create.sql. Use appropriate SQL statements to extract and load data from OLTP tables to the </w:t>
+      </w:r>
+      <w:r>
+        <w:t>DW and</w:t>
+      </w:r>
+      <w:r>
+        <w:t xml:space="preserve"> submit all your queries in DW_insert.sql.</w:t>
       </w:r>
     </w:p>
     <w:bookmarkEnd w:id="1"/>
@@ -3684,21 +3118,7 @@
         <w:rPr>
           <w:lang w:val="en-SG"/>
         </w:rPr>
-        <w:t xml:space="preserve">CREATE TABLE </w:t>
-      </w:r>
-      <w:proofErr w:type="spellStart"/>
-      <w:r>
-        <w:rPr>
-          <w:lang w:val="en-SG"/>
-        </w:rPr>
-        <w:t>DimDate</w:t>
-      </w:r>
-      <w:proofErr w:type="spellEnd"/>
-      <w:r>
-        <w:rPr>
-          <w:lang w:val="en-SG"/>
-        </w:rPr>
-        <w:t xml:space="preserve"> (</w:t>
+        <w:t>CREATE TABLE DimDate (</w:t>
       </w:r>
     </w:p>
     <w:p>
@@ -3712,35 +3132,7 @@
         <w:rPr>
           <w:lang w:val="en-SG"/>
         </w:rPr>
-        <w:t xml:space="preserve">    </w:t>
-      </w:r>
-      <w:proofErr w:type="spellStart"/>
-      <w:r>
-        <w:rPr>
-          <w:lang w:val="en-SG"/>
-        </w:rPr>
-        <w:t>DateKey</w:t>
-      </w:r>
-      <w:proofErr w:type="spellEnd"/>
-      <w:r>
-        <w:rPr>
-          <w:lang w:val="en-SG"/>
-        </w:rPr>
-        <w:t xml:space="preserve"> INT AUTO_INCREMENT PRIMARY </w:t>
-      </w:r>
-      <w:proofErr w:type="gramStart"/>
-      <w:r>
-        <w:rPr>
-          <w:lang w:val="en-SG"/>
-        </w:rPr>
-        <w:t xml:space="preserve">KEY,   </w:t>
-      </w:r>
-      <w:proofErr w:type="gramEnd"/>
-      <w:r>
-        <w:rPr>
-          <w:lang w:val="en-SG"/>
-        </w:rPr>
-        <w:t>-- surrogate key</w:t>
+        <w:t>    DateKey INT AUTO_INCREMENT PRIMARY KEY,   -- surrogate key</w:t>
       </w:r>
     </w:p>
     <w:p>
@@ -3754,21 +3146,7 @@
         <w:rPr>
           <w:lang w:val="en-SG"/>
         </w:rPr>
-        <w:t xml:space="preserve">    </w:t>
-      </w:r>
-      <w:proofErr w:type="spellStart"/>
-      <w:r>
-        <w:rPr>
-          <w:lang w:val="en-SG"/>
-        </w:rPr>
-        <w:t>FullDate</w:t>
-      </w:r>
-      <w:proofErr w:type="spellEnd"/>
-      <w:r>
-        <w:rPr>
-          <w:lang w:val="en-SG"/>
-        </w:rPr>
-        <w:t xml:space="preserve"> DATE NOT NULL UNIQUE,</w:t>
+        <w:t>    FullDate DATE NOT NULL UNIQUE,</w:t>
       </w:r>
     </w:p>
     <w:p>
@@ -3796,35 +3174,7 @@
         <w:rPr>
           <w:lang w:val="en-SG"/>
         </w:rPr>
-        <w:t xml:space="preserve">    </w:t>
-      </w:r>
-      <w:proofErr w:type="spellStart"/>
-      <w:r>
-        <w:rPr>
-          <w:lang w:val="en-SG"/>
-        </w:rPr>
-        <w:t>DayOfWeek</w:t>
-      </w:r>
-      <w:proofErr w:type="spellEnd"/>
-      <w:r>
-        <w:rPr>
-          <w:lang w:val="en-SG"/>
-        </w:rPr>
-        <w:t xml:space="preserve"> </w:t>
-      </w:r>
-      <w:proofErr w:type="gramStart"/>
-      <w:r>
-        <w:rPr>
-          <w:lang w:val="en-SG"/>
-        </w:rPr>
-        <w:t>VARCHAR(</w:t>
-      </w:r>
-      <w:proofErr w:type="gramEnd"/>
-      <w:r>
-        <w:rPr>
-          <w:lang w:val="en-SG"/>
-        </w:rPr>
-        <w:t>10) NOT NULL,</w:t>
+        <w:t>    DayOfWeek VARCHAR(10) NOT NULL,</w:t>
       </w:r>
     </w:p>
     <w:p>
@@ -3838,21 +3188,7 @@
         <w:rPr>
           <w:lang w:val="en-SG"/>
         </w:rPr>
-        <w:t xml:space="preserve">    </w:t>
-      </w:r>
-      <w:proofErr w:type="spellStart"/>
-      <w:r>
-        <w:rPr>
-          <w:lang w:val="en-SG"/>
-        </w:rPr>
-        <w:t>IsWeekend</w:t>
-      </w:r>
-      <w:proofErr w:type="spellEnd"/>
-      <w:r>
-        <w:rPr>
-          <w:lang w:val="en-SG"/>
-        </w:rPr>
-        <w:t xml:space="preserve"> BOOLEAN NOT NULL,</w:t>
+        <w:t>    IsWeekend BOOLEAN NOT NULL,</w:t>
       </w:r>
     </w:p>
     <w:p>
@@ -3880,35 +3216,7 @@
         <w:rPr>
           <w:lang w:val="en-SG"/>
         </w:rPr>
-        <w:t xml:space="preserve">    </w:t>
-      </w:r>
-      <w:proofErr w:type="spellStart"/>
-      <w:r>
-        <w:rPr>
-          <w:lang w:val="en-SG"/>
-        </w:rPr>
-        <w:t>MonthName</w:t>
-      </w:r>
-      <w:proofErr w:type="spellEnd"/>
-      <w:r>
-        <w:rPr>
-          <w:lang w:val="en-SG"/>
-        </w:rPr>
-        <w:t xml:space="preserve"> </w:t>
-      </w:r>
-      <w:proofErr w:type="gramStart"/>
-      <w:r>
-        <w:rPr>
-          <w:lang w:val="en-SG"/>
-        </w:rPr>
-        <w:t>VARCHAR(</w:t>
-      </w:r>
-      <w:proofErr w:type="gramEnd"/>
-      <w:r>
-        <w:rPr>
-          <w:lang w:val="en-SG"/>
-        </w:rPr>
-        <w:t>10) NOT NULL,</w:t>
+        <w:t>    MonthName VARCHAR(10) NOT NULL,</w:t>
       </w:r>
     </w:p>
     <w:p>
@@ -3972,21 +3280,7 @@
         <w:rPr>
           <w:lang w:val="en-SG"/>
         </w:rPr>
-        <w:t xml:space="preserve">CREATE TABLE </w:t>
-      </w:r>
-      <w:proofErr w:type="spellStart"/>
-      <w:r>
-        <w:rPr>
-          <w:lang w:val="en-SG"/>
-        </w:rPr>
-        <w:t>DimMember</w:t>
-      </w:r>
-      <w:proofErr w:type="spellEnd"/>
-      <w:r>
-        <w:rPr>
-          <w:lang w:val="en-SG"/>
-        </w:rPr>
-        <w:t xml:space="preserve"> (</w:t>
+        <w:t>CREATE TABLE DimMember (</w:t>
       </w:r>
     </w:p>
     <w:p>
@@ -4000,21 +3294,7 @@
         <w:rPr>
           <w:lang w:val="en-SG"/>
         </w:rPr>
-        <w:t xml:space="preserve">    </w:t>
-      </w:r>
-      <w:proofErr w:type="spellStart"/>
-      <w:r>
-        <w:rPr>
-          <w:lang w:val="en-SG"/>
-        </w:rPr>
-        <w:t>MemberKey</w:t>
-      </w:r>
-      <w:proofErr w:type="spellEnd"/>
-      <w:r>
-        <w:rPr>
-          <w:lang w:val="en-SG"/>
-        </w:rPr>
-        <w:t xml:space="preserve"> INT AUTO_INCREMENT PRIMARY KEY, -- surrogate key</w:t>
+        <w:t>    MemberKey INT AUTO_INCREMENT PRIMARY KEY, -- surrogate key</w:t>
       </w:r>
     </w:p>
     <w:p>
@@ -4028,49 +3308,7 @@
         <w:rPr>
           <w:lang w:val="en-SG"/>
         </w:rPr>
-        <w:t xml:space="preserve">    </w:t>
-      </w:r>
-      <w:proofErr w:type="spellStart"/>
-      <w:r>
-        <w:rPr>
-          <w:lang w:val="en-SG"/>
-        </w:rPr>
-        <w:t>MemberID</w:t>
-      </w:r>
-      <w:proofErr w:type="spellEnd"/>
-      <w:r>
-        <w:rPr>
-          <w:lang w:val="en-SG"/>
-        </w:rPr>
-        <w:t xml:space="preserve"> </w:t>
-      </w:r>
-      <w:proofErr w:type="gramStart"/>
-      <w:r>
-        <w:rPr>
-          <w:lang w:val="en-SG"/>
-        </w:rPr>
-        <w:t>CHAR(</w:t>
-      </w:r>
-      <w:proofErr w:type="gramEnd"/>
-      <w:r>
-        <w:rPr>
-          <w:lang w:val="en-SG"/>
-        </w:rPr>
-        <w:t xml:space="preserve">10) NOT </w:t>
-      </w:r>
-      <w:proofErr w:type="gramStart"/>
-      <w:r>
-        <w:rPr>
-          <w:lang w:val="en-SG"/>
-        </w:rPr>
-        <w:t xml:space="preserve">NULL,   </w:t>
-      </w:r>
-      <w:proofErr w:type="gramEnd"/>
-      <w:r>
-        <w:rPr>
-          <w:lang w:val="en-SG"/>
-        </w:rPr>
-        <w:t>            -- natural key</w:t>
+        <w:t>    MemberID CHAR(10) NOT NULL,               -- natural key</w:t>
       </w:r>
     </w:p>
     <w:p>
@@ -4084,21 +3322,7 @@
         <w:rPr>
           <w:lang w:val="en-SG"/>
         </w:rPr>
-        <w:t xml:space="preserve">    Name </w:t>
-      </w:r>
-      <w:proofErr w:type="gramStart"/>
-      <w:r>
-        <w:rPr>
-          <w:lang w:val="en-SG"/>
-        </w:rPr>
-        <w:t>VARCHAR(</w:t>
-      </w:r>
-      <w:proofErr w:type="gramEnd"/>
-      <w:r>
-        <w:rPr>
-          <w:lang w:val="en-SG"/>
-        </w:rPr>
-        <w:t>100) NOT NULL,</w:t>
+        <w:t>    Name VARCHAR(100) NOT NULL,</w:t>
       </w:r>
     </w:p>
     <w:p>
@@ -4112,21 +3336,7 @@
         <w:rPr>
           <w:lang w:val="en-SG"/>
         </w:rPr>
-        <w:t xml:space="preserve">    Gender </w:t>
-      </w:r>
-      <w:proofErr w:type="gramStart"/>
-      <w:r>
-        <w:rPr>
-          <w:lang w:val="en-SG"/>
-        </w:rPr>
-        <w:t>CHAR(</w:t>
-      </w:r>
-      <w:proofErr w:type="gramEnd"/>
-      <w:r>
-        <w:rPr>
-          <w:lang w:val="en-SG"/>
-        </w:rPr>
-        <w:t>1) NOT NULL,</w:t>
+        <w:t>    Gender CHAR(1) NOT NULL,</w:t>
       </w:r>
     </w:p>
     <w:p>
@@ -4140,21 +3350,7 @@
         <w:rPr>
           <w:lang w:val="en-SG"/>
         </w:rPr>
-        <w:t xml:space="preserve">    Occupation </w:t>
-      </w:r>
-      <w:proofErr w:type="gramStart"/>
-      <w:r>
-        <w:rPr>
-          <w:lang w:val="en-SG"/>
-        </w:rPr>
-        <w:t>VARCHAR(</w:t>
-      </w:r>
-      <w:proofErr w:type="gramEnd"/>
-      <w:r>
-        <w:rPr>
-          <w:lang w:val="en-SG"/>
-        </w:rPr>
-        <w:t>50) NULL,</w:t>
+        <w:t>    Occupation VARCHAR(50) NULL,</w:t>
       </w:r>
     </w:p>
     <w:p>
@@ -4168,21 +3364,7 @@
         <w:rPr>
           <w:lang w:val="en-SG"/>
         </w:rPr>
-        <w:t xml:space="preserve">    </w:t>
-      </w:r>
-      <w:proofErr w:type="spellStart"/>
-      <w:r>
-        <w:rPr>
-          <w:lang w:val="en-SG"/>
-        </w:rPr>
-        <w:t>RegistrationDate</w:t>
-      </w:r>
-      <w:proofErr w:type="spellEnd"/>
-      <w:r>
-        <w:rPr>
-          <w:lang w:val="en-SG"/>
-        </w:rPr>
-        <w:t xml:space="preserve"> DATE NOT NULL,</w:t>
+        <w:t>    RegistrationDate DATE NOT NULL,</w:t>
       </w:r>
     </w:p>
     <w:p>
@@ -4196,63 +3378,7 @@
         <w:rPr>
           <w:lang w:val="en-SG"/>
         </w:rPr>
-        <w:t xml:space="preserve">    </w:t>
-      </w:r>
-      <w:proofErr w:type="spellStart"/>
-      <w:r>
-        <w:rPr>
-          <w:lang w:val="en-SG"/>
-        </w:rPr>
-        <w:t>TierName</w:t>
-      </w:r>
-      <w:proofErr w:type="spellEnd"/>
-      <w:r>
-        <w:rPr>
-          <w:lang w:val="en-SG"/>
-        </w:rPr>
-        <w:t xml:space="preserve"> </w:t>
-      </w:r>
-      <w:proofErr w:type="gramStart"/>
-      <w:r>
-        <w:rPr>
-          <w:lang w:val="en-SG"/>
-        </w:rPr>
-        <w:t>VARCHAR(</w:t>
-      </w:r>
-      <w:proofErr w:type="gramEnd"/>
-      <w:r>
-        <w:rPr>
-          <w:lang w:val="en-SG"/>
-        </w:rPr>
-        <w:t xml:space="preserve">20) NOT </w:t>
-      </w:r>
-      <w:proofErr w:type="gramStart"/>
-      <w:r>
-        <w:rPr>
-          <w:lang w:val="en-SG"/>
-        </w:rPr>
-        <w:t xml:space="preserve">NULL,   </w:t>
-      </w:r>
-      <w:proofErr w:type="gramEnd"/>
-      <w:r>
-        <w:rPr>
-          <w:lang w:val="en-SG"/>
-        </w:rPr>
-        <w:t xml:space="preserve">         -- </w:t>
-      </w:r>
-      <w:proofErr w:type="spellStart"/>
-      <w:r>
-        <w:rPr>
-          <w:lang w:val="en-SG"/>
-        </w:rPr>
-        <w:t>denormalised</w:t>
-      </w:r>
-      <w:proofErr w:type="spellEnd"/>
-      <w:r>
-        <w:rPr>
-          <w:lang w:val="en-SG"/>
-        </w:rPr>
-        <w:t xml:space="preserve"> tier attributes (star schema)</w:t>
+        <w:t>    TierName VARCHAR(20) NOT NULL,            -- denormalised tier attributes (star schema)</w:t>
       </w:r>
     </w:p>
     <w:p>
@@ -4266,21 +3392,7 @@
         <w:rPr>
           <w:lang w:val="en-SG"/>
         </w:rPr>
-        <w:t xml:space="preserve">    </w:t>
-      </w:r>
-      <w:proofErr w:type="spellStart"/>
-      <w:r>
-        <w:rPr>
-          <w:lang w:val="en-SG"/>
-        </w:rPr>
-        <w:t>TierLevel</w:t>
-      </w:r>
-      <w:proofErr w:type="spellEnd"/>
-      <w:r>
-        <w:rPr>
-          <w:lang w:val="en-SG"/>
-        </w:rPr>
-        <w:t xml:space="preserve"> INT NOT NULL,</w:t>
+        <w:t>    TierLevel INT NOT NULL,</w:t>
       </w:r>
     </w:p>
     <w:p>
@@ -4294,21 +3406,7 @@
         <w:rPr>
           <w:lang w:val="en-SG"/>
         </w:rPr>
-        <w:t xml:space="preserve">    </w:t>
-      </w:r>
-      <w:proofErr w:type="spellStart"/>
-      <w:r>
-        <w:rPr>
-          <w:lang w:val="en-SG"/>
-        </w:rPr>
-        <w:t>BorrowLimit</w:t>
-      </w:r>
-      <w:proofErr w:type="spellEnd"/>
-      <w:r>
-        <w:rPr>
-          <w:lang w:val="en-SG"/>
-        </w:rPr>
-        <w:t xml:space="preserve"> INT NOT NULL</w:t>
+        <w:t>    BorrowLimit INT NOT NULL</w:t>
       </w:r>
     </w:p>
     <w:p>
@@ -4344,21 +3442,7 @@
         <w:rPr>
           <w:lang w:val="en-SG"/>
         </w:rPr>
-        <w:t xml:space="preserve">CREATE TABLE </w:t>
-      </w:r>
-      <w:proofErr w:type="spellStart"/>
-      <w:r>
-        <w:rPr>
-          <w:lang w:val="en-SG"/>
-        </w:rPr>
-        <w:t>DimStaff</w:t>
-      </w:r>
-      <w:proofErr w:type="spellEnd"/>
-      <w:r>
-        <w:rPr>
-          <w:lang w:val="en-SG"/>
-        </w:rPr>
-        <w:t xml:space="preserve"> (</w:t>
+        <w:t>CREATE TABLE DimStaff (</w:t>
       </w:r>
     </w:p>
     <w:p>
@@ -4372,35 +3456,7 @@
         <w:rPr>
           <w:lang w:val="en-SG"/>
         </w:rPr>
-        <w:t xml:space="preserve">    </w:t>
-      </w:r>
-      <w:proofErr w:type="spellStart"/>
-      <w:r>
-        <w:rPr>
-          <w:lang w:val="en-SG"/>
-        </w:rPr>
-        <w:t>StaffKey</w:t>
-      </w:r>
-      <w:proofErr w:type="spellEnd"/>
-      <w:r>
-        <w:rPr>
-          <w:lang w:val="en-SG"/>
-        </w:rPr>
-        <w:t xml:space="preserve"> INT AUTO_INCREMENT PRIMARY </w:t>
-      </w:r>
-      <w:proofErr w:type="gramStart"/>
-      <w:r>
-        <w:rPr>
-          <w:lang w:val="en-SG"/>
-        </w:rPr>
-        <w:t>KEY,  --</w:t>
-      </w:r>
-      <w:proofErr w:type="gramEnd"/>
-      <w:r>
-        <w:rPr>
-          <w:lang w:val="en-SG"/>
-        </w:rPr>
-        <w:t xml:space="preserve"> surrogate key</w:t>
+        <w:t>    StaffKey INT AUTO_INCREMENT PRIMARY KEY,  -- surrogate key</w:t>
       </w:r>
     </w:p>
     <w:p>
@@ -4414,49 +3470,7 @@
         <w:rPr>
           <w:lang w:val="en-SG"/>
         </w:rPr>
-        <w:t xml:space="preserve">    </w:t>
-      </w:r>
-      <w:proofErr w:type="spellStart"/>
-      <w:r>
-        <w:rPr>
-          <w:lang w:val="en-SG"/>
-        </w:rPr>
-        <w:t>StaffID</w:t>
-      </w:r>
-      <w:proofErr w:type="spellEnd"/>
-      <w:r>
-        <w:rPr>
-          <w:lang w:val="en-SG"/>
-        </w:rPr>
-        <w:t xml:space="preserve"> </w:t>
-      </w:r>
-      <w:proofErr w:type="gramStart"/>
-      <w:r>
-        <w:rPr>
-          <w:lang w:val="en-SG"/>
-        </w:rPr>
-        <w:t>CHAR(</w:t>
-      </w:r>
-      <w:proofErr w:type="gramEnd"/>
-      <w:r>
-        <w:rPr>
-          <w:lang w:val="en-SG"/>
-        </w:rPr>
-        <w:t xml:space="preserve">10) NOT </w:t>
-      </w:r>
-      <w:proofErr w:type="gramStart"/>
-      <w:r>
-        <w:rPr>
-          <w:lang w:val="en-SG"/>
-        </w:rPr>
-        <w:t xml:space="preserve">NULL,   </w:t>
-      </w:r>
-      <w:proofErr w:type="gramEnd"/>
-      <w:r>
-        <w:rPr>
-          <w:lang w:val="en-SG"/>
-        </w:rPr>
-        <w:t>             -- natural key</w:t>
+        <w:t>    StaffID CHAR(10) NOT NULL,                -- natural key</w:t>
       </w:r>
     </w:p>
     <w:p>
@@ -4470,21 +3484,7 @@
         <w:rPr>
           <w:lang w:val="en-SG"/>
         </w:rPr>
-        <w:t xml:space="preserve">    Name </w:t>
-      </w:r>
-      <w:proofErr w:type="gramStart"/>
-      <w:r>
-        <w:rPr>
-          <w:lang w:val="en-SG"/>
-        </w:rPr>
-        <w:t>VARCHAR(</w:t>
-      </w:r>
-      <w:proofErr w:type="gramEnd"/>
-      <w:r>
-        <w:rPr>
-          <w:lang w:val="en-SG"/>
-        </w:rPr>
-        <w:t>100) NOT NULL,</w:t>
+        <w:t>    Name VARCHAR(100) NOT NULL,</w:t>
       </w:r>
     </w:p>
     <w:p>
@@ -4498,21 +3498,7 @@
         <w:rPr>
           <w:lang w:val="en-SG"/>
         </w:rPr>
-        <w:t xml:space="preserve">    Gender </w:t>
-      </w:r>
-      <w:proofErr w:type="gramStart"/>
-      <w:r>
-        <w:rPr>
-          <w:lang w:val="en-SG"/>
-        </w:rPr>
-        <w:t>CHAR(</w:t>
-      </w:r>
-      <w:proofErr w:type="gramEnd"/>
-      <w:r>
-        <w:rPr>
-          <w:lang w:val="en-SG"/>
-        </w:rPr>
-        <w:t>1) NOT NULL,</w:t>
+        <w:t>    Gender CHAR(1) NOT NULL,</w:t>
       </w:r>
     </w:p>
     <w:p>
@@ -4526,35 +3512,7 @@
         <w:rPr>
           <w:lang w:val="en-SG"/>
         </w:rPr>
-        <w:t xml:space="preserve">    </w:t>
-      </w:r>
-      <w:proofErr w:type="spellStart"/>
-      <w:r>
-        <w:rPr>
-          <w:lang w:val="en-SG"/>
-        </w:rPr>
-        <w:t>EmploymentType</w:t>
-      </w:r>
-      <w:proofErr w:type="spellEnd"/>
-      <w:r>
-        <w:rPr>
-          <w:lang w:val="en-SG"/>
-        </w:rPr>
-        <w:t xml:space="preserve"> </w:t>
-      </w:r>
-      <w:proofErr w:type="gramStart"/>
-      <w:r>
-        <w:rPr>
-          <w:lang w:val="en-SG"/>
-        </w:rPr>
-        <w:t>VARCHAR(</w:t>
-      </w:r>
-      <w:proofErr w:type="gramEnd"/>
-      <w:r>
-        <w:rPr>
-          <w:lang w:val="en-SG"/>
-        </w:rPr>
-        <w:t>20) NOT NULL,</w:t>
+        <w:t>    EmploymentType VARCHAR(20) NOT NULL,</w:t>
       </w:r>
     </w:p>
     <w:p>
@@ -4568,21 +3526,7 @@
         <w:rPr>
           <w:lang w:val="en-SG"/>
         </w:rPr>
-        <w:t xml:space="preserve">    Department </w:t>
-      </w:r>
-      <w:proofErr w:type="gramStart"/>
-      <w:r>
-        <w:rPr>
-          <w:lang w:val="en-SG"/>
-        </w:rPr>
-        <w:t>VARCHAR(</w:t>
-      </w:r>
-      <w:proofErr w:type="gramEnd"/>
-      <w:r>
-        <w:rPr>
-          <w:lang w:val="en-SG"/>
-        </w:rPr>
-        <w:t>50) NOT NULL,</w:t>
+        <w:t>    Department VARCHAR(50) NOT NULL,</w:t>
       </w:r>
     </w:p>
     <w:p>
@@ -4632,21 +3576,7 @@
         <w:rPr>
           <w:lang w:val="en-SG"/>
         </w:rPr>
-        <w:t xml:space="preserve">CREATE TABLE </w:t>
-      </w:r>
-      <w:proofErr w:type="spellStart"/>
-      <w:r>
-        <w:rPr>
-          <w:lang w:val="en-SG"/>
-        </w:rPr>
-        <w:t>DimBook</w:t>
-      </w:r>
-      <w:proofErr w:type="spellEnd"/>
-      <w:r>
-        <w:rPr>
-          <w:lang w:val="en-SG"/>
-        </w:rPr>
-        <w:t xml:space="preserve"> (</w:t>
+        <w:t>CREATE TABLE DimBook (</w:t>
       </w:r>
     </w:p>
     <w:p>
@@ -4660,21 +3590,7 @@
         <w:rPr>
           <w:lang w:val="en-SG"/>
         </w:rPr>
-        <w:t xml:space="preserve">    BookKey INT AUTO_INCREMENT PRIMARY </w:t>
-      </w:r>
-      <w:proofErr w:type="gramStart"/>
-      <w:r>
-        <w:rPr>
-          <w:lang w:val="en-SG"/>
-        </w:rPr>
-        <w:t xml:space="preserve">KEY,   </w:t>
-      </w:r>
-      <w:proofErr w:type="gramEnd"/>
-      <w:r>
-        <w:rPr>
-          <w:lang w:val="en-SG"/>
-        </w:rPr>
-        <w:t>-- surrogate key</w:t>
+        <w:t>    BookKey INT AUTO_INCREMENT PRIMARY KEY,   -- surrogate key</w:t>
       </w:r>
     </w:p>
     <w:p>
@@ -4688,49 +3604,7 @@
         <w:rPr>
           <w:lang w:val="en-SG"/>
         </w:rPr>
-        <w:t xml:space="preserve">    </w:t>
-      </w:r>
-      <w:proofErr w:type="spellStart"/>
-      <w:r>
-        <w:rPr>
-          <w:lang w:val="en-SG"/>
-        </w:rPr>
-        <w:t>BookID</w:t>
-      </w:r>
-      <w:proofErr w:type="spellEnd"/>
-      <w:r>
-        <w:rPr>
-          <w:lang w:val="en-SG"/>
-        </w:rPr>
-        <w:t xml:space="preserve"> </w:t>
-      </w:r>
-      <w:proofErr w:type="gramStart"/>
-      <w:r>
-        <w:rPr>
-          <w:lang w:val="en-SG"/>
-        </w:rPr>
-        <w:t>CHAR(</w:t>
-      </w:r>
-      <w:proofErr w:type="gramEnd"/>
-      <w:r>
-        <w:rPr>
-          <w:lang w:val="en-SG"/>
-        </w:rPr>
-        <w:t xml:space="preserve">10) NOT </w:t>
-      </w:r>
-      <w:proofErr w:type="gramStart"/>
-      <w:r>
-        <w:rPr>
-          <w:lang w:val="en-SG"/>
-        </w:rPr>
-        <w:t xml:space="preserve">NULL,   </w:t>
-      </w:r>
-      <w:proofErr w:type="gramEnd"/>
-      <w:r>
-        <w:rPr>
-          <w:lang w:val="en-SG"/>
-        </w:rPr>
-        <w:t>              -- natural key</w:t>
+        <w:t>    BookID CHAR(10) NOT NULL,                 -- natural key</w:t>
       </w:r>
     </w:p>
     <w:p>
@@ -4744,21 +3618,7 @@
         <w:rPr>
           <w:lang w:val="en-SG"/>
         </w:rPr>
-        <w:t xml:space="preserve">    Title </w:t>
-      </w:r>
-      <w:proofErr w:type="gramStart"/>
-      <w:r>
-        <w:rPr>
-          <w:lang w:val="en-SG"/>
-        </w:rPr>
-        <w:t>VARCHAR(</w:t>
-      </w:r>
-      <w:proofErr w:type="gramEnd"/>
-      <w:r>
-        <w:rPr>
-          <w:lang w:val="en-SG"/>
-        </w:rPr>
-        <w:t>200) NOT NULL,</w:t>
+        <w:t>    Title VARCHAR(200) NOT NULL,</w:t>
       </w:r>
     </w:p>
     <w:p>
@@ -4773,21 +3633,7 @@
           <w:lang w:val="en-SG"/>
         </w:rPr>
         <w:lastRenderedPageBreak/>
-        <w:t xml:space="preserve">    Author </w:t>
-      </w:r>
-      <w:proofErr w:type="gramStart"/>
-      <w:r>
-        <w:rPr>
-          <w:lang w:val="en-SG"/>
-        </w:rPr>
-        <w:t>VARCHAR(</w:t>
-      </w:r>
-      <w:proofErr w:type="gramEnd"/>
-      <w:r>
-        <w:rPr>
-          <w:lang w:val="en-SG"/>
-        </w:rPr>
-        <w:t>100) NOT NULL,</w:t>
+        <w:t>    Author VARCHAR(100) NOT NULL,</w:t>
       </w:r>
     </w:p>
     <w:p>
@@ -4801,21 +3647,7 @@
         <w:rPr>
           <w:lang w:val="en-SG"/>
         </w:rPr>
-        <w:t xml:space="preserve">    Genre </w:t>
-      </w:r>
-      <w:proofErr w:type="gramStart"/>
-      <w:r>
-        <w:rPr>
-          <w:lang w:val="en-SG"/>
-        </w:rPr>
-        <w:t>VARCHAR(</w:t>
-      </w:r>
-      <w:proofErr w:type="gramEnd"/>
-      <w:r>
-        <w:rPr>
-          <w:lang w:val="en-SG"/>
-        </w:rPr>
-        <w:t>50) NOT NULL,</w:t>
+        <w:t>    Genre VARCHAR(50) NOT NULL,</w:t>
       </w:r>
     </w:p>
     <w:p>
@@ -4829,35 +3661,7 @@
         <w:rPr>
           <w:lang w:val="en-SG"/>
         </w:rPr>
-        <w:t xml:space="preserve">    </w:t>
-      </w:r>
-      <w:proofErr w:type="spellStart"/>
-      <w:r>
-        <w:rPr>
-          <w:lang w:val="en-SG"/>
-        </w:rPr>
-        <w:t>MinTierName</w:t>
-      </w:r>
-      <w:proofErr w:type="spellEnd"/>
-      <w:r>
-        <w:rPr>
-          <w:lang w:val="en-SG"/>
-        </w:rPr>
-        <w:t xml:space="preserve"> </w:t>
-      </w:r>
-      <w:proofErr w:type="gramStart"/>
-      <w:r>
-        <w:rPr>
-          <w:lang w:val="en-SG"/>
-        </w:rPr>
-        <w:t>VARCHAR(</w:t>
-      </w:r>
-      <w:proofErr w:type="gramEnd"/>
-      <w:r>
-        <w:rPr>
-          <w:lang w:val="en-SG"/>
-        </w:rPr>
-        <w:t>20) NOT NULL,</w:t>
+        <w:t>    MinTierName VARCHAR(20) NOT NULL,</w:t>
       </w:r>
     </w:p>
     <w:p>
@@ -4871,21 +3675,7 @@
         <w:rPr>
           <w:lang w:val="en-SG"/>
         </w:rPr>
-        <w:t xml:space="preserve">    </w:t>
-      </w:r>
-      <w:proofErr w:type="spellStart"/>
-      <w:r>
-        <w:rPr>
-          <w:lang w:val="en-SG"/>
-        </w:rPr>
-        <w:t>MinTierLevel</w:t>
-      </w:r>
-      <w:proofErr w:type="spellEnd"/>
-      <w:r>
-        <w:rPr>
-          <w:lang w:val="en-SG"/>
-        </w:rPr>
-        <w:t xml:space="preserve"> INT NOT NULL</w:t>
+        <w:t>    MinTierLevel INT NOT NULL</w:t>
       </w:r>
     </w:p>
     <w:p>
@@ -4935,21 +3725,7 @@
         <w:rPr>
           <w:lang w:val="en-SG"/>
         </w:rPr>
-        <w:t xml:space="preserve">CREATE TABLE </w:t>
-      </w:r>
-      <w:proofErr w:type="spellStart"/>
-      <w:r>
-        <w:rPr>
-          <w:lang w:val="en-SG"/>
-        </w:rPr>
-        <w:t>FactLoan</w:t>
-      </w:r>
-      <w:proofErr w:type="spellEnd"/>
-      <w:r>
-        <w:rPr>
-          <w:lang w:val="en-SG"/>
-        </w:rPr>
-        <w:t xml:space="preserve"> (</w:t>
+        <w:t>CREATE TABLE FactLoan (</w:t>
       </w:r>
     </w:p>
     <w:p>
@@ -4963,35 +3739,7 @@
         <w:rPr>
           <w:lang w:val="en-SG"/>
         </w:rPr>
-        <w:t xml:space="preserve">    </w:t>
-      </w:r>
-      <w:proofErr w:type="spellStart"/>
-      <w:r>
-        <w:rPr>
-          <w:lang w:val="en-SG"/>
-        </w:rPr>
-        <w:t>LoanKey</w:t>
-      </w:r>
-      <w:proofErr w:type="spellEnd"/>
-      <w:r>
-        <w:rPr>
-          <w:lang w:val="en-SG"/>
-        </w:rPr>
-        <w:t xml:space="preserve"> INT AUTO_INCREMENT PRIMARY </w:t>
-      </w:r>
-      <w:proofErr w:type="gramStart"/>
-      <w:r>
-        <w:rPr>
-          <w:lang w:val="en-SG"/>
-        </w:rPr>
-        <w:t xml:space="preserve">KEY,   </w:t>
-      </w:r>
-      <w:proofErr w:type="gramEnd"/>
-      <w:r>
-        <w:rPr>
-          <w:lang w:val="en-SG"/>
-        </w:rPr>
-        <w:t>-- surrogate key</w:t>
+        <w:t>    LoanKey INT AUTO_INCREMENT PRIMARY KEY,   -- surrogate key</w:t>
       </w:r>
     </w:p>
     <w:p>
@@ -5005,21 +3753,7 @@
         <w:rPr>
           <w:lang w:val="en-SG"/>
         </w:rPr>
-        <w:t xml:space="preserve">    </w:t>
-      </w:r>
-      <w:proofErr w:type="spellStart"/>
-      <w:r>
-        <w:rPr>
-          <w:lang w:val="en-SG"/>
-        </w:rPr>
-        <w:t>MemberKey</w:t>
-      </w:r>
-      <w:proofErr w:type="spellEnd"/>
-      <w:r>
-        <w:rPr>
-          <w:lang w:val="en-SG"/>
-        </w:rPr>
-        <w:t xml:space="preserve"> INT NOT NULL,</w:t>
+        <w:t>    MemberKey INT NOT NULL,</w:t>
       </w:r>
     </w:p>
     <w:p>
@@ -5033,21 +3767,7 @@
         <w:rPr>
           <w:lang w:val="en-SG"/>
         </w:rPr>
-        <w:t xml:space="preserve">    </w:t>
-      </w:r>
-      <w:proofErr w:type="spellStart"/>
-      <w:r>
-        <w:rPr>
-          <w:lang w:val="en-SG"/>
-        </w:rPr>
-        <w:t>StaffKey</w:t>
-      </w:r>
-      <w:proofErr w:type="spellEnd"/>
-      <w:r>
-        <w:rPr>
-          <w:lang w:val="en-SG"/>
-        </w:rPr>
-        <w:t xml:space="preserve"> INT NOT NULL,</w:t>
+        <w:t>    StaffKey INT NOT NULL,</w:t>
       </w:r>
     </w:p>
     <w:p>
@@ -5075,21 +3795,7 @@
         <w:rPr>
           <w:lang w:val="en-SG"/>
         </w:rPr>
-        <w:t xml:space="preserve">    </w:t>
-      </w:r>
-      <w:proofErr w:type="spellStart"/>
-      <w:r>
-        <w:rPr>
-          <w:lang w:val="en-SG"/>
-        </w:rPr>
-        <w:t>BorrowDateKey</w:t>
-      </w:r>
-      <w:proofErr w:type="spellEnd"/>
-      <w:r>
-        <w:rPr>
-          <w:lang w:val="en-SG"/>
-        </w:rPr>
-        <w:t xml:space="preserve"> INT NOT NULL,</w:t>
+        <w:t>    BorrowDateKey INT NOT NULL,</w:t>
       </w:r>
     </w:p>
     <w:p>
@@ -5103,21 +3809,7 @@
         <w:rPr>
           <w:lang w:val="en-SG"/>
         </w:rPr>
-        <w:t xml:space="preserve">    </w:t>
-      </w:r>
-      <w:proofErr w:type="spellStart"/>
-      <w:r>
-        <w:rPr>
-          <w:lang w:val="en-SG"/>
-        </w:rPr>
-        <w:t>ReturnDateKey</w:t>
-      </w:r>
-      <w:proofErr w:type="spellEnd"/>
-      <w:r>
-        <w:rPr>
-          <w:lang w:val="en-SG"/>
-        </w:rPr>
-        <w:t xml:space="preserve"> INT NOT NULL,</w:t>
+        <w:t>    ReturnDateKey INT NOT NULL,</w:t>
       </w:r>
     </w:p>
     <w:p>
@@ -5131,35 +3823,7 @@
         <w:rPr>
           <w:lang w:val="en-SG"/>
         </w:rPr>
-        <w:t xml:space="preserve">    </w:t>
-      </w:r>
-      <w:proofErr w:type="spellStart"/>
-      <w:r>
-        <w:rPr>
-          <w:lang w:val="en-SG"/>
-        </w:rPr>
-        <w:t>CopySeqNo</w:t>
-      </w:r>
-      <w:proofErr w:type="spellEnd"/>
-      <w:r>
-        <w:rPr>
-          <w:lang w:val="en-SG"/>
-        </w:rPr>
-        <w:t xml:space="preserve"> INT NOT </w:t>
-      </w:r>
-      <w:proofErr w:type="gramStart"/>
-      <w:r>
-        <w:rPr>
-          <w:lang w:val="en-SG"/>
-        </w:rPr>
-        <w:t xml:space="preserve">NULL,   </w:t>
-      </w:r>
-      <w:proofErr w:type="gramEnd"/>
-      <w:r>
-        <w:rPr>
-          <w:lang w:val="en-SG"/>
-        </w:rPr>
-        <w:t>                -- degenerate dimension</w:t>
+        <w:t>    CopySeqNo INT NOT NULL,                   -- degenerate dimension</w:t>
       </w:r>
     </w:p>
     <w:p>
@@ -5173,35 +3837,7 @@
         <w:rPr>
           <w:lang w:val="en-SG"/>
         </w:rPr>
-        <w:t xml:space="preserve">    </w:t>
-      </w:r>
-      <w:proofErr w:type="spellStart"/>
-      <w:r>
-        <w:rPr>
-          <w:lang w:val="en-SG"/>
-        </w:rPr>
-        <w:t>LoanDurationDays</w:t>
-      </w:r>
-      <w:proofErr w:type="spellEnd"/>
-      <w:r>
-        <w:rPr>
-          <w:lang w:val="en-SG"/>
-        </w:rPr>
-        <w:t xml:space="preserve"> INT NOT </w:t>
-      </w:r>
-      <w:proofErr w:type="gramStart"/>
-      <w:r>
-        <w:rPr>
-          <w:lang w:val="en-SG"/>
-        </w:rPr>
-        <w:t xml:space="preserve">NULL,   </w:t>
-      </w:r>
-      <w:proofErr w:type="gramEnd"/>
-      <w:r>
-        <w:rPr>
-          <w:lang w:val="en-SG"/>
-        </w:rPr>
-        <w:t>         -- return date - borrow date</w:t>
+        <w:t>    LoanDurationDays INT NOT NULL,            -- return date - borrow date</w:t>
       </w:r>
     </w:p>
     <w:p>
@@ -5215,35 +3851,7 @@
         <w:rPr>
           <w:lang w:val="en-SG"/>
         </w:rPr>
-        <w:t xml:space="preserve">    </w:t>
-      </w:r>
-      <w:proofErr w:type="spellStart"/>
-      <w:r>
-        <w:rPr>
-          <w:lang w:val="en-SG"/>
-        </w:rPr>
-        <w:t>DaysBeforeDue</w:t>
-      </w:r>
-      <w:proofErr w:type="spellEnd"/>
-      <w:r>
-        <w:rPr>
-          <w:lang w:val="en-SG"/>
-        </w:rPr>
-        <w:t xml:space="preserve"> INT NOT </w:t>
-      </w:r>
-      <w:proofErr w:type="gramStart"/>
-      <w:r>
-        <w:rPr>
-          <w:lang w:val="en-SG"/>
-        </w:rPr>
-        <w:t xml:space="preserve">NULL,   </w:t>
-      </w:r>
-      <w:proofErr w:type="gramEnd"/>
-      <w:r>
-        <w:rPr>
-          <w:lang w:val="en-SG"/>
-        </w:rPr>
-        <w:t>            -- due date - return date (negative = late)</w:t>
+        <w:t>    DaysBeforeDue INT NOT NULL,               -- due date - return date (negative = late)</w:t>
       </w:r>
     </w:p>
     <w:p>
@@ -5257,21 +3865,7 @@
         <w:rPr>
           <w:lang w:val="en-SG"/>
         </w:rPr>
-        <w:t xml:space="preserve">    </w:t>
-      </w:r>
-      <w:proofErr w:type="spellStart"/>
-      <w:r>
-        <w:rPr>
-          <w:lang w:val="en-SG"/>
-        </w:rPr>
-        <w:t>IsLate</w:t>
-      </w:r>
-      <w:proofErr w:type="spellEnd"/>
-      <w:r>
-        <w:rPr>
-          <w:lang w:val="en-SG"/>
-        </w:rPr>
-        <w:t xml:space="preserve"> BOOLEAN NOT NULL,</w:t>
+        <w:t>    IsLate BOOLEAN NOT NULL,</w:t>
       </w:r>
     </w:p>
     <w:p>
@@ -5285,51 +3879,7 @@
         <w:rPr>
           <w:lang w:val="en-SG"/>
         </w:rPr>
-        <w:t>    FOREIGN KEY (</w:t>
-      </w:r>
-      <w:proofErr w:type="spellStart"/>
-      <w:r>
-        <w:rPr>
-          <w:lang w:val="en-SG"/>
-        </w:rPr>
-        <w:t>MemberKey</w:t>
-      </w:r>
-      <w:proofErr w:type="spellEnd"/>
-      <w:r>
-        <w:rPr>
-          <w:lang w:val="en-SG"/>
-        </w:rPr>
-        <w:t xml:space="preserve">) REFERENCES </w:t>
-      </w:r>
-      <w:proofErr w:type="spellStart"/>
-      <w:proofErr w:type="gramStart"/>
-      <w:r>
-        <w:rPr>
-          <w:lang w:val="en-SG"/>
-        </w:rPr>
-        <w:t>DimMember</w:t>
-      </w:r>
-      <w:proofErr w:type="spellEnd"/>
-      <w:r>
-        <w:rPr>
-          <w:lang w:val="en-SG"/>
-        </w:rPr>
-        <w:t>(</w:t>
-      </w:r>
-      <w:proofErr w:type="spellStart"/>
-      <w:proofErr w:type="gramEnd"/>
-      <w:r>
-        <w:rPr>
-          <w:lang w:val="en-SG"/>
-        </w:rPr>
-        <w:t>MemberKey</w:t>
-      </w:r>
-      <w:proofErr w:type="spellEnd"/>
-      <w:r>
-        <w:rPr>
-          <w:lang w:val="en-SG"/>
-        </w:rPr>
-        <w:t>),</w:t>
+        <w:t>    FOREIGN KEY (MemberKey) REFERENCES DimMember(MemberKey),</w:t>
       </w:r>
     </w:p>
     <w:p>
@@ -5343,51 +3893,7 @@
         <w:rPr>
           <w:lang w:val="en-SG"/>
         </w:rPr>
-        <w:t>    FOREIGN KEY (</w:t>
-      </w:r>
-      <w:proofErr w:type="spellStart"/>
-      <w:r>
-        <w:rPr>
-          <w:lang w:val="en-SG"/>
-        </w:rPr>
-        <w:t>StaffKey</w:t>
-      </w:r>
-      <w:proofErr w:type="spellEnd"/>
-      <w:r>
-        <w:rPr>
-          <w:lang w:val="en-SG"/>
-        </w:rPr>
-        <w:t xml:space="preserve">) REFERENCES </w:t>
-      </w:r>
-      <w:proofErr w:type="spellStart"/>
-      <w:proofErr w:type="gramStart"/>
-      <w:r>
-        <w:rPr>
-          <w:lang w:val="en-SG"/>
-        </w:rPr>
-        <w:t>DimStaff</w:t>
-      </w:r>
-      <w:proofErr w:type="spellEnd"/>
-      <w:r>
-        <w:rPr>
-          <w:lang w:val="en-SG"/>
-        </w:rPr>
-        <w:t>(</w:t>
-      </w:r>
-      <w:proofErr w:type="spellStart"/>
-      <w:proofErr w:type="gramEnd"/>
-      <w:r>
-        <w:rPr>
-          <w:lang w:val="en-SG"/>
-        </w:rPr>
-        <w:t>StaffKey</w:t>
-      </w:r>
-      <w:proofErr w:type="spellEnd"/>
-      <w:r>
-        <w:rPr>
-          <w:lang w:val="en-SG"/>
-        </w:rPr>
-        <w:t>),</w:t>
+        <w:t>    FOREIGN KEY (StaffKey) REFERENCES DimStaff(StaffKey),</w:t>
       </w:r>
     </w:p>
     <w:p>
@@ -5401,29 +3907,7 @@
         <w:rPr>
           <w:lang w:val="en-SG"/>
         </w:rPr>
-        <w:t xml:space="preserve">    FOREIGN KEY (BookKey) REFERENCES </w:t>
-      </w:r>
-      <w:proofErr w:type="spellStart"/>
-      <w:proofErr w:type="gramStart"/>
-      <w:r>
-        <w:rPr>
-          <w:lang w:val="en-SG"/>
-        </w:rPr>
-        <w:t>DimBook</w:t>
-      </w:r>
-      <w:proofErr w:type="spellEnd"/>
-      <w:r>
-        <w:rPr>
-          <w:lang w:val="en-SG"/>
-        </w:rPr>
-        <w:t>(</w:t>
-      </w:r>
-      <w:proofErr w:type="gramEnd"/>
-      <w:r>
-        <w:rPr>
-          <w:lang w:val="en-SG"/>
-        </w:rPr>
-        <w:t>BookKey),</w:t>
+        <w:t>    FOREIGN KEY (BookKey) REFERENCES DimBook(BookKey),</w:t>
       </w:r>
     </w:p>
     <w:p>
@@ -5437,51 +3921,7 @@
         <w:rPr>
           <w:lang w:val="en-SG"/>
         </w:rPr>
-        <w:t>    FOREIGN KEY (</w:t>
-      </w:r>
-      <w:proofErr w:type="spellStart"/>
-      <w:r>
-        <w:rPr>
-          <w:lang w:val="en-SG"/>
-        </w:rPr>
-        <w:t>BorrowDateKey</w:t>
-      </w:r>
-      <w:proofErr w:type="spellEnd"/>
-      <w:r>
-        <w:rPr>
-          <w:lang w:val="en-SG"/>
-        </w:rPr>
-        <w:t xml:space="preserve">) REFERENCES </w:t>
-      </w:r>
-      <w:proofErr w:type="spellStart"/>
-      <w:proofErr w:type="gramStart"/>
-      <w:r>
-        <w:rPr>
-          <w:lang w:val="en-SG"/>
-        </w:rPr>
-        <w:t>DimDate</w:t>
-      </w:r>
-      <w:proofErr w:type="spellEnd"/>
-      <w:r>
-        <w:rPr>
-          <w:lang w:val="en-SG"/>
-        </w:rPr>
-        <w:t>(</w:t>
-      </w:r>
-      <w:proofErr w:type="spellStart"/>
-      <w:proofErr w:type="gramEnd"/>
-      <w:r>
-        <w:rPr>
-          <w:lang w:val="en-SG"/>
-        </w:rPr>
-        <w:t>DateKey</w:t>
-      </w:r>
-      <w:proofErr w:type="spellEnd"/>
-      <w:r>
-        <w:rPr>
-          <w:lang w:val="en-SG"/>
-        </w:rPr>
-        <w:t>),</w:t>
+        <w:t>    FOREIGN KEY (BorrowDateKey) REFERENCES DimDate(DateKey),</w:t>
       </w:r>
     </w:p>
     <w:p>
@@ -5495,51 +3935,7 @@
         <w:rPr>
           <w:lang w:val="en-SG"/>
         </w:rPr>
-        <w:t>    FOREIGN KEY (</w:t>
-      </w:r>
-      <w:proofErr w:type="spellStart"/>
-      <w:r>
-        <w:rPr>
-          <w:lang w:val="en-SG"/>
-        </w:rPr>
-        <w:t>ReturnDateKey</w:t>
-      </w:r>
-      <w:proofErr w:type="spellEnd"/>
-      <w:r>
-        <w:rPr>
-          <w:lang w:val="en-SG"/>
-        </w:rPr>
-        <w:t xml:space="preserve">) REFERENCES </w:t>
-      </w:r>
-      <w:proofErr w:type="spellStart"/>
-      <w:proofErr w:type="gramStart"/>
-      <w:r>
-        <w:rPr>
-          <w:lang w:val="en-SG"/>
-        </w:rPr>
-        <w:t>DimDate</w:t>
-      </w:r>
-      <w:proofErr w:type="spellEnd"/>
-      <w:r>
-        <w:rPr>
-          <w:lang w:val="en-SG"/>
-        </w:rPr>
-        <w:t>(</w:t>
-      </w:r>
-      <w:proofErr w:type="spellStart"/>
-      <w:proofErr w:type="gramEnd"/>
-      <w:r>
-        <w:rPr>
-          <w:lang w:val="en-SG"/>
-        </w:rPr>
-        <w:t>DateKey</w:t>
-      </w:r>
-      <w:proofErr w:type="spellEnd"/>
-      <w:r>
-        <w:rPr>
-          <w:lang w:val="en-SG"/>
-        </w:rPr>
-        <w:t>)</w:t>
+        <w:t>    FOREIGN KEY (ReturnDateKey) REFERENCES DimDate(DateKey)</w:t>
       </w:r>
     </w:p>
     <w:p>
@@ -5658,261 +4054,31 @@
         </w:rPr>
         <w:t>How to verify successful insertion:</w:t>
       </w:r>
+      <w:r>
+        <w:rPr>
+          <w:b/>
+          <w:bCs/>
+        </w:rPr>
+        <w:t xml:space="preserve"> (Change ts up)</w:t>
+      </w:r>
+    </w:p>
+    <w:p>
+      <w:pPr>
+        <w:rPr>
+          <w:b/>
+          <w:bCs/>
+        </w:rPr>
+      </w:pPr>
     </w:p>
     <w:p>
       <w:r>
         <w:rPr>
           <w:sz w:val="20"/>
         </w:rPr>
-        <w:t xml:space="preserve">ETL verification: (1) Row-count reconciliation - completed loans in OLTP (SELECT </w:t>
-      </w:r>
-      <w:proofErr w:type="gramStart"/>
-      <w:r>
-        <w:rPr>
-          <w:sz w:val="20"/>
-        </w:rPr>
-        <w:t>COUNT(</w:t>
-      </w:r>
-      <w:proofErr w:type="gramEnd"/>
-      <w:r>
-        <w:rPr>
-          <w:sz w:val="20"/>
-        </w:rPr>
-        <w:t xml:space="preserve">*) FROM Loan WHERE </w:t>
-      </w:r>
-      <w:proofErr w:type="spellStart"/>
-      <w:r>
-        <w:rPr>
-          <w:sz w:val="20"/>
-        </w:rPr>
-        <w:t>ReturnDatetime</w:t>
-      </w:r>
-      <w:proofErr w:type="spellEnd"/>
-      <w:r>
-        <w:rPr>
-          <w:sz w:val="20"/>
-        </w:rPr>
-        <w:t xml:space="preserve"> IS NOT NULL) = 12,343 and </w:t>
-      </w:r>
-      <w:proofErr w:type="spellStart"/>
-      <w:r>
-        <w:rPr>
-          <w:sz w:val="20"/>
-        </w:rPr>
-        <w:t>FactLoan</w:t>
-      </w:r>
-      <w:proofErr w:type="spellEnd"/>
-      <w:r>
-        <w:rPr>
-          <w:sz w:val="20"/>
-        </w:rPr>
-        <w:t xml:space="preserve"> = 12,343; </w:t>
-      </w:r>
-      <w:proofErr w:type="spellStart"/>
-      <w:r>
-        <w:rPr>
-          <w:sz w:val="20"/>
-        </w:rPr>
-        <w:t>DimMember</w:t>
-      </w:r>
-      <w:proofErr w:type="spellEnd"/>
-      <w:r>
-        <w:rPr>
-          <w:sz w:val="20"/>
-        </w:rPr>
-        <w:t xml:space="preserve"> = Member = 301; </w:t>
-      </w:r>
-      <w:proofErr w:type="spellStart"/>
-      <w:r>
-        <w:rPr>
-          <w:sz w:val="20"/>
-        </w:rPr>
-        <w:t>DimBook</w:t>
-      </w:r>
-      <w:proofErr w:type="spellEnd"/>
-      <w:r>
-        <w:rPr>
-          <w:sz w:val="20"/>
-        </w:rPr>
-        <w:t xml:space="preserve"> = Book = 500; </w:t>
-      </w:r>
-      <w:proofErr w:type="spellStart"/>
-      <w:r>
-        <w:rPr>
-          <w:sz w:val="20"/>
-        </w:rPr>
-        <w:t>DimStaff</w:t>
-      </w:r>
-      <w:proofErr w:type="spellEnd"/>
-      <w:r>
-        <w:rPr>
-          <w:sz w:val="20"/>
-        </w:rPr>
-        <w:t xml:space="preserve"> = Staff = 51. (2) Measure reconciliation - </w:t>
-      </w:r>
-      <w:proofErr w:type="gramStart"/>
-      <w:r>
-        <w:rPr>
-          <w:sz w:val="20"/>
-        </w:rPr>
-        <w:t>SUM(DATEDIFF(</w:t>
-      </w:r>
-      <w:proofErr w:type="spellStart"/>
-      <w:proofErr w:type="gramEnd"/>
-      <w:r>
-        <w:rPr>
-          <w:sz w:val="20"/>
-        </w:rPr>
-        <w:t>ReturnDatetime</w:t>
-      </w:r>
-      <w:proofErr w:type="spellEnd"/>
-      <w:r>
-        <w:rPr>
-          <w:sz w:val="20"/>
-        </w:rPr>
-        <w:t>, StartDatetime)) computed directly on the OLTP Loan table = 108,801 days, identical to SUM(</w:t>
-      </w:r>
-      <w:proofErr w:type="spellStart"/>
-      <w:r>
-        <w:rPr>
-          <w:sz w:val="20"/>
-        </w:rPr>
-        <w:t>LoanDurationDays</w:t>
-      </w:r>
-      <w:proofErr w:type="spellEnd"/>
-      <w:r>
-        <w:rPr>
-          <w:sz w:val="20"/>
-        </w:rPr>
-        <w:t xml:space="preserve">) in </w:t>
-      </w:r>
-      <w:proofErr w:type="spellStart"/>
-      <w:r>
-        <w:rPr>
-          <w:sz w:val="20"/>
-        </w:rPr>
-        <w:t>FactLoan</w:t>
-      </w:r>
-      <w:proofErr w:type="spellEnd"/>
-      <w:r>
-        <w:rPr>
-          <w:sz w:val="20"/>
-        </w:rPr>
-        <w:t xml:space="preserve">, proving the duration measure was derived correctly for every row. (3) Referential integrity - a LEFT JOIN from </w:t>
-      </w:r>
-      <w:proofErr w:type="spellStart"/>
-      <w:r>
-        <w:rPr>
-          <w:sz w:val="20"/>
-        </w:rPr>
-        <w:t>FactLoan</w:t>
-      </w:r>
-      <w:proofErr w:type="spellEnd"/>
-      <w:r>
-        <w:rPr>
-          <w:sz w:val="20"/>
-        </w:rPr>
-        <w:t xml:space="preserve"> to each dimension returns 0 orphan rows, and all foreign keys are enforced by constraints so no fact row can reference a missing dimension member. The verification queries are included at the bottom of </w:t>
-      </w:r>
-      <w:proofErr w:type="spellStart"/>
-      <w:r>
-        <w:rPr>
-          <w:sz w:val="20"/>
-        </w:rPr>
-        <w:t>DW_insert.sql</w:t>
-      </w:r>
-      <w:proofErr w:type="spellEnd"/>
-      <w:r>
-        <w:rPr>
-          <w:sz w:val="20"/>
-        </w:rPr>
-        <w:t>.</w:t>
-      </w:r>
-    </w:p>
-    <w:p>
-      <w:r>
-        <w:rPr>
-          <w:noProof/>
-        </w:rPr>
-        <w:lastRenderedPageBreak/>
-        <mc:AlternateContent>
-          <mc:Choice Requires="wps">
-            <w:drawing>
-              <wp:anchor distT="45720" distB="45720" distL="114300" distR="114300" simplePos="0" relativeHeight="251676676" behindDoc="0" locked="0" layoutInCell="1" allowOverlap="1" wp14:anchorId="30DA386E" wp14:editId="199617D3">
-                <wp:simplePos x="0" y="0"/>
-                <wp:positionH relativeFrom="column">
-                  <wp:posOffset>434340</wp:posOffset>
-                </wp:positionH>
-                <wp:positionV relativeFrom="paragraph">
-                  <wp:posOffset>180975</wp:posOffset>
-                </wp:positionV>
-                <wp:extent cx="5654040" cy="5890260"/>
-                <wp:effectExtent l="0" t="0" r="22860" b="15240"/>
-                <wp:wrapSquare wrapText="bothSides"/>
-                <wp:docPr id="1960066385" name="Text Box 2"/>
-                <wp:cNvGraphicFramePr>
-                  <a:graphicFrameLocks xmlns:a="http://schemas.openxmlformats.org/drawingml/2006/main"/>
-                </wp:cNvGraphicFramePr>
-                <a:graphic xmlns:a="http://schemas.openxmlformats.org/drawingml/2006/main">
-                  <a:graphicData uri="http://schemas.microsoft.com/office/word/2010/wordprocessingShape">
-                    <wps:wsp>
-                      <wps:cNvSpPr txBox="1">
-                        <a:spLocks noChangeArrowheads="1"/>
-                      </wps:cNvSpPr>
-                      <wps:spPr bwMode="auto">
-                        <a:xfrm>
-                          <a:off x="0" y="0"/>
-                          <a:ext cx="5654040" cy="5890260"/>
-                        </a:xfrm>
-                        <a:prstGeom prst="rect">
-                          <a:avLst/>
-                        </a:prstGeom>
-                        <a:solidFill>
-                          <a:srgbClr val="FFFFFF"/>
-                        </a:solidFill>
-                        <a:ln w="9525">
-                          <a:solidFill>
-                            <a:srgbClr val="000000"/>
-                          </a:solidFill>
-                          <a:miter lim="800000"/>
-                          <a:headEnd/>
-                          <a:tailEnd/>
-                        </a:ln>
-                      </wps:spPr>
-                      <wps:txbx>
-                        <w:txbxContent>
-                          <w:p/>
-                        </w:txbxContent>
-                      </wps:txbx>
-                      <wps:bodyPr rot="0" vert="horz" wrap="square" lIns="91440" tIns="45720" rIns="91440" bIns="45720" anchor="t" anchorCtr="0">
-                        <a:noAutofit/>
-                      </wps:bodyPr>
-                    </wps:wsp>
-                  </a:graphicData>
-                </a:graphic>
-                <wp14:sizeRelH relativeFrom="margin">
-                  <wp14:pctWidth>0</wp14:pctWidth>
-                </wp14:sizeRelH>
-                <wp14:sizeRelV relativeFrom="margin">
-                  <wp14:pctHeight>0</wp14:pctHeight>
-                </wp14:sizeRelV>
-              </wp:anchor>
-            </w:drawing>
-          </mc:Choice>
-          <mc:Fallback>
-            <w:pict>
-              <v:shape w14:anchorId="30DA386E" id="_x0000_s1030" type="#_x0000_t202" style="position:absolute;margin-left:34.2pt;margin-top:14.25pt;width:445.2pt;height:463.8pt;z-index:251676676;visibility:visible;mso-wrap-style:square;mso-width-percent:0;mso-height-percent:0;mso-wrap-distance-left:9pt;mso-wrap-distance-top:3.6pt;mso-wrap-distance-right:9pt;mso-wrap-distance-bottom:3.6pt;mso-position-horizontal:absolute;mso-position-horizontal-relative:text;mso-position-vertical:absolute;mso-position-vertical-relative:text;mso-width-percent:0;mso-height-percent:0;mso-width-relative:margin;mso-height-relative:margin;v-text-anchor:top" o:gfxdata="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">
-                <v:textbox>
-                  <w:txbxContent>
-                    <w:p/>
-                  </w:txbxContent>
-                </v:textbox>
-                <w10:wrap type="square"/>
-              </v:shape>
-            </w:pict>
-          </mc:Fallback>
-        </mc:AlternateContent>
-      </w:r>
+        <w:t>ETL verification: (1) Row-count reconciliation - completed loans in OLTP (SELECT COUNT(*) FROM Loan WHERE ReturnDatetime IS NOT NULL) = 12,343 and FactLoan = 12,343; DimMember = Member = 301; DimBook = Book = 500; DimStaff = Staff = 51. (2) Measure reconciliation - SUM(DATEDIFF(ReturnDatetime, StartDatetime)) computed directly on the OLTP Loan table = 108,801 days, identical to SUM(LoanDurationDays) in FactLoan, proving the duration measure was derived correctly for every row. (3) Referential integrity - a LEFT JOIN from FactLoan to each dimension returns 0 orphan rows, and all foreign keys are enforced by constraints so no fact row can reference a missing dimension member. The verification queries are included at the bottom of DW_insert.sql.</w:t>
+      </w:r>
+    </w:p>
+    <w:p>
       <w:r>
         <w:br w:type="page"/>
       </w:r>
@@ -5928,15 +4094,7 @@
       </w:pPr>
       <w:r>
         <w:lastRenderedPageBreak/>
-        <w:t xml:space="preserve">Describe and discuss your analysis done using </w:t>
-      </w:r>
-      <w:proofErr w:type="gramStart"/>
-      <w:r>
-        <w:t>the DW</w:t>
-      </w:r>
-      <w:proofErr w:type="gramEnd"/>
-      <w:r>
-        <w:t xml:space="preserve">. </w:t>
+        <w:t xml:space="preserve">Describe and discuss your analysis done using the DW. </w:t>
       </w:r>
       <w:r>
         <w:t>Briefly e</w:t>
@@ -5963,15 +4121,7 @@
         <w:t xml:space="preserve"> if group size is 4.</w:t>
       </w:r>
       <w:r>
-        <w:t xml:space="preserve"> Separately submit all your queries in </w:t>
-      </w:r>
-      <w:proofErr w:type="spellStart"/>
-      <w:r>
-        <w:t>DW_query.sql</w:t>
-      </w:r>
-      <w:proofErr w:type="spellEnd"/>
-      <w:r>
-        <w:t xml:space="preserve">. (So do not include </w:t>
+        <w:t xml:space="preserve"> Separately submit all your queries in DW_query.sql. (So do not include </w:t>
       </w:r>
       <w:r>
         <w:t>your</w:t>
@@ -5982,221 +4132,787 @@
     </w:p>
     <w:p>
       <w:pPr>
+        <w:ind w:left="360"/>
+        <w:rPr>
+          <w:lang w:val="en-SG"/>
+        </w:rPr>
+      </w:pPr>
+    </w:p>
+    <w:p>
+      <w:pPr>
         <w:pStyle w:val="ListParagraph"/>
-      </w:pPr>
-      <w:r>
-        <w:t>1.</w:t>
-      </w:r>
-    </w:p>
-    <w:p>
-      <w:r>
-        <w:rPr>
-          <w:sz w:val="20"/>
-        </w:rPr>
-        <w:t xml:space="preserve">Objective: identify long-term and seasonal trends in loan volume by month and year (time dimension). Results: monthly completed loans grew from ~35/month in 2020 to 2,838 in December 2025, with a clear year-end surge every year (Dec 2022: 90 vs Nov 57; Dec 2024: 235 vs Nov 177; Dec 2025: 2,838 vs Nov 1,188). Average loan duration stays stable at 8-9.5 days throughout. Insight: borrowing activity is growing rapidly (roughly doubling year on year since 2023) and peaks sharply in November-December. </w:t>
-      </w:r>
-      <w:proofErr w:type="gramStart"/>
-      <w:r>
-        <w:rPr>
-          <w:sz w:val="20"/>
-        </w:rPr>
-        <w:t>Staffing</w:t>
-      </w:r>
-      <w:proofErr w:type="gramEnd"/>
-      <w:r>
-        <w:rPr>
-          <w:sz w:val="20"/>
-        </w:rPr>
-        <w:t xml:space="preserve"> and stock planning should anticipate the December peak; the stable duration shows the 14-day policy comfortably covers actual reading time.</w:t>
+        <w:numPr>
+          <w:ilvl w:val="0"/>
+          <w:numId w:val="46"/>
+        </w:numPr>
+        <w:rPr>
+          <w:b/>
+          <w:bCs/>
+          <w:lang w:val="en-SG"/>
+        </w:rPr>
+      </w:pPr>
+      <w:r>
+        <w:rPr>
+          <w:b/>
+          <w:bCs/>
+          <w:lang w:val="en-SG"/>
+        </w:rPr>
+        <w:t>Long-term and seasonal loan trends</w:t>
       </w:r>
     </w:p>
     <w:p>
       <w:pPr>
         <w:pStyle w:val="ListParagraph"/>
-      </w:pPr>
-      <w:r>
+        <w:rPr>
+          <w:lang w:val="en-SG"/>
+        </w:rPr>
+      </w:pPr>
+      <w:r>
+        <w:rPr>
+          <w:b/>
+          <w:bCs/>
+          <w:lang w:val="en-SG"/>
+        </w:rPr>
+        <w:t>Objective</w:t>
+      </w:r>
+      <w:r>
+        <w:rPr>
+          <w:lang w:val="en-SG"/>
+        </w:rPr>
+        <w:t>: Identify changes in completed-loan volume by month and year and determine whether loan duration changes over time.</w:t>
+      </w:r>
+    </w:p>
+    <w:p>
+      <w:pPr>
+        <w:pStyle w:val="ListParagraph"/>
+        <w:rPr>
+          <w:lang w:val="en-SG"/>
+        </w:rPr>
+      </w:pPr>
+      <w:r>
+        <w:rPr>
+          <w:b/>
+          <w:bCs/>
+          <w:lang w:val="en-SG"/>
+        </w:rPr>
+        <w:t>Results</w:t>
+      </w:r>
+      <w:r>
+        <w:rPr>
+          <w:lang w:val="en-SG"/>
+        </w:rPr>
+        <w:t>: Monthly completed loans rose from about 35 per month in 2020 to 2,838 in December 2025. A year-end surge appears repeatedly: December 2022 recorded 90 loans compared with 57 in November; December 2024 recorded 235 compared with 177; and December 2025 recorded 2,838 compared with 1,188. Average loan duration remained broadly stable at about 8 to 9.5 days.</w:t>
+      </w:r>
+    </w:p>
+    <w:p>
+      <w:pPr>
+        <w:pStyle w:val="ListParagraph"/>
+        <w:rPr>
+          <w:lang w:val="en-SG"/>
+        </w:rPr>
+      </w:pPr>
+      <w:r>
+        <w:rPr>
+          <w:b/>
+          <w:bCs/>
+          <w:lang w:val="en-SG"/>
+        </w:rPr>
+        <w:t>Insight</w:t>
+      </w:r>
+      <w:r>
+        <w:rPr>
+          <w:lang w:val="en-SG"/>
+        </w:rPr>
+        <w:t>: Demand is growing quickly and is heavily concentrated near the end of the year. Staffing, shelving and stock planning should be increased for November and December. The stable duration also suggests that the 14-day loan period is generally sufficient.</w:t>
+      </w:r>
+    </w:p>
+    <w:p>
+      <w:pPr>
+        <w:pStyle w:val="ListParagraph"/>
+        <w:rPr>
+          <w:lang w:val="en-SG"/>
+        </w:rPr>
+      </w:pPr>
+    </w:p>
+    <w:p>
+      <w:pPr>
+        <w:pStyle w:val="ListParagraph"/>
+        <w:numPr>
+          <w:ilvl w:val="0"/>
+          <w:numId w:val="46"/>
+        </w:numPr>
+        <w:rPr>
+          <w:b/>
+          <w:bCs/>
+          <w:lang w:val="en-SG"/>
+        </w:rPr>
+      </w:pPr>
+      <w:r>
+        <w:rPr>
+          <w:b/>
+          <w:bCs/>
+          <w:lang w:val="en-SG"/>
+        </w:rPr>
+        <w:t>Borrowing pattern by day of week</w:t>
+      </w:r>
+    </w:p>
+    <w:p>
+      <w:pPr>
+        <w:pStyle w:val="ListParagraph"/>
+        <w:rPr>
+          <w:lang w:val="en-SG"/>
+        </w:rPr>
+      </w:pPr>
+      <w:r>
+        <w:rPr>
+          <w:b/>
+          <w:bCs/>
+          <w:lang w:val="en-SG"/>
+        </w:rPr>
+        <w:t>Objective</w:t>
+      </w:r>
+      <w:r>
+        <w:rPr>
+          <w:lang w:val="en-SG"/>
+        </w:rPr>
+        <w:t>: Determine which days generate the highest borrowing activity so that daily operations can be scheduled more effectively.</w:t>
+      </w:r>
+    </w:p>
+    <w:p>
+      <w:pPr>
+        <w:pStyle w:val="ListParagraph"/>
+        <w:rPr>
+          <w:lang w:val="en-SG"/>
+        </w:rPr>
+      </w:pPr>
+      <w:r>
+        <w:rPr>
+          <w:b/>
+          <w:bCs/>
+          <w:lang w:val="en-SG"/>
+        </w:rPr>
+        <w:t>Results</w:t>
+      </w:r>
+      <w:r>
+        <w:rPr>
+          <w:lang w:val="en-SG"/>
+        </w:rPr>
+        <w:t>: Sunday accounts for 35.9% of completed loans and Saturday for 33.9%. Together, weekends contribute 69.8% of all loans. Each weekday contributes only about 5% to 7%, with Friday the lowest at 5.3%.</w:t>
+      </w:r>
+    </w:p>
+    <w:p>
+      <w:pPr>
+        <w:pStyle w:val="ListParagraph"/>
+        <w:rPr>
+          <w:lang w:val="en-SG"/>
+        </w:rPr>
+      </w:pPr>
+      <w:r>
+        <w:rPr>
+          <w:b/>
+          <w:bCs/>
+          <w:lang w:val="en-SG"/>
+        </w:rPr>
+        <w:t>Insight</w:t>
+      </w:r>
+      <w:r>
+        <w:rPr>
+          <w:lang w:val="en-SG"/>
+        </w:rPr>
+        <w:t>: Counter staffing and shelving should be concentrated on weekends. Lower-demand Fridays are more suitable for system maintenance, stock-taking and other work that may temporarily reduce service capacity.</w:t>
+      </w:r>
+    </w:p>
+    <w:p>
+      <w:pPr>
+        <w:pStyle w:val="ListParagraph"/>
+        <w:rPr>
+          <w:lang w:val="en-SG"/>
+        </w:rPr>
+      </w:pPr>
+    </w:p>
+    <w:p>
+      <w:pPr>
+        <w:pStyle w:val="ListParagraph"/>
+        <w:numPr>
+          <w:ilvl w:val="0"/>
+          <w:numId w:val="46"/>
+        </w:numPr>
+        <w:rPr>
+          <w:b/>
+          <w:bCs/>
+          <w:lang w:val="en-SG"/>
+        </w:rPr>
+      </w:pPr>
+      <w:r>
+        <w:rPr>
+          <w:b/>
+          <w:bCs/>
+          <w:lang w:val="en-SG"/>
+        </w:rPr>
+        <w:t>Genre popularity and demand per title</w:t>
+      </w:r>
+    </w:p>
+    <w:p>
+      <w:pPr>
+        <w:pStyle w:val="ListParagraph"/>
+        <w:rPr>
+          <w:lang w:val="en-SG"/>
+        </w:rPr>
+      </w:pPr>
+      <w:r>
+        <w:rPr>
+          <w:b/>
+          <w:bCs/>
+          <w:lang w:val="en-SG"/>
+        </w:rPr>
+        <w:t>Objective</w:t>
+      </w:r>
+      <w:r>
+        <w:rPr>
+          <w:lang w:val="en-SG"/>
+        </w:rPr>
+        <w:t>:</w:t>
+      </w:r>
+      <w:r>
+        <w:rPr>
+          <w:b/>
+          <w:bCs/>
+          <w:lang w:val="en-SG"/>
+        </w:rPr>
         <w:t xml:space="preserve"> </w:t>
       </w:r>
+      <w:r>
+        <w:rPr>
+          <w:lang w:val="en-SG"/>
+        </w:rPr>
+        <w:t>Compare total loans, loans per title and average reading duration across book genres.</w:t>
+      </w:r>
     </w:p>
     <w:p>
       <w:pPr>
         <w:pStyle w:val="ListParagraph"/>
-      </w:pPr>
-      <w:r>
-        <w:t>2.</w:t>
-      </w:r>
-    </w:p>
-    <w:p>
-      <w:r>
-        <w:rPr>
-          <w:sz w:val="20"/>
-        </w:rPr>
-        <w:t>Objective: find the borrowing pattern across days of the week to support staffing decisions (time dimension). Results: Sunday (35.9%) and Saturday (33.9%) together account for 69.8% of all loans; each weekday contributes only 5-7% (Friday lowest at 5.3%). Insight: demand is overwhelmingly a weekend phenomenon. Counter staffing and shelving operations should be concentrated on weekends, while system maintenance and stock-taking are best scheduled on Fridays.</w:t>
+        <w:rPr>
+          <w:lang w:val="en-SG"/>
+        </w:rPr>
+      </w:pPr>
+      <w:r>
+        <w:rPr>
+          <w:b/>
+          <w:bCs/>
+          <w:lang w:val="en-SG"/>
+        </w:rPr>
+        <w:t>Results</w:t>
+      </w:r>
+      <w:r>
+        <w:rPr>
+          <w:lang w:val="en-SG"/>
+        </w:rPr>
+        <w:t>: Research Journal has the highest total volume at 2,093 loans, but this equals only 21.8 loans per title across 96 titles. Young Adult has the highest demand per title at 31.2 loans across 39 titles. Children is also strong, with 1,873 loans and 28.0 loans per title. Average duration is similar across genres at about 8.4 to 9.3 days.</w:t>
       </w:r>
     </w:p>
     <w:p>
       <w:pPr>
         <w:pStyle w:val="ListParagraph"/>
-      </w:pPr>
+        <w:rPr>
+          <w:lang w:val="en-SG"/>
+        </w:rPr>
+      </w:pPr>
+      <w:r>
+        <w:rPr>
+          <w:b/>
+          <w:bCs/>
+          <w:lang w:val="en-SG"/>
+        </w:rPr>
+        <w:t>Insight</w:t>
+      </w:r>
+      <w:r>
+        <w:rPr>
+          <w:lang w:val="en-SG"/>
+        </w:rPr>
+        <w:t>: Research Journal leads mainly because its catalogue is large, while Young Adult and Children titles are borrowed more intensively. Additional copies would therefore be most useful in the Young Adult and Children categories.</w:t>
+      </w:r>
     </w:p>
     <w:p>
       <w:pPr>
         <w:pStyle w:val="ListParagraph"/>
-      </w:pPr>
-      <w:r>
-        <w:t>3.</w:t>
-      </w:r>
-    </w:p>
-    <w:p>
-      <w:r>
-        <w:rPr>
-          <w:sz w:val="20"/>
-        </w:rPr>
-        <w:t xml:space="preserve">Objective: compare genre popularity in absolute loans and loans per title, plus reading pace (book dimension). Results: Research Journal has the most total loans (2,093) but only 21.8 loans per title, while Young Adult has the highest intensity (31.2 loans per title from just 39 titles); Children </w:t>
-      </w:r>
-      <w:proofErr w:type="gramStart"/>
-      <w:r>
-        <w:rPr>
-          <w:sz w:val="20"/>
-        </w:rPr>
-        <w:t>is</w:t>
-      </w:r>
-      <w:proofErr w:type="gramEnd"/>
-      <w:r>
-        <w:rPr>
-          <w:sz w:val="20"/>
-        </w:rPr>
-        <w:t xml:space="preserve"> high on both (1,873 loans, 28.0 per title). Average duration is similar across genres (8.4-9.3 days). Insight: Research Journal's volume comes from its large catalogue (96 titles), whereas Young Adult and Children titles are individually in much higher demand - these genres are the best candidates for additional copies.</w:t>
-      </w:r>
+        <w:rPr>
+          <w:lang w:val="en-SG"/>
+        </w:rPr>
+      </w:pPr>
     </w:p>
     <w:p>
       <w:pPr>
         <w:pStyle w:val="ListParagraph"/>
-      </w:pPr>
+        <w:numPr>
+          <w:ilvl w:val="0"/>
+          <w:numId w:val="46"/>
+        </w:numPr>
+        <w:rPr>
+          <w:b/>
+          <w:bCs/>
+          <w:lang w:val="en-SG"/>
+        </w:rPr>
+      </w:pPr>
+      <w:r>
+        <w:rPr>
+          <w:b/>
+          <w:bCs/>
+          <w:lang w:val="en-SG"/>
+        </w:rPr>
+        <w:t>Members with unusually high or low activity</w:t>
+      </w:r>
     </w:p>
     <w:p>
       <w:pPr>
         <w:pStyle w:val="ListParagraph"/>
-      </w:pPr>
-      <w:r>
-        <w:t>4.</w:t>
-      </w:r>
-    </w:p>
-    <w:p>
-      <w:r>
-        <w:rPr>
-          <w:sz w:val="20"/>
-        </w:rPr>
-        <w:t xml:space="preserve">Objective: detect outstanding members with significantly higher/lower activity (member dimension; loan count and total duration measures). Results: the top borrower, Evan Seah (Premium), completed 454 loans; Isaac Wilson (Premium) holds books longest in aggregate (5,726 days over 409 loans). Two of the top five are only Basic tier (Jasper Johnson 331, Theodore Campbell 324 loans). The least active members completed only 9-11 loans. Insight: activity varies by a factor of ~50 </w:t>
-      </w:r>
-      <w:proofErr w:type="gramStart"/>
-      <w:r>
-        <w:rPr>
-          <w:sz w:val="20"/>
-        </w:rPr>
-        <w:t>between</w:t>
-      </w:r>
-      <w:proofErr w:type="gramEnd"/>
-      <w:r>
-        <w:rPr>
-          <w:sz w:val="20"/>
-        </w:rPr>
-        <w:t xml:space="preserve"> the most and least active members. The heavy Basic-tier borrowers are prime candidates for tier upgrades, and the low-activity group could be targeted with re-engagement campaigns.</w:t>
+        <w:rPr>
+          <w:lang w:val="en-SG"/>
+        </w:rPr>
+      </w:pPr>
+      <w:r>
+        <w:rPr>
+          <w:b/>
+          <w:bCs/>
+          <w:lang w:val="en-SG"/>
+        </w:rPr>
+        <w:t>Objective</w:t>
+      </w:r>
+      <w:r>
+        <w:rPr>
+          <w:lang w:val="en-SG"/>
+        </w:rPr>
+        <w:t>: Identify members whose number of completed loans or total borrowing duration differs substantially from the rest.</w:t>
       </w:r>
     </w:p>
     <w:p>
       <w:pPr>
         <w:pStyle w:val="ListParagraph"/>
-      </w:pPr>
+        <w:rPr>
+          <w:lang w:val="en-SG"/>
+        </w:rPr>
+      </w:pPr>
+      <w:r>
+        <w:rPr>
+          <w:b/>
+          <w:bCs/>
+          <w:lang w:val="en-SG"/>
+        </w:rPr>
+        <w:t>Results</w:t>
+      </w:r>
+      <w:r>
+        <w:rPr>
+          <w:lang w:val="en-SG"/>
+        </w:rPr>
+        <w:t>: Evan Seah, a Premium member, completed the most loans at 454. Isaac Wilson, also Premium, recorded the greatest total borrowing duration at 5,726 days across 409 loans. Jasper Johnson and Theodore Campbell are Basic members but still completed 331 and 324 loans respectively. The least active members completed only 9 to 11 loans.</w:t>
+      </w:r>
     </w:p>
     <w:p>
       <w:pPr>
         <w:pStyle w:val="ListParagraph"/>
-      </w:pPr>
-      <w:r>
-        <w:t>5.</w:t>
-      </w:r>
-    </w:p>
-    <w:p>
-      <w:r>
-        <w:rPr>
-          <w:sz w:val="20"/>
-        </w:rPr>
-        <w:t xml:space="preserve">Objective: examine whether membership tier relates to return discipline (member dimension x lateness measures). Results: late-return rate falls as tier rises - Basic 8.94%, Advanced 8.12%, Premium 7.94% - while average loan duration rises with tier (8.54 to 9.39 days). Insight: higher-tier members keep books slightly longer but return them more punctually, so the higher borrow limits given to upper tiers are not causing overdue problems. Late-return interventions (reminders, penalties) would be most </w:t>
-      </w:r>
-      <w:proofErr w:type="gramStart"/>
-      <w:r>
-        <w:rPr>
-          <w:sz w:val="20"/>
-        </w:rPr>
-        <w:t>effective</w:t>
-      </w:r>
-      <w:proofErr w:type="gramEnd"/>
-      <w:r>
-        <w:rPr>
-          <w:sz w:val="20"/>
-        </w:rPr>
-        <w:t xml:space="preserve"> aimed at Basic members.</w:t>
+        <w:rPr>
+          <w:lang w:val="en-SG"/>
+        </w:rPr>
+      </w:pPr>
+      <w:r>
+        <w:rPr>
+          <w:b/>
+          <w:bCs/>
+          <w:lang w:val="en-SG"/>
+        </w:rPr>
+        <w:lastRenderedPageBreak/>
+        <w:t>Insight</w:t>
+      </w:r>
+      <w:r>
+        <w:rPr>
+          <w:lang w:val="en-SG"/>
+        </w:rPr>
+        <w:t>: Member activity varies by roughly a factor of 50. Highly active Basic members may be suitable candidates for tier upgrades, while the least active group could be targeted through recommendations, reminders or re-engagement campaigns.</w:t>
       </w:r>
     </w:p>
     <w:p>
       <w:pPr>
         <w:pStyle w:val="ListParagraph"/>
+        <w:rPr>
+          <w:lang w:val="en-SG"/>
+        </w:rPr>
       </w:pPr>
     </w:p>
     <w:p>
       <w:pPr>
         <w:pStyle w:val="ListParagraph"/>
-      </w:pPr>
-      <w:r>
-        <w:t>6.</w:t>
-      </w:r>
-    </w:p>
-    <w:p>
-      <w:r>
-        <w:rPr>
-          <w:sz w:val="20"/>
-        </w:rPr>
-        <w:t xml:space="preserve">Objective: multi-dimensional analysis (genre x month) - do Children and Young Adult loans spike in school-holiday months? Results: Children loans climb from 65 in January to 486 in December (7.5x), with secondary highs in June-July (126/131); Young Adult mirrors this (51 in January to 301 in December). Insight: </w:t>
-      </w:r>
-      <w:proofErr w:type="gramStart"/>
-      <w:r>
-        <w:rPr>
-          <w:sz w:val="20"/>
-        </w:rPr>
-        <w:t>youth</w:t>
-      </w:r>
-      <w:proofErr w:type="gramEnd"/>
-      <w:r>
-        <w:rPr>
-          <w:sz w:val="20"/>
-        </w:rPr>
-        <w:t xml:space="preserve"> borrowing is strongly seasonal and concentrated in the November-December school holidays, compounding the overall year-end surge from Analysis 1. The library should time children's </w:t>
-      </w:r>
-      <w:proofErr w:type="spellStart"/>
-      <w:r>
-        <w:rPr>
-          <w:sz w:val="20"/>
-        </w:rPr>
-        <w:t>programmes</w:t>
-      </w:r>
-      <w:proofErr w:type="spellEnd"/>
-      <w:r>
-        <w:rPr>
-          <w:sz w:val="20"/>
-        </w:rPr>
-        <w:t>, new acquisitions and extra copies of popular youth titles for Q4.</w:t>
+        <w:numPr>
+          <w:ilvl w:val="0"/>
+          <w:numId w:val="46"/>
+        </w:numPr>
+        <w:rPr>
+          <w:b/>
+          <w:bCs/>
+          <w:lang w:val="en-SG"/>
+        </w:rPr>
+      </w:pPr>
+      <w:r>
+        <w:rPr>
+          <w:b/>
+          <w:bCs/>
+          <w:lang w:val="en-SG"/>
+        </w:rPr>
+        <w:t>Membership tier and return discipline</w:t>
       </w:r>
     </w:p>
     <w:p>
       <w:pPr>
         <w:pStyle w:val="ListParagraph"/>
       </w:pPr>
+      <w:r>
+        <w:rPr>
+          <w:b/>
+          <w:bCs/>
+        </w:rPr>
+        <w:t xml:space="preserve">Objective: </w:t>
+      </w:r>
+      <w:r>
+        <w:t>Examine whether membership tier is associated with late-return rate and average loan duration.</w:t>
+      </w:r>
     </w:p>
     <w:p>
       <w:pPr>
         <w:pStyle w:val="ListParagraph"/>
-      </w:pPr>
+        <w:rPr>
+          <w:lang w:val="en-SG"/>
+        </w:rPr>
+      </w:pPr>
+      <w:r>
+        <w:rPr>
+          <w:b/>
+          <w:bCs/>
+          <w:lang w:val="en-SG"/>
+        </w:rPr>
+        <w:t>Results</w:t>
+      </w:r>
+      <w:r>
+        <w:rPr>
+          <w:lang w:val="en-SG"/>
+        </w:rPr>
+        <w:t>: The late-return rate decreases as tier rises: Basic 8.94%, Advanced 8.12% and Premium 7.94%. At the same time, average loan duration increases from 8.54 days for Basic members to 9.39 days for Premium members.</w:t>
+      </w:r>
+    </w:p>
+    <w:p>
+      <w:pPr>
+        <w:pStyle w:val="ListParagraph"/>
+        <w:rPr>
+          <w:lang w:val="en-SG"/>
+        </w:rPr>
+      </w:pPr>
+      <w:r>
+        <w:rPr>
+          <w:b/>
+          <w:bCs/>
+          <w:lang w:val="en-SG"/>
+        </w:rPr>
+        <w:t>Insight</w:t>
+      </w:r>
+      <w:r>
+        <w:rPr>
+          <w:lang w:val="en-SG"/>
+        </w:rPr>
+        <w:t>: Higher-tier members keep books slightly longer but return them more punctually. Their higher borrowing limits do not appear to create a larger overdue problem. Reminders and late-return interventions would have the greatest effect when directed at Basic members.</w:t>
+      </w:r>
+    </w:p>
+    <w:p>
+      <w:pPr>
+        <w:pStyle w:val="ListParagraph"/>
+        <w:rPr>
+          <w:b/>
+          <w:bCs/>
+          <w:lang w:val="en-SG"/>
+        </w:rPr>
+      </w:pPr>
+    </w:p>
+    <w:p>
+      <w:pPr>
+        <w:pStyle w:val="ListParagraph"/>
+        <w:numPr>
+          <w:ilvl w:val="0"/>
+          <w:numId w:val="46"/>
+        </w:numPr>
+        <w:rPr>
+          <w:b/>
+          <w:bCs/>
+          <w:lang w:val="en-SG"/>
+        </w:rPr>
+      </w:pPr>
+      <w:r>
+        <w:rPr>
+          <w:b/>
+          <w:bCs/>
+          <w:lang w:val="en-SG"/>
+        </w:rPr>
+        <w:t>Youth-genre demand across the year</w:t>
+      </w:r>
+    </w:p>
+    <w:p>
+      <w:pPr>
+        <w:pStyle w:val="ListParagraph"/>
+        <w:rPr>
+          <w:lang w:val="en-SG"/>
+        </w:rPr>
+      </w:pPr>
+      <w:r>
+        <w:rPr>
+          <w:b/>
+          <w:bCs/>
+          <w:lang w:val="en-SG"/>
+        </w:rPr>
+        <w:t>Objective</w:t>
+      </w:r>
+      <w:r>
+        <w:rPr>
+          <w:lang w:val="en-SG"/>
+        </w:rPr>
+        <w:t>: Determine whether Children and Young Adult borrowing rises during school-holiday periods.</w:t>
+      </w:r>
+    </w:p>
+    <w:p>
+      <w:pPr>
+        <w:pStyle w:val="ListParagraph"/>
+        <w:rPr>
+          <w:lang w:val="en-SG"/>
+        </w:rPr>
+      </w:pPr>
+      <w:r>
+        <w:rPr>
+          <w:b/>
+          <w:bCs/>
+          <w:lang w:val="en-SG"/>
+        </w:rPr>
+        <w:t>Results</w:t>
+      </w:r>
+      <w:r>
+        <w:rPr>
+          <w:lang w:val="en-SG"/>
+        </w:rPr>
+        <w:t>: Children loans rise from 65 in January to 486 in December, a 7.5-fold increase, with secondary peaks of 126 and 131 in June and July. Young Adult follows the same pattern, rising from 51 loans in January to 301 in December.</w:t>
+      </w:r>
+    </w:p>
+    <w:p>
+      <w:pPr>
+        <w:pStyle w:val="ListParagraph"/>
+        <w:rPr>
+          <w:lang w:val="en-SG"/>
+        </w:rPr>
+      </w:pPr>
+      <w:r>
+        <w:rPr>
+          <w:b/>
+          <w:bCs/>
+          <w:lang w:val="en-SG"/>
+        </w:rPr>
+        <w:t>Insight</w:t>
+      </w:r>
+      <w:r>
+        <w:rPr>
+          <w:lang w:val="en-SG"/>
+        </w:rPr>
+        <w:t>: Youth borrowing is strongly seasonal and is concentrated in the November-December school-holiday period. The library should schedule programmes, acquisitions and extra copies of popular youth titles before the fourth quarter.</w:t>
+      </w:r>
+    </w:p>
+    <w:p>
+      <w:pPr>
+        <w:pStyle w:val="ListParagraph"/>
+        <w:rPr>
+          <w:lang w:val="en-SG"/>
+        </w:rPr>
+      </w:pPr>
+    </w:p>
+    <w:p>
+      <w:pPr>
+        <w:pStyle w:val="ListParagraph"/>
+        <w:numPr>
+          <w:ilvl w:val="0"/>
+          <w:numId w:val="46"/>
+        </w:numPr>
+        <w:rPr>
+          <w:b/>
+          <w:bCs/>
+          <w:lang w:val="en-SG"/>
+        </w:rPr>
+      </w:pPr>
+      <w:r>
+        <w:rPr>
+          <w:b/>
+          <w:bCs/>
+          <w:lang w:val="en-SG"/>
+        </w:rPr>
+        <w:t>Staff workload by department and employment type</w:t>
+      </w:r>
+    </w:p>
+    <w:p>
+      <w:pPr>
+        <w:pStyle w:val="ListParagraph"/>
+        <w:rPr>
+          <w:lang w:val="en-SG"/>
+        </w:rPr>
+      </w:pPr>
+      <w:r>
+        <w:rPr>
+          <w:b/>
+          <w:bCs/>
+          <w:lang w:val="en-SG"/>
+        </w:rPr>
+        <w:t>Objective</w:t>
+      </w:r>
+      <w:r>
+        <w:rPr>
+          <w:lang w:val="en-SG"/>
+        </w:rPr>
+        <w:t>: Compare completed-loan workload across staff departments and employment types, together with average loan duration and late-return rate.</w:t>
+      </w:r>
+    </w:p>
+    <w:p>
+      <w:pPr>
+        <w:pStyle w:val="ListParagraph"/>
+        <w:rPr>
+          <w:lang w:val="en-SG"/>
+        </w:rPr>
+      </w:pPr>
+      <w:r>
+        <w:rPr>
+          <w:b/>
+          <w:bCs/>
+          <w:lang w:val="en-SG"/>
+        </w:rPr>
+        <w:t>Results</w:t>
+      </w:r>
+      <w:r>
+        <w:rPr>
+          <w:lang w:val="en-SG"/>
+        </w:rPr>
+        <w:t xml:space="preserve">: </w:t>
+      </w:r>
+      <w:r>
+        <w:rPr>
+          <w:highlight w:val="yellow"/>
+          <w:lang w:val="en-SG"/>
+        </w:rPr>
+        <w:t>[Paste the actual Analysis 7 output here after running the added SQL query. State which department/employment-type group processed the most completed loans and compare its late-return rate with the other groups.]</w:t>
+      </w:r>
+    </w:p>
+    <w:p>
+      <w:pPr>
+        <w:pStyle w:val="ListParagraph"/>
+        <w:rPr>
+          <w:lang w:val="en-SG"/>
+        </w:rPr>
+      </w:pPr>
+      <w:r>
+        <w:rPr>
+          <w:b/>
+          <w:bCs/>
+          <w:lang w:val="en-SG"/>
+        </w:rPr>
+        <w:t>Insight</w:t>
+      </w:r>
+      <w:r>
+        <w:rPr>
+          <w:lang w:val="en-SG"/>
+        </w:rPr>
+        <w:t>: This analysis shows where circulation work is concentrated and whether full-time and part-time staff handle different transaction volumes. The result can support staff deployment, training and workload balancing.</w:t>
+      </w:r>
+    </w:p>
+    <w:p>
+      <w:pPr>
+        <w:pStyle w:val="ListParagraph"/>
+        <w:rPr>
+          <w:lang w:val="en-SG"/>
+        </w:rPr>
+      </w:pPr>
+    </w:p>
+    <w:p>
+      <w:pPr>
+        <w:pStyle w:val="ListParagraph"/>
+        <w:numPr>
+          <w:ilvl w:val="0"/>
+          <w:numId w:val="46"/>
+        </w:numPr>
+        <w:rPr>
+          <w:b/>
+          <w:bCs/>
+          <w:lang w:val="en-SG"/>
+        </w:rPr>
+      </w:pPr>
+      <w:r>
+        <w:rPr>
+          <w:b/>
+          <w:bCs/>
+          <w:lang w:val="en-SG"/>
+        </w:rPr>
+        <w:t>Severity of late returns</w:t>
+      </w:r>
+    </w:p>
+    <w:p>
+      <w:pPr>
+        <w:pStyle w:val="ListParagraph"/>
+        <w:rPr>
+          <w:lang w:val="en-SG"/>
+        </w:rPr>
+      </w:pPr>
+      <w:r>
+        <w:rPr>
+          <w:b/>
+          <w:bCs/>
+          <w:lang w:val="en-SG"/>
+        </w:rPr>
+        <w:t>Objective</w:t>
+      </w:r>
+      <w:r>
+        <w:rPr>
+          <w:lang w:val="en-SG"/>
+        </w:rPr>
+        <w:t>: Separate loans returned on time or early from loans that were 1-3 days, 4-7 days or at least 8 days late.</w:t>
+      </w:r>
+    </w:p>
+    <w:p>
+      <w:pPr>
+        <w:pStyle w:val="ListParagraph"/>
+        <w:rPr>
+          <w:lang w:val="en-SG"/>
+        </w:rPr>
+      </w:pPr>
+      <w:r>
+        <w:rPr>
+          <w:b/>
+          <w:bCs/>
+          <w:lang w:val="en-SG"/>
+        </w:rPr>
+        <w:t>Results</w:t>
+      </w:r>
+      <w:r>
+        <w:rPr>
+          <w:lang w:val="en-SG"/>
+        </w:rPr>
+        <w:t xml:space="preserve">: </w:t>
+      </w:r>
+      <w:r>
+        <w:rPr>
+          <w:highlight w:val="yellow"/>
+          <w:lang w:val="en-SG"/>
+        </w:rPr>
+        <w:t>[Paste the actual Analysis 8 output here after running the added SQL query. Report the count and percentage in each return-timing band.]</w:t>
+      </w:r>
+    </w:p>
+    <w:p>
+      <w:pPr>
+        <w:pStyle w:val="ListParagraph"/>
+        <w:rPr>
+          <w:lang w:val="en-SG"/>
+        </w:rPr>
+      </w:pPr>
+      <w:r>
+        <w:rPr>
+          <w:lang w:val="en-SG"/>
+        </w:rPr>
+        <w:t>Insight: A severity breakdown distinguishes occasional minor delays from serious overdue behaviour. Mild cases may only need reminders, while repeated or long delays may justify stronger follow-up or penalties.</w:t>
+      </w:r>
     </w:p>
     <w:sectPr>
       <w:headerReference w:type="even" r:id="rId14"/>
@@ -6390,7 +5106,7 @@
               <v:stroke joinstyle="miter"/>
               <v:path gradientshapeok="t" o:connecttype="rect"/>
             </v:shapetype>
-            <v:shape id="_x0000_s1031" type="#_x0000_t202" alt="Official (Open)" style="position:absolute;margin-left:0;margin-top:0;width:59.1pt;height:27.2pt;z-index:251659264;visibility:visible;mso-wrap-style:none;mso-wrap-distance-left:0;mso-wrap-distance-top:0;mso-wrap-distance-right:0;mso-wrap-distance-bottom:0;mso-position-horizontal:center;mso-position-horizontal-relative:page;mso-position-vertical:top;mso-position-vertical-relative:page;v-text-anchor:top" o:gfxdata="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" filled="f" stroked="f">
+            <v:shape id="_x0000_s1030" type="#_x0000_t202" alt="Official (Open)" style="position:absolute;margin-left:0;margin-top:0;width:59.1pt;height:27.2pt;z-index:251659264;visibility:visible;mso-wrap-style:none;mso-wrap-distance-left:0;mso-wrap-distance-top:0;mso-wrap-distance-right:0;mso-wrap-distance-bottom:0;mso-position-horizontal:center;mso-position-horizontal-relative:page;mso-position-vertical:top;mso-position-vertical-relative:page;v-text-anchor:top" o:gfxdata="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" filled="f" stroked="f">
               <v:textbox style="mso-fit-shape-to-text:t" inset="0,15pt,0,0">
                 <w:txbxContent>
                   <w:p>
@@ -6516,7 +5232,7 @@
               <v:stroke joinstyle="miter"/>
               <v:path gradientshapeok="t" o:connecttype="rect"/>
             </v:shapetype>
-            <v:shape id="Text Box 3" o:spid="_x0000_s1032" type="#_x0000_t202" alt="Official (Open)" style="position:absolute;margin-left:0;margin-top:0;width:59.1pt;height:27.2pt;z-index:251660288;visibility:visible;mso-wrap-style:none;mso-wrap-distance-left:0;mso-wrap-distance-top:0;mso-wrap-distance-right:0;mso-wrap-distance-bottom:0;mso-position-horizontal:center;mso-position-horizontal-relative:page;mso-position-vertical:top;mso-position-vertical-relative:page;v-text-anchor:top" o:gfxdata="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" filled="f" stroked="f">
+            <v:shape id="Text Box 3" o:spid="_x0000_s1031" type="#_x0000_t202" alt="Official (Open)" style="position:absolute;margin-left:0;margin-top:0;width:59.1pt;height:27.2pt;z-index:251660288;visibility:visible;mso-wrap-style:none;mso-wrap-distance-left:0;mso-wrap-distance-top:0;mso-wrap-distance-right:0;mso-wrap-distance-bottom:0;mso-position-horizontal:center;mso-position-horizontal-relative:page;mso-position-vertical:top;mso-position-vertical-relative:page;v-text-anchor:top" o:gfxdata="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" filled="f" stroked="f">
               <v:textbox style="mso-fit-shape-to-text:t" inset="0,15pt,0,0">
                 <w:txbxContent>
                   <w:p>
@@ -6641,7 +5357,7 @@
               <v:stroke joinstyle="miter"/>
               <v:path gradientshapeok="t" o:connecttype="rect"/>
             </v:shapetype>
-            <v:shape id="Text Box 1" o:spid="_x0000_s1033" type="#_x0000_t202" alt="Official (Open)" style="position:absolute;left:0;text-align:left;margin-left:0;margin-top:0;width:59.1pt;height:27.2pt;z-index:251658240;visibility:visible;mso-wrap-style:none;mso-wrap-distance-left:0;mso-wrap-distance-top:0;mso-wrap-distance-right:0;mso-wrap-distance-bottom:0;mso-position-horizontal:center;mso-position-horizontal-relative:page;mso-position-vertical:top;mso-position-vertical-relative:page;v-text-anchor:top" o:gfxdata="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" filled="f" stroked="f">
+            <v:shape id="Text Box 1" o:spid="_x0000_s1032" type="#_x0000_t202" alt="Official (Open)" style="position:absolute;left:0;text-align:left;margin-left:0;margin-top:0;width:59.1pt;height:27.2pt;z-index:251658240;visibility:visible;mso-wrap-style:none;mso-wrap-distance-left:0;mso-wrap-distance-top:0;mso-wrap-distance-right:0;mso-wrap-distance-bottom:0;mso-position-horizontal:center;mso-position-horizontal-relative:page;mso-position-vertical:top;mso-position-vertical-relative:page;v-text-anchor:top" o:gfxdata="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" filled="f" stroked="f">
               <v:textbox style="mso-fit-shape-to-text:t" inset="0,15pt,0,0">
                 <w:txbxContent>
                   <w:p>
@@ -10969,6 +9685,95 @@
     </w:lvl>
   </w:abstractNum>
   <w:abstractNum w:abstractNumId="43" w15:restartNumberingAfterBreak="0">
+    <w:nsid w:val="6DE708ED"/>
+    <w:multiLevelType w:val="hybridMultilevel"/>
+    <w:tmpl w:val="A2F62F0A"/>
+    <w:lvl w:ilvl="0" w:tplc="4809000F">
+      <w:start w:val="1"/>
+      <w:numFmt w:val="decimal"/>
+      <w:lvlText w:val="%1."/>
+      <w:lvlJc w:val="left"/>
+      <w:pPr>
+        <w:ind w:left="720" w:hanging="360"/>
+      </w:pPr>
+      <w:rPr>
+        <w:rFonts w:hint="default"/>
+      </w:rPr>
+    </w:lvl>
+    <w:lvl w:ilvl="1" w:tplc="48090019" w:tentative="1">
+      <w:start w:val="1"/>
+      <w:numFmt w:val="lowerLetter"/>
+      <w:lvlText w:val="%2."/>
+      <w:lvlJc w:val="left"/>
+      <w:pPr>
+        <w:ind w:left="1440" w:hanging="360"/>
+      </w:pPr>
+    </w:lvl>
+    <w:lvl w:ilvl="2" w:tplc="4809001B" w:tentative="1">
+      <w:start w:val="1"/>
+      <w:numFmt w:val="lowerRoman"/>
+      <w:lvlText w:val="%3."/>
+      <w:lvlJc w:val="right"/>
+      <w:pPr>
+        <w:ind w:left="2160" w:hanging="180"/>
+      </w:pPr>
+    </w:lvl>
+    <w:lvl w:ilvl="3" w:tplc="4809000F" w:tentative="1">
+      <w:start w:val="1"/>
+      <w:numFmt w:val="decimal"/>
+      <w:lvlText w:val="%4."/>
+      <w:lvlJc w:val="left"/>
+      <w:pPr>
+        <w:ind w:left="2880" w:hanging="360"/>
+      </w:pPr>
+    </w:lvl>
+    <w:lvl w:ilvl="4" w:tplc="48090019" w:tentative="1">
+      <w:start w:val="1"/>
+      <w:numFmt w:val="lowerLetter"/>
+      <w:lvlText w:val="%5."/>
+      <w:lvlJc w:val="left"/>
+      <w:pPr>
+        <w:ind w:left="3600" w:hanging="360"/>
+      </w:pPr>
+    </w:lvl>
+    <w:lvl w:ilvl="5" w:tplc="4809001B" w:tentative="1">
+      <w:start w:val="1"/>
+      <w:numFmt w:val="lowerRoman"/>
+      <w:lvlText w:val="%6."/>
+      <w:lvlJc w:val="right"/>
+      <w:pPr>
+        <w:ind w:left="4320" w:hanging="180"/>
+      </w:pPr>
+    </w:lvl>
+    <w:lvl w:ilvl="6" w:tplc="4809000F" w:tentative="1">
+      <w:start w:val="1"/>
+      <w:numFmt w:val="decimal"/>
+      <w:lvlText w:val="%7."/>
+      <w:lvlJc w:val="left"/>
+      <w:pPr>
+        <w:ind w:left="5040" w:hanging="360"/>
+      </w:pPr>
+    </w:lvl>
+    <w:lvl w:ilvl="7" w:tplc="48090019" w:tentative="1">
+      <w:start w:val="1"/>
+      <w:numFmt w:val="lowerLetter"/>
+      <w:lvlText w:val="%8."/>
+      <w:lvlJc w:val="left"/>
+      <w:pPr>
+        <w:ind w:left="5760" w:hanging="360"/>
+      </w:pPr>
+    </w:lvl>
+    <w:lvl w:ilvl="8" w:tplc="4809001B" w:tentative="1">
+      <w:start w:val="1"/>
+      <w:numFmt w:val="lowerRoman"/>
+      <w:lvlText w:val="%9."/>
+      <w:lvlJc w:val="right"/>
+      <w:pPr>
+        <w:ind w:left="6480" w:hanging="180"/>
+      </w:pPr>
+    </w:lvl>
+  </w:abstractNum>
+  <w:abstractNum w:abstractNumId="44" w15:restartNumberingAfterBreak="0">
     <w:nsid w:val="70A37E0E"/>
     <w:multiLevelType w:val="multilevel"/>
     <w:tmpl w:val="62AA99D6"/>
@@ -11109,7 +9914,7 @@
       </w:pPr>
     </w:lvl>
   </w:abstractNum>
-  <w:abstractNum w:abstractNumId="44" w15:restartNumberingAfterBreak="0">
+  <w:abstractNum w:abstractNumId="45" w15:restartNumberingAfterBreak="0">
     <w:nsid w:val="7F3B5A94"/>
     <w:multiLevelType w:val="hybridMultilevel"/>
     <w:tmpl w:val="F342B1FA"/>
@@ -11199,7 +10004,7 @@
     <w:abstractNumId w:val="4"/>
   </w:num>
   <w:num w:numId="2" w16cid:durableId="210114857">
-    <w:abstractNumId w:val="43"/>
+    <w:abstractNumId w:val="44"/>
   </w:num>
   <w:num w:numId="3" w16cid:durableId="321541066">
     <w:abstractNumId w:val="10"/>
@@ -11232,7 +10037,7 @@
     <w:abstractNumId w:val="40"/>
   </w:num>
   <w:num w:numId="13" w16cid:durableId="1375688937">
-    <w:abstractNumId w:val="44"/>
+    <w:abstractNumId w:val="45"/>
   </w:num>
   <w:num w:numId="14" w16cid:durableId="1879467025">
     <w:abstractNumId w:val="38"/>
@@ -11329,6 +10134,9 @@
   </w:num>
   <w:num w:numId="45" w16cid:durableId="2012833079">
     <w:abstractNumId w:val="29"/>
+  </w:num>
+  <w:num w:numId="46" w16cid:durableId="1549612474">
+    <w:abstractNumId w:val="43"/>
   </w:num>
   <w:numIdMacAtCleanup w:val="22"/>
 </w:numbering>
@@ -11953,7 +10761,6 @@
   <w:style w:type="character" w:default="1" w:styleId="DefaultParagraphFont">
     <w:name w:val="Default Paragraph Font"/>
     <w:uiPriority w:val="1"/>
-    <w:semiHidden/>
     <w:unhideWhenUsed/>
   </w:style>
   <w:style w:type="table" w:default="1" w:styleId="TableNormal">
@@ -13644,10 +12451,6 @@
 </file>
 
 <file path=customXml/item1.xml><?xml version="1.0" encoding="utf-8"?>
-<b:Sources xmlns:b="http://schemas.openxmlformats.org/officeDocument/2006/bibliography" xmlns="http://schemas.openxmlformats.org/officeDocument/2006/bibliography" SelectedStyle="\MLA.XSL" StyleName="MLA"/>
-</file>
-
-<file path=customXml/item2.xml><?xml version="1.0" encoding="utf-8"?>
 <p:properties xmlns:p="http://schemas.microsoft.com/office/2006/metadata/properties" xmlns:xsi="http://www.w3.org/2001/XMLSchema-instance" xmlns:pc="http://schemas.microsoft.com/office/infopath/2007/PartnerControls">
   <documentManagement>
     <_ip_UnifiedCompliancePolicyUIAction xmlns="http://schemas.microsoft.com/sharepoint/v3" xsi:nil="true"/>
@@ -13660,16 +12463,11 @@
 </p:properties>
 </file>
 
-<file path=customXml/item3.xml><?xml version="1.0" encoding="utf-8"?>
-<?mso-contentType ?>
-<FormTemplates xmlns="http://schemas.microsoft.com/sharepoint/v3/contenttype/forms">
-  <Display>DocumentLibraryForm</Display>
-  <Edit>DocumentLibraryForm</Edit>
-  <New>DocumentLibraryForm</New>
-</FormTemplates>
+<file path=customXml/item2.xml><?xml version="1.0" encoding="utf-8"?>
+<b:Sources xmlns:b="http://schemas.openxmlformats.org/officeDocument/2006/bibliography" xmlns="http://schemas.openxmlformats.org/officeDocument/2006/bibliography" SelectedStyle="\MLA.XSL" StyleName="MLA"/>
 </file>
 
-<file path=customXml/item4.xml><?xml version="1.0" encoding="utf-8"?>
+<file path=customXml/item3.xml><?xml version="1.0" encoding="utf-8"?>
 <ct:contentTypeSchema xmlns:ct="http://schemas.microsoft.com/office/2006/metadata/contentType" xmlns:ma="http://schemas.microsoft.com/office/2006/metadata/properties/metaAttributes" ct:_="" ma:_="" ma:contentTypeName="Document" ma:contentTypeID="0x01010088CE47F754C76E4E816A66E05339225A" ma:contentTypeVersion="13" ma:contentTypeDescription="Create a new document." ma:contentTypeScope="" ma:versionID="076a7d54fdb0b635cd2e2f75f54c1b16">
   <xsd:schema xmlns:xsd="http://www.w3.org/2001/XMLSchema" xmlns:xs="http://www.w3.org/2001/XMLSchema" xmlns:p="http://schemas.microsoft.com/office/2006/metadata/properties" xmlns:ns1="http://schemas.microsoft.com/sharepoint/v3" xmlns:ns2="72f5c66d-4f9b-4523-9c59-0147434cba56" xmlns:ns3="d5671106-6e7e-4942-8aee-9bcd5dd7e66b" targetNamespace="http://schemas.microsoft.com/office/2006/metadata/properties" ma:root="true" ma:fieldsID="733d59cbe7e7cf634dfb746df9f4de01" ns1:_="" ns2:_="" ns3:_="">
     <xsd:import namespace="http://schemas.microsoft.com/sharepoint/v3"/>
@@ -13881,15 +12679,16 @@
 </ct:contentTypeSchema>
 </file>
 
-<file path=customXml/itemProps1.xml><?xml version="1.0" encoding="utf-8"?>
-<ds:datastoreItem xmlns:ds="http://schemas.openxmlformats.org/officeDocument/2006/customXml" ds:itemID="{6A404842-743E-4BBC-99A7-70A911F17733}">
-  <ds:schemaRefs>
-    <ds:schemaRef ds:uri="http://schemas.openxmlformats.org/officeDocument/2006/bibliography"/>
-  </ds:schemaRefs>
-</ds:datastoreItem>
+<file path=customXml/item4.xml><?xml version="1.0" encoding="utf-8"?>
+<?mso-contentType ?>
+<FormTemplates xmlns="http://schemas.microsoft.com/sharepoint/v3/contenttype/forms">
+  <Display>DocumentLibraryForm</Display>
+  <Edit>DocumentLibraryForm</Edit>
+  <New>DocumentLibraryForm</New>
+</FormTemplates>
 </file>
 
-<file path=customXml/itemProps2.xml><?xml version="1.0" encoding="utf-8"?>
+<file path=customXml/itemProps1.xml><?xml version="1.0" encoding="utf-8"?>
 <ds:datastoreItem xmlns:ds="http://schemas.openxmlformats.org/officeDocument/2006/customXml" ds:itemID="{2FE68222-D1D7-4405-9D8B-445901EEA94E}">
   <ds:schemaRefs>
     <ds:schemaRef ds:uri="http://schemas.microsoft.com/office/2006/metadata/properties"/>
@@ -13901,15 +12700,15 @@
 </ds:datastoreItem>
 </file>
 
-<file path=customXml/itemProps3.xml><?xml version="1.0" encoding="utf-8"?>
-<ds:datastoreItem xmlns:ds="http://schemas.openxmlformats.org/officeDocument/2006/customXml" ds:itemID="{C793F174-B33D-4AAE-9E3B-9A362A6F4892}">
+<file path=customXml/itemProps2.xml><?xml version="1.0" encoding="utf-8"?>
+<ds:datastoreItem xmlns:ds="http://schemas.openxmlformats.org/officeDocument/2006/customXml" ds:itemID="{6A404842-743E-4BBC-99A7-70A911F17733}">
   <ds:schemaRefs>
-    <ds:schemaRef ds:uri="http://schemas.microsoft.com/sharepoint/v3/contenttype/forms"/>
+    <ds:schemaRef ds:uri="http://schemas.openxmlformats.org/officeDocument/2006/bibliography"/>
   </ds:schemaRefs>
 </ds:datastoreItem>
 </file>
 
-<file path=customXml/itemProps4.xml><?xml version="1.0" encoding="utf-8"?>
+<file path=customXml/itemProps3.xml><?xml version="1.0" encoding="utf-8"?>
 <ds:datastoreItem xmlns:ds="http://schemas.openxmlformats.org/officeDocument/2006/customXml" ds:itemID="{77819383-3D86-46CF-A5E7-D6F9C756A7E0}">
   <ds:schemaRefs>
     <ds:schemaRef ds:uri="http://schemas.microsoft.com/office/2006/metadata/contentType"/>
@@ -13927,4 +12726,12 @@
     <ds:schemaRef ds:uri="http://schemas.microsoft.com/internal/obd"/>
   </ds:schemaRefs>
 </ds:datastoreItem>
+</file>
+
+<file path=customXml/itemProps4.xml><?xml version="1.0" encoding="utf-8"?>
+<ds:datastoreItem xmlns:ds="http://schemas.openxmlformats.org/officeDocument/2006/customXml" ds:itemID="{C793F174-B33D-4AAE-9E3B-9A362A6F4892}">
+  <ds:schemaRefs>
+    <ds:schemaRef ds:uri="http://schemas.microsoft.com/sharepoint/v3/contenttype/forms"/>
+  </ds:schemaRefs>
+</ds:datastoreItem>
 </file>
</xml_diff>

<commit_message>
deleted some more useless files, changed doc a bit (needs further refinement), mongosh create works, dw changed a bit and dw query updated, added csv for extracted data
</commit_message>
<xml_diff>
--- a/2B21-04_group_submission.docx
+++ b/2B21-04_group_submission.docx
@@ -1,6 +1,6 @@
 
 <file path=word/document.xml><?xml version="1.0" encoding="utf-8"?>
-<w:document xmlns:wpc="http://schemas.microsoft.com/office/word/2010/wordprocessingCanvas" xmlns:cx="http://schemas.microsoft.com/office/drawing/2014/chartex" xmlns:cx1="http://schemas.microsoft.com/office/drawing/2015/9/8/chartex" xmlns:cx2="http://schemas.microsoft.com/office/drawing/2015/10/21/chartex" xmlns:cx3="http://schemas.microsoft.com/office/drawing/2016/5/9/chartex" xmlns:cx4="http://schemas.microsoft.com/office/drawing/2016/5/10/chartex" xmlns:cx5="http://schemas.microsoft.com/office/drawing/2016/5/11/chartex" xmlns:cx6="http://schemas.microsoft.com/office/drawing/2016/5/12/chartex" xmlns:cx7="http://schemas.microsoft.com/office/drawing/2016/5/13/chartex" xmlns:cx8="http://schemas.microsoft.com/office/drawing/2016/5/14/chartex" xmlns:mc="http://schemas.openxmlformats.org/markup-compatibility/2006" xmlns:aink="http://schemas.microsoft.com/office/drawing/2016/ink" xmlns:am3d="http://schemas.microsoft.com/office/drawing/2017/model3d" xmlns:o="urn:schemas-microsoft-com:office:office" xmlns:oel="http://schemas.microsoft.com/office/2019/extlst" xmlns:r="http://schemas.openxmlformats.org/officeDocument/2006/relationships" xmlns:m="http://schemas.openxmlformats.org/officeDocument/2006/math" xmlns:v="urn:schemas-microsoft-com:vml" xmlns:wp14="http://schemas.microsoft.com/office/word/2010/wordprocessingDrawing" xmlns:wp="http://schemas.openxmlformats.org/drawingml/2006/wordprocessingDrawing" xmlns:w10="urn:schemas-microsoft-com:office:word" xmlns:w="http://schemas.openxmlformats.org/wordprocessingml/2006/main" xmlns:w14="http://schemas.microsoft.com/office/word/2010/wordml" xmlns:w15="http://schemas.microsoft.com/office/word/2012/wordml" xmlns:w16cex="http://schemas.microsoft.com/office/word/2018/wordml/cex" xmlns:w16cid="http://schemas.microsoft.com/office/word/2016/wordml/cid" xmlns:w16="http://schemas.microsoft.com/office/word/2018/wordml" xmlns:w16du="http://schemas.microsoft.com/office/word/2023/wordml/word16du" xmlns:w16sdtdh="http://schemas.microsoft.com/office/word/2020/wordml/sdtdatahash" xmlns:w16sdtfl="http://schemas.microsoft.com/office/word/2024/wordml/sdtformatlock" xmlns:w16se="http://schemas.microsoft.com/office/word/2015/wordml/symex" xmlns:wpg="http://schemas.microsoft.com/office/word/2010/wordprocessingGroup" xmlns:wpi="http://schemas.microsoft.com/office/word/2010/wordprocessingInk" xmlns:wne="http://schemas.microsoft.com/office/word/2006/wordml" xmlns:wps="http://schemas.microsoft.com/office/word/2010/wordprocessingShape" mc:Ignorable="w14 w15 w16se w16cid w16 w16cex w16sdtdh w16sdtfl w16du wp14">
+<w:document xmlns:wpc="http://schemas.microsoft.com/office/word/2010/wordprocessingCanvas" xmlns:cx="http://schemas.microsoft.com/office/drawing/2014/chartex" xmlns:cx1="http://schemas.microsoft.com/office/drawing/2015/9/8/chartex" xmlns:cx2="http://schemas.microsoft.com/office/drawing/2015/10/21/chartex" xmlns:cx3="http://schemas.microsoft.com/office/drawing/2016/5/9/chartex" xmlns:cx4="http://schemas.microsoft.com/office/drawing/2016/5/10/chartex" xmlns:cx5="http://schemas.microsoft.com/office/drawing/2016/5/11/chartex" xmlns:cx6="http://schemas.microsoft.com/office/drawing/2016/5/12/chartex" xmlns:cx7="http://schemas.microsoft.com/office/drawing/2016/5/13/chartex" xmlns:cx8="http://schemas.microsoft.com/office/drawing/2016/5/14/chartex" xmlns:mc="http://schemas.openxmlformats.org/markup-compatibility/2006" xmlns:aink="http://schemas.microsoft.com/office/drawing/2016/ink" xmlns:am3d="http://schemas.microsoft.com/office/drawing/2017/model3d" xmlns:o="urn:schemas-microsoft-com:office:office" xmlns:oel="http://schemas.microsoft.com/office/2019/extlst" xmlns:r="http://schemas.openxmlformats.org/officeDocument/2006/relationships" xmlns:m="http://schemas.openxmlformats.org/officeDocument/2006/math" xmlns:v="urn:schemas-microsoft-com:vml" xmlns:wp14="http://schemas.microsoft.com/office/word/2010/wordprocessingDrawing" xmlns:wp="http://schemas.openxmlformats.org/drawingml/2006/wordprocessingDrawing" xmlns:w10="urn:schemas-microsoft-com:office:word" xmlns:w="http://schemas.openxmlformats.org/wordprocessingml/2006/main" xmlns:w14="http://schemas.microsoft.com/office/word/2010/wordml" xmlns:w15="http://schemas.microsoft.com/office/word/2012/wordml" xmlns:w16cei="http://schemas.microsoft.com/office/word/2026/wordml/cei" xmlns:w16cex="http://schemas.microsoft.com/office/word/2018/wordml/cex" xmlns:w16cid="http://schemas.microsoft.com/office/word/2016/wordml/cid" xmlns:w16="http://schemas.microsoft.com/office/word/2018/wordml" xmlns:w16du="http://schemas.microsoft.com/office/word/2023/wordml/word16du" xmlns:w16sdtdh="http://schemas.microsoft.com/office/word/2020/wordml/sdtdatahash" xmlns:w16sdtfl="http://schemas.microsoft.com/office/word/2024/wordml/sdtformatlock" xmlns:w16se="http://schemas.microsoft.com/office/word/2015/wordml/symex" xmlns:wpg="http://schemas.microsoft.com/office/word/2010/wordprocessingGroup" xmlns:wpi="http://schemas.microsoft.com/office/word/2010/wordprocessingInk" xmlns:wne="http://schemas.microsoft.com/office/word/2006/wordml" xmlns:wps="http://schemas.microsoft.com/office/word/2010/wordprocessingShape" mc:Ignorable="w14 w15 w16se w16cid w16 w16cex w16sdtdh w16sdtfl w16du wp14">
   <w:body>
     <w:bookmarkStart w:id="0" w:name="_Hlk198869228"/>
     <w:p>
@@ -2860,11 +2860,14 @@
     <w:p/>
     <w:p>
       <w:r>
+        <w:rPr>
+          <w:noProof/>
+        </w:rPr>
         <w:drawing>
-          <wp:inline distT="0" distB="0" distL="0" distR="0" wp14:anchorId="49AEF5C3" wp14:editId="70D661C0">
-            <wp:extent cx="6190615" cy="5367020"/>
-            <wp:effectExtent l="0" t="0" r="635" b="5080"/>
-            <wp:docPr id="37492876" name="Picture 1"/>
+          <wp:inline distT="0" distB="0" distL="0" distR="0" wp14:anchorId="0FCB2190" wp14:editId="2649F14C">
+            <wp:extent cx="6190615" cy="5516245"/>
+            <wp:effectExtent l="0" t="0" r="635" b="8255"/>
+            <wp:docPr id="301797883" name="Picture 10"/>
             <wp:cNvGraphicFramePr>
               <a:graphicFrameLocks xmlns:a="http://schemas.openxmlformats.org/drawingml/2006/main" noChangeAspect="1"/>
             </wp:cNvGraphicFramePr>
@@ -2872,23 +2875,36 @@
               <a:graphicData uri="http://schemas.openxmlformats.org/drawingml/2006/picture">
                 <pic:pic xmlns:pic="http://schemas.openxmlformats.org/drawingml/2006/picture">
                   <pic:nvPicPr>
-                    <pic:cNvPr id="37492876" name=""/>
-                    <pic:cNvPicPr/>
+                    <pic:cNvPr id="0" name="Picture 3"/>
+                    <pic:cNvPicPr>
+                      <a:picLocks noChangeAspect="1" noChangeArrowheads="1"/>
+                    </pic:cNvPicPr>
                   </pic:nvPicPr>
                   <pic:blipFill>
-                    <a:blip r:embed="rId12"/>
+                    <a:blip r:embed="rId12">
+                      <a:extLst>
+                        <a:ext uri="{28A0092B-C50C-407E-A947-70E740481C1C}">
+                          <a14:useLocalDpi xmlns:a14="http://schemas.microsoft.com/office/drawing/2010/main" val="0"/>
+                        </a:ext>
+                      </a:extLst>
+                    </a:blip>
+                    <a:srcRect/>
                     <a:stretch>
                       <a:fillRect/>
                     </a:stretch>
                   </pic:blipFill>
-                  <pic:spPr>
+                  <pic:spPr bwMode="auto">
                     <a:xfrm>
                       <a:off x="0" y="0"/>
-                      <a:ext cx="6190615" cy="5367020"/>
+                      <a:ext cx="6190615" cy="5516245"/>
                     </a:xfrm>
                     <a:prstGeom prst="rect">
                       <a:avLst/>
                     </a:prstGeom>
+                    <a:noFill/>
+                    <a:ln>
+                      <a:noFill/>
+                    </a:ln>
                   </pic:spPr>
                 </pic:pic>
               </a:graphicData>
@@ -3079,881 +3095,6 @@
     </w:p>
     <w:p>
       <w:pPr>
-        <w:pStyle w:val="ListParagraph"/>
-        <w:rPr>
-          <w:b/>
-          <w:bCs/>
-        </w:rPr>
-      </w:pPr>
-      <w:r>
-        <w:rPr>
-          <w:b/>
-          <w:bCs/>
-        </w:rPr>
-        <w:t>Creation of table statements:</w:t>
-      </w:r>
-    </w:p>
-    <w:p>
-      <w:pPr>
-        <w:pStyle w:val="ListParagraph"/>
-        <w:rPr>
-          <w:lang w:val="en-SG"/>
-        </w:rPr>
-      </w:pPr>
-      <w:r>
-        <w:rPr>
-          <w:lang w:val="en-SG"/>
-        </w:rPr>
-        <w:t>-- Date dimension, day-level granularity</w:t>
-      </w:r>
-    </w:p>
-    <w:p>
-      <w:pPr>
-        <w:pStyle w:val="ListParagraph"/>
-        <w:rPr>
-          <w:lang w:val="en-SG"/>
-        </w:rPr>
-      </w:pPr>
-      <w:r>
-        <w:rPr>
-          <w:lang w:val="en-SG"/>
-        </w:rPr>
-        <w:t>CREATE TABLE DimDate (</w:t>
-      </w:r>
-    </w:p>
-    <w:p>
-      <w:pPr>
-        <w:pStyle w:val="ListParagraph"/>
-        <w:rPr>
-          <w:lang w:val="en-SG"/>
-        </w:rPr>
-      </w:pPr>
-      <w:r>
-        <w:rPr>
-          <w:lang w:val="en-SG"/>
-        </w:rPr>
-        <w:t>    DateKey INT AUTO_INCREMENT PRIMARY KEY,   -- surrogate key</w:t>
-      </w:r>
-    </w:p>
-    <w:p>
-      <w:pPr>
-        <w:pStyle w:val="ListParagraph"/>
-        <w:rPr>
-          <w:lang w:val="en-SG"/>
-        </w:rPr>
-      </w:pPr>
-      <w:r>
-        <w:rPr>
-          <w:lang w:val="en-SG"/>
-        </w:rPr>
-        <w:t>    FullDate DATE NOT NULL UNIQUE,</w:t>
-      </w:r>
-    </w:p>
-    <w:p>
-      <w:pPr>
-        <w:pStyle w:val="ListParagraph"/>
-        <w:rPr>
-          <w:lang w:val="en-SG"/>
-        </w:rPr>
-      </w:pPr>
-      <w:r>
-        <w:rPr>
-          <w:lang w:val="en-SG"/>
-        </w:rPr>
-        <w:t>    Day INT NOT NULL,</w:t>
-      </w:r>
-    </w:p>
-    <w:p>
-      <w:pPr>
-        <w:pStyle w:val="ListParagraph"/>
-        <w:rPr>
-          <w:lang w:val="en-SG"/>
-        </w:rPr>
-      </w:pPr>
-      <w:r>
-        <w:rPr>
-          <w:lang w:val="en-SG"/>
-        </w:rPr>
-        <w:t>    DayOfWeek VARCHAR(10) NOT NULL,</w:t>
-      </w:r>
-    </w:p>
-    <w:p>
-      <w:pPr>
-        <w:pStyle w:val="ListParagraph"/>
-        <w:rPr>
-          <w:lang w:val="en-SG"/>
-        </w:rPr>
-      </w:pPr>
-      <w:r>
-        <w:rPr>
-          <w:lang w:val="en-SG"/>
-        </w:rPr>
-        <w:t>    IsWeekend BOOLEAN NOT NULL,</w:t>
-      </w:r>
-    </w:p>
-    <w:p>
-      <w:pPr>
-        <w:pStyle w:val="ListParagraph"/>
-        <w:rPr>
-          <w:lang w:val="en-SG"/>
-        </w:rPr>
-      </w:pPr>
-      <w:r>
-        <w:rPr>
-          <w:lang w:val="en-SG"/>
-        </w:rPr>
-        <w:t>    Month INT NOT NULL,</w:t>
-      </w:r>
-    </w:p>
-    <w:p>
-      <w:pPr>
-        <w:pStyle w:val="ListParagraph"/>
-        <w:rPr>
-          <w:lang w:val="en-SG"/>
-        </w:rPr>
-      </w:pPr>
-      <w:r>
-        <w:rPr>
-          <w:lang w:val="en-SG"/>
-        </w:rPr>
-        <w:t>    MonthName VARCHAR(10) NOT NULL,</w:t>
-      </w:r>
-    </w:p>
-    <w:p>
-      <w:pPr>
-        <w:pStyle w:val="ListParagraph"/>
-        <w:rPr>
-          <w:lang w:val="en-SG"/>
-        </w:rPr>
-      </w:pPr>
-      <w:r>
-        <w:rPr>
-          <w:lang w:val="en-SG"/>
-        </w:rPr>
-        <w:t>    Quarter INT NOT NULL,</w:t>
-      </w:r>
-    </w:p>
-    <w:p>
-      <w:pPr>
-        <w:pStyle w:val="ListParagraph"/>
-        <w:rPr>
-          <w:lang w:val="en-SG"/>
-        </w:rPr>
-      </w:pPr>
-      <w:r>
-        <w:rPr>
-          <w:lang w:val="en-SG"/>
-        </w:rPr>
-        <w:t>    Year INT NOT NULL</w:t>
-      </w:r>
-    </w:p>
-    <w:p>
-      <w:pPr>
-        <w:pStyle w:val="ListParagraph"/>
-        <w:rPr>
-          <w:lang w:val="en-SG"/>
-        </w:rPr>
-      </w:pPr>
-      <w:r>
-        <w:rPr>
-          <w:lang w:val="en-SG"/>
-        </w:rPr>
-        <w:t>);</w:t>
-      </w:r>
-    </w:p>
-    <w:p>
-      <w:pPr>
-        <w:pStyle w:val="ListParagraph"/>
-        <w:rPr>
-          <w:lang w:val="en-SG"/>
-        </w:rPr>
-      </w:pPr>
-    </w:p>
-    <w:p>
-      <w:pPr>
-        <w:pStyle w:val="ListParagraph"/>
-        <w:rPr>
-          <w:lang w:val="en-SG"/>
-        </w:rPr>
-      </w:pPr>
-      <w:r>
-        <w:rPr>
-          <w:lang w:val="en-SG"/>
-        </w:rPr>
-        <w:t>CREATE TABLE DimMember (</w:t>
-      </w:r>
-    </w:p>
-    <w:p>
-      <w:pPr>
-        <w:pStyle w:val="ListParagraph"/>
-        <w:rPr>
-          <w:lang w:val="en-SG"/>
-        </w:rPr>
-      </w:pPr>
-      <w:r>
-        <w:rPr>
-          <w:lang w:val="en-SG"/>
-        </w:rPr>
-        <w:t>    MemberKey INT AUTO_INCREMENT PRIMARY KEY, -- surrogate key</w:t>
-      </w:r>
-    </w:p>
-    <w:p>
-      <w:pPr>
-        <w:pStyle w:val="ListParagraph"/>
-        <w:rPr>
-          <w:lang w:val="en-SG"/>
-        </w:rPr>
-      </w:pPr>
-      <w:r>
-        <w:rPr>
-          <w:lang w:val="en-SG"/>
-        </w:rPr>
-        <w:t>    MemberID CHAR(10) NOT NULL,               -- natural key</w:t>
-      </w:r>
-    </w:p>
-    <w:p>
-      <w:pPr>
-        <w:pStyle w:val="ListParagraph"/>
-        <w:rPr>
-          <w:lang w:val="en-SG"/>
-        </w:rPr>
-      </w:pPr>
-      <w:r>
-        <w:rPr>
-          <w:lang w:val="en-SG"/>
-        </w:rPr>
-        <w:t>    Name VARCHAR(100) NOT NULL,</w:t>
-      </w:r>
-    </w:p>
-    <w:p>
-      <w:pPr>
-        <w:pStyle w:val="ListParagraph"/>
-        <w:rPr>
-          <w:lang w:val="en-SG"/>
-        </w:rPr>
-      </w:pPr>
-      <w:r>
-        <w:rPr>
-          <w:lang w:val="en-SG"/>
-        </w:rPr>
-        <w:t>    Gender CHAR(1) NOT NULL,</w:t>
-      </w:r>
-    </w:p>
-    <w:p>
-      <w:pPr>
-        <w:pStyle w:val="ListParagraph"/>
-        <w:rPr>
-          <w:lang w:val="en-SG"/>
-        </w:rPr>
-      </w:pPr>
-      <w:r>
-        <w:rPr>
-          <w:lang w:val="en-SG"/>
-        </w:rPr>
-        <w:t>    Occupation VARCHAR(50) NULL,</w:t>
-      </w:r>
-    </w:p>
-    <w:p>
-      <w:pPr>
-        <w:pStyle w:val="ListParagraph"/>
-        <w:rPr>
-          <w:lang w:val="en-SG"/>
-        </w:rPr>
-      </w:pPr>
-      <w:r>
-        <w:rPr>
-          <w:lang w:val="en-SG"/>
-        </w:rPr>
-        <w:t>    RegistrationDate DATE NOT NULL,</w:t>
-      </w:r>
-    </w:p>
-    <w:p>
-      <w:pPr>
-        <w:pStyle w:val="ListParagraph"/>
-        <w:rPr>
-          <w:lang w:val="en-SG"/>
-        </w:rPr>
-      </w:pPr>
-      <w:r>
-        <w:rPr>
-          <w:lang w:val="en-SG"/>
-        </w:rPr>
-        <w:t>    TierName VARCHAR(20) NOT NULL,            -- denormalised tier attributes (star schema)</w:t>
-      </w:r>
-    </w:p>
-    <w:p>
-      <w:pPr>
-        <w:pStyle w:val="ListParagraph"/>
-        <w:rPr>
-          <w:lang w:val="en-SG"/>
-        </w:rPr>
-      </w:pPr>
-      <w:r>
-        <w:rPr>
-          <w:lang w:val="en-SG"/>
-        </w:rPr>
-        <w:t>    TierLevel INT NOT NULL,</w:t>
-      </w:r>
-    </w:p>
-    <w:p>
-      <w:pPr>
-        <w:pStyle w:val="ListParagraph"/>
-        <w:rPr>
-          <w:lang w:val="en-SG"/>
-        </w:rPr>
-      </w:pPr>
-      <w:r>
-        <w:rPr>
-          <w:lang w:val="en-SG"/>
-        </w:rPr>
-        <w:t>    BorrowLimit INT NOT NULL</w:t>
-      </w:r>
-    </w:p>
-    <w:p>
-      <w:pPr>
-        <w:pStyle w:val="ListParagraph"/>
-        <w:rPr>
-          <w:lang w:val="en-SG"/>
-        </w:rPr>
-      </w:pPr>
-      <w:r>
-        <w:rPr>
-          <w:lang w:val="en-SG"/>
-        </w:rPr>
-        <w:t>);</w:t>
-      </w:r>
-    </w:p>
-    <w:p>
-      <w:pPr>
-        <w:pStyle w:val="ListParagraph"/>
-        <w:rPr>
-          <w:lang w:val="en-SG"/>
-        </w:rPr>
-      </w:pPr>
-    </w:p>
-    <w:p>
-      <w:pPr>
-        <w:pStyle w:val="ListParagraph"/>
-        <w:rPr>
-          <w:lang w:val="en-SG"/>
-        </w:rPr>
-      </w:pPr>
-      <w:r>
-        <w:rPr>
-          <w:lang w:val="en-SG"/>
-        </w:rPr>
-        <w:t>CREATE TABLE DimStaff (</w:t>
-      </w:r>
-    </w:p>
-    <w:p>
-      <w:pPr>
-        <w:pStyle w:val="ListParagraph"/>
-        <w:rPr>
-          <w:lang w:val="en-SG"/>
-        </w:rPr>
-      </w:pPr>
-      <w:r>
-        <w:rPr>
-          <w:lang w:val="en-SG"/>
-        </w:rPr>
-        <w:t>    StaffKey INT AUTO_INCREMENT PRIMARY KEY,  -- surrogate key</w:t>
-      </w:r>
-    </w:p>
-    <w:p>
-      <w:pPr>
-        <w:pStyle w:val="ListParagraph"/>
-        <w:rPr>
-          <w:lang w:val="en-SG"/>
-        </w:rPr>
-      </w:pPr>
-      <w:r>
-        <w:rPr>
-          <w:lang w:val="en-SG"/>
-        </w:rPr>
-        <w:t>    StaffID CHAR(10) NOT NULL,                -- natural key</w:t>
-      </w:r>
-    </w:p>
-    <w:p>
-      <w:pPr>
-        <w:pStyle w:val="ListParagraph"/>
-        <w:rPr>
-          <w:lang w:val="en-SG"/>
-        </w:rPr>
-      </w:pPr>
-      <w:r>
-        <w:rPr>
-          <w:lang w:val="en-SG"/>
-        </w:rPr>
-        <w:t>    Name VARCHAR(100) NOT NULL,</w:t>
-      </w:r>
-    </w:p>
-    <w:p>
-      <w:pPr>
-        <w:pStyle w:val="ListParagraph"/>
-        <w:rPr>
-          <w:lang w:val="en-SG"/>
-        </w:rPr>
-      </w:pPr>
-      <w:r>
-        <w:rPr>
-          <w:lang w:val="en-SG"/>
-        </w:rPr>
-        <w:t>    Gender CHAR(1) NOT NULL,</w:t>
-      </w:r>
-    </w:p>
-    <w:p>
-      <w:pPr>
-        <w:pStyle w:val="ListParagraph"/>
-        <w:rPr>
-          <w:lang w:val="en-SG"/>
-        </w:rPr>
-      </w:pPr>
-      <w:r>
-        <w:rPr>
-          <w:lang w:val="en-SG"/>
-        </w:rPr>
-        <w:t>    EmploymentType VARCHAR(20) NOT NULL,</w:t>
-      </w:r>
-    </w:p>
-    <w:p>
-      <w:pPr>
-        <w:pStyle w:val="ListParagraph"/>
-        <w:rPr>
-          <w:lang w:val="en-SG"/>
-        </w:rPr>
-      </w:pPr>
-      <w:r>
-        <w:rPr>
-          <w:lang w:val="en-SG"/>
-        </w:rPr>
-        <w:t>    Department VARCHAR(50) NOT NULL,</w:t>
-      </w:r>
-    </w:p>
-    <w:p>
-      <w:pPr>
-        <w:pStyle w:val="ListParagraph"/>
-        <w:rPr>
-          <w:lang w:val="en-SG"/>
-        </w:rPr>
-      </w:pPr>
-      <w:r>
-        <w:rPr>
-          <w:lang w:val="en-SG"/>
-        </w:rPr>
-        <w:t>    StartDate DATE NOT NULL</w:t>
-      </w:r>
-    </w:p>
-    <w:p>
-      <w:pPr>
-        <w:pStyle w:val="ListParagraph"/>
-        <w:rPr>
-          <w:lang w:val="en-SG"/>
-        </w:rPr>
-      </w:pPr>
-      <w:r>
-        <w:rPr>
-          <w:lang w:val="en-SG"/>
-        </w:rPr>
-        <w:t>);</w:t>
-      </w:r>
-    </w:p>
-    <w:p>
-      <w:pPr>
-        <w:pStyle w:val="ListParagraph"/>
-        <w:rPr>
-          <w:lang w:val="en-SG"/>
-        </w:rPr>
-      </w:pPr>
-    </w:p>
-    <w:p>
-      <w:pPr>
-        <w:pStyle w:val="ListParagraph"/>
-        <w:rPr>
-          <w:lang w:val="en-SG"/>
-        </w:rPr>
-      </w:pPr>
-      <w:r>
-        <w:rPr>
-          <w:lang w:val="en-SG"/>
-        </w:rPr>
-        <w:t>CREATE TABLE DimBook (</w:t>
-      </w:r>
-    </w:p>
-    <w:p>
-      <w:pPr>
-        <w:pStyle w:val="ListParagraph"/>
-        <w:rPr>
-          <w:lang w:val="en-SG"/>
-        </w:rPr>
-      </w:pPr>
-      <w:r>
-        <w:rPr>
-          <w:lang w:val="en-SG"/>
-        </w:rPr>
-        <w:t>    BookKey INT AUTO_INCREMENT PRIMARY KEY,   -- surrogate key</w:t>
-      </w:r>
-    </w:p>
-    <w:p>
-      <w:pPr>
-        <w:pStyle w:val="ListParagraph"/>
-        <w:rPr>
-          <w:lang w:val="en-SG"/>
-        </w:rPr>
-      </w:pPr>
-      <w:r>
-        <w:rPr>
-          <w:lang w:val="en-SG"/>
-        </w:rPr>
-        <w:t>    BookID CHAR(10) NOT NULL,                 -- natural key</w:t>
-      </w:r>
-    </w:p>
-    <w:p>
-      <w:pPr>
-        <w:pStyle w:val="ListParagraph"/>
-        <w:rPr>
-          <w:lang w:val="en-SG"/>
-        </w:rPr>
-      </w:pPr>
-      <w:r>
-        <w:rPr>
-          <w:lang w:val="en-SG"/>
-        </w:rPr>
-        <w:t>    Title VARCHAR(200) NOT NULL,</w:t>
-      </w:r>
-    </w:p>
-    <w:p>
-      <w:pPr>
-        <w:pStyle w:val="ListParagraph"/>
-        <w:rPr>
-          <w:lang w:val="en-SG"/>
-        </w:rPr>
-      </w:pPr>
-      <w:r>
-        <w:rPr>
-          <w:lang w:val="en-SG"/>
-        </w:rPr>
-        <w:lastRenderedPageBreak/>
-        <w:t>    Author VARCHAR(100) NOT NULL,</w:t>
-      </w:r>
-    </w:p>
-    <w:p>
-      <w:pPr>
-        <w:pStyle w:val="ListParagraph"/>
-        <w:rPr>
-          <w:lang w:val="en-SG"/>
-        </w:rPr>
-      </w:pPr>
-      <w:r>
-        <w:rPr>
-          <w:lang w:val="en-SG"/>
-        </w:rPr>
-        <w:t>    Genre VARCHAR(50) NOT NULL,</w:t>
-      </w:r>
-    </w:p>
-    <w:p>
-      <w:pPr>
-        <w:pStyle w:val="ListParagraph"/>
-        <w:rPr>
-          <w:lang w:val="en-SG"/>
-        </w:rPr>
-      </w:pPr>
-      <w:r>
-        <w:rPr>
-          <w:lang w:val="en-SG"/>
-        </w:rPr>
-        <w:t>    MinTierName VARCHAR(20) NOT NULL,</w:t>
-      </w:r>
-    </w:p>
-    <w:p>
-      <w:pPr>
-        <w:pStyle w:val="ListParagraph"/>
-        <w:rPr>
-          <w:lang w:val="en-SG"/>
-        </w:rPr>
-      </w:pPr>
-      <w:r>
-        <w:rPr>
-          <w:lang w:val="en-SG"/>
-        </w:rPr>
-        <w:t>    MinTierLevel INT NOT NULL</w:t>
-      </w:r>
-    </w:p>
-    <w:p>
-      <w:pPr>
-        <w:pStyle w:val="ListParagraph"/>
-        <w:rPr>
-          <w:lang w:val="en-SG"/>
-        </w:rPr>
-      </w:pPr>
-      <w:r>
-        <w:rPr>
-          <w:lang w:val="en-SG"/>
-        </w:rPr>
-        <w:t>);</w:t>
-      </w:r>
-    </w:p>
-    <w:p>
-      <w:pPr>
-        <w:pStyle w:val="ListParagraph"/>
-        <w:rPr>
-          <w:lang w:val="en-SG"/>
-        </w:rPr>
-      </w:pPr>
-    </w:p>
-    <w:p>
-      <w:pPr>
-        <w:pStyle w:val="ListParagraph"/>
-        <w:rPr>
-          <w:lang w:val="en-SG"/>
-        </w:rPr>
-      </w:pPr>
-      <w:r>
-        <w:rPr>
-          <w:lang w:val="en-SG"/>
-        </w:rPr>
-        <w:t>-- Fact table: one row per completed loan transaction (borrowed and returned)</w:t>
-      </w:r>
-    </w:p>
-    <w:p>
-      <w:pPr>
-        <w:pStyle w:val="ListParagraph"/>
-        <w:rPr>
-          <w:lang w:val="en-SG"/>
-        </w:rPr>
-      </w:pPr>
-      <w:r>
-        <w:rPr>
-          <w:lang w:val="en-SG"/>
-        </w:rPr>
-        <w:t>CREATE TABLE FactLoan (</w:t>
-      </w:r>
-    </w:p>
-    <w:p>
-      <w:pPr>
-        <w:pStyle w:val="ListParagraph"/>
-        <w:rPr>
-          <w:lang w:val="en-SG"/>
-        </w:rPr>
-      </w:pPr>
-      <w:r>
-        <w:rPr>
-          <w:lang w:val="en-SG"/>
-        </w:rPr>
-        <w:t>    LoanKey INT AUTO_INCREMENT PRIMARY KEY,   -- surrogate key</w:t>
-      </w:r>
-    </w:p>
-    <w:p>
-      <w:pPr>
-        <w:pStyle w:val="ListParagraph"/>
-        <w:rPr>
-          <w:lang w:val="en-SG"/>
-        </w:rPr>
-      </w:pPr>
-      <w:r>
-        <w:rPr>
-          <w:lang w:val="en-SG"/>
-        </w:rPr>
-        <w:t>    MemberKey INT NOT NULL,</w:t>
-      </w:r>
-    </w:p>
-    <w:p>
-      <w:pPr>
-        <w:pStyle w:val="ListParagraph"/>
-        <w:rPr>
-          <w:lang w:val="en-SG"/>
-        </w:rPr>
-      </w:pPr>
-      <w:r>
-        <w:rPr>
-          <w:lang w:val="en-SG"/>
-        </w:rPr>
-        <w:t>    StaffKey INT NOT NULL,</w:t>
-      </w:r>
-    </w:p>
-    <w:p>
-      <w:pPr>
-        <w:pStyle w:val="ListParagraph"/>
-        <w:rPr>
-          <w:lang w:val="en-SG"/>
-        </w:rPr>
-      </w:pPr>
-      <w:r>
-        <w:rPr>
-          <w:lang w:val="en-SG"/>
-        </w:rPr>
-        <w:t>    BookKey INT NOT NULL,</w:t>
-      </w:r>
-    </w:p>
-    <w:p>
-      <w:pPr>
-        <w:pStyle w:val="ListParagraph"/>
-        <w:rPr>
-          <w:lang w:val="en-SG"/>
-        </w:rPr>
-      </w:pPr>
-      <w:r>
-        <w:rPr>
-          <w:lang w:val="en-SG"/>
-        </w:rPr>
-        <w:t>    BorrowDateKey INT NOT NULL,</w:t>
-      </w:r>
-    </w:p>
-    <w:p>
-      <w:pPr>
-        <w:pStyle w:val="ListParagraph"/>
-        <w:rPr>
-          <w:lang w:val="en-SG"/>
-        </w:rPr>
-      </w:pPr>
-      <w:r>
-        <w:rPr>
-          <w:lang w:val="en-SG"/>
-        </w:rPr>
-        <w:t>    ReturnDateKey INT NOT NULL,</w:t>
-      </w:r>
-    </w:p>
-    <w:p>
-      <w:pPr>
-        <w:pStyle w:val="ListParagraph"/>
-        <w:rPr>
-          <w:lang w:val="en-SG"/>
-        </w:rPr>
-      </w:pPr>
-      <w:r>
-        <w:rPr>
-          <w:lang w:val="en-SG"/>
-        </w:rPr>
-        <w:t>    CopySeqNo INT NOT NULL,                   -- degenerate dimension</w:t>
-      </w:r>
-    </w:p>
-    <w:p>
-      <w:pPr>
-        <w:pStyle w:val="ListParagraph"/>
-        <w:rPr>
-          <w:lang w:val="en-SG"/>
-        </w:rPr>
-      </w:pPr>
-      <w:r>
-        <w:rPr>
-          <w:lang w:val="en-SG"/>
-        </w:rPr>
-        <w:t>    LoanDurationDays INT NOT NULL,            -- return date - borrow date</w:t>
-      </w:r>
-    </w:p>
-    <w:p>
-      <w:pPr>
-        <w:pStyle w:val="ListParagraph"/>
-        <w:rPr>
-          <w:lang w:val="en-SG"/>
-        </w:rPr>
-      </w:pPr>
-      <w:r>
-        <w:rPr>
-          <w:lang w:val="en-SG"/>
-        </w:rPr>
-        <w:t>    DaysBeforeDue INT NOT NULL,               -- due date - return date (negative = late)</w:t>
-      </w:r>
-    </w:p>
-    <w:p>
-      <w:pPr>
-        <w:pStyle w:val="ListParagraph"/>
-        <w:rPr>
-          <w:lang w:val="en-SG"/>
-        </w:rPr>
-      </w:pPr>
-      <w:r>
-        <w:rPr>
-          <w:lang w:val="en-SG"/>
-        </w:rPr>
-        <w:t>    IsLate BOOLEAN NOT NULL,</w:t>
-      </w:r>
-    </w:p>
-    <w:p>
-      <w:pPr>
-        <w:pStyle w:val="ListParagraph"/>
-        <w:rPr>
-          <w:lang w:val="en-SG"/>
-        </w:rPr>
-      </w:pPr>
-      <w:r>
-        <w:rPr>
-          <w:lang w:val="en-SG"/>
-        </w:rPr>
-        <w:t>    FOREIGN KEY (MemberKey) REFERENCES DimMember(MemberKey),</w:t>
-      </w:r>
-    </w:p>
-    <w:p>
-      <w:pPr>
-        <w:pStyle w:val="ListParagraph"/>
-        <w:rPr>
-          <w:lang w:val="en-SG"/>
-        </w:rPr>
-      </w:pPr>
-      <w:r>
-        <w:rPr>
-          <w:lang w:val="en-SG"/>
-        </w:rPr>
-        <w:t>    FOREIGN KEY (StaffKey) REFERENCES DimStaff(StaffKey),</w:t>
-      </w:r>
-    </w:p>
-    <w:p>
-      <w:pPr>
-        <w:pStyle w:val="ListParagraph"/>
-        <w:rPr>
-          <w:lang w:val="en-SG"/>
-        </w:rPr>
-      </w:pPr>
-      <w:r>
-        <w:rPr>
-          <w:lang w:val="en-SG"/>
-        </w:rPr>
-        <w:t>    FOREIGN KEY (BookKey) REFERENCES DimBook(BookKey),</w:t>
-      </w:r>
-    </w:p>
-    <w:p>
-      <w:pPr>
-        <w:pStyle w:val="ListParagraph"/>
-        <w:rPr>
-          <w:lang w:val="en-SG"/>
-        </w:rPr>
-      </w:pPr>
-      <w:r>
-        <w:rPr>
-          <w:lang w:val="en-SG"/>
-        </w:rPr>
-        <w:t>    FOREIGN KEY (BorrowDateKey) REFERENCES DimDate(DateKey),</w:t>
-      </w:r>
-    </w:p>
-    <w:p>
-      <w:pPr>
-        <w:pStyle w:val="ListParagraph"/>
-        <w:rPr>
-          <w:lang w:val="en-SG"/>
-        </w:rPr>
-      </w:pPr>
-      <w:r>
-        <w:rPr>
-          <w:lang w:val="en-SG"/>
-        </w:rPr>
-        <w:t>    FOREIGN KEY (ReturnDateKey) REFERENCES DimDate(DateKey)</w:t>
-      </w:r>
-    </w:p>
-    <w:p>
-      <w:pPr>
-        <w:pStyle w:val="ListParagraph"/>
-        <w:rPr>
-          <w:lang w:val="en-SG"/>
-        </w:rPr>
-      </w:pPr>
-      <w:r>
-        <w:rPr>
-          <w:lang w:val="en-SG"/>
-        </w:rPr>
-        <w:t>);</w:t>
-      </w:r>
-    </w:p>
-    <w:p>
-      <w:pPr>
         <w:rPr>
           <w:b/>
           <w:bCs/>
@@ -3990,15 +3131,13 @@
         <w:rPr>
           <w:b/>
           <w:bCs/>
-          <w:noProof/>
           <w:lang w:val="en-SG"/>
         </w:rPr>
-        <w:lastRenderedPageBreak/>
         <w:drawing>
-          <wp:inline distT="0" distB="0" distL="0" distR="0" wp14:anchorId="2AE2D5D6" wp14:editId="07B161E4">
-            <wp:extent cx="6190615" cy="4478655"/>
+          <wp:inline distT="0" distB="0" distL="0" distR="0" wp14:anchorId="118A8ADE" wp14:editId="52805A70">
+            <wp:extent cx="6190615" cy="4692015"/>
             <wp:effectExtent l="0" t="0" r="635" b="0"/>
-            <wp:docPr id="358119578" name="Picture 1"/>
+            <wp:docPr id="718349371" name="Picture 1"/>
             <wp:cNvGraphicFramePr>
               <a:graphicFrameLocks xmlns:a="http://schemas.openxmlformats.org/drawingml/2006/main" noChangeAspect="1"/>
             </wp:cNvGraphicFramePr>
@@ -4006,7 +3145,7 @@
               <a:graphicData uri="http://schemas.openxmlformats.org/drawingml/2006/picture">
                 <pic:pic xmlns:pic="http://schemas.openxmlformats.org/drawingml/2006/picture">
                   <pic:nvPicPr>
-                    <pic:cNvPr id="358119578" name=""/>
+                    <pic:cNvPr id="718349371" name=""/>
                     <pic:cNvPicPr/>
                   </pic:nvPicPr>
                   <pic:blipFill>
@@ -4018,7 +3157,7 @@
                   <pic:spPr>
                     <a:xfrm>
                       <a:off x="0" y="0"/>
-                      <a:ext cx="6190615" cy="4478655"/>
+                      <a:ext cx="6190615" cy="4692015"/>
                     </a:xfrm>
                     <a:prstGeom prst="rect">
                       <a:avLst/>
@@ -4054,28 +3193,154 @@
         </w:rPr>
         <w:t>How to verify successful insertion:</w:t>
       </w:r>
-      <w:r>
+    </w:p>
+    <w:p>
+      <w:pPr>
         <w:rPr>
           <w:b/>
           <w:bCs/>
         </w:rPr>
-        <w:t xml:space="preserve"> (Change ts up)</w:t>
-      </w:r>
+      </w:pPr>
     </w:p>
     <w:p>
       <w:pPr>
         <w:rPr>
-          <w:b/>
-          <w:bCs/>
-        </w:rPr>
-      </w:pPr>
+          <w:sz w:val="20"/>
+        </w:rPr>
+      </w:pPr>
+      <w:r>
+        <w:rPr>
+          <w:sz w:val="20"/>
+        </w:rPr>
+        <w:t xml:space="preserve">ETL verification: (1) Row-count reconciliation - completed loans in OLTP (SELECT COUNT(*) FROM Loan WHERE ReturnDatetime IS NOT NULL) = 12,343 and FactLoan = 12,343; DimMember = Member = 301; DimBook = Book = 500; DimStaff = Staff = 51. </w:t>
+      </w:r>
     </w:p>
     <w:p>
-      <w:r>
+      <w:pPr>
         <w:rPr>
           <w:sz w:val="20"/>
         </w:rPr>
-        <w:t>ETL verification: (1) Row-count reconciliation - completed loans in OLTP (SELECT COUNT(*) FROM Loan WHERE ReturnDatetime IS NOT NULL) = 12,343 and FactLoan = 12,343; DimMember = Member = 301; DimBook = Book = 500; DimStaff = Staff = 51. (2) Measure reconciliation - SUM(DATEDIFF(ReturnDatetime, StartDatetime)) computed directly on the OLTP Loan table = 108,801 days, identical to SUM(LoanDurationDays) in FactLoan, proving the duration measure was derived correctly for every row. (3) Referential integrity - a LEFT JOIN from FactLoan to each dimension returns 0 orphan rows, and all foreign keys are enforced by constraints so no fact row can reference a missing dimension member. The verification queries are included at the bottom of DW_insert.sql.</w:t>
+      </w:pPr>
+      <w:r>
+        <w:rPr>
+          <w:sz w:val="20"/>
+        </w:rPr>
+        <w:lastRenderedPageBreak/>
+        <w:drawing>
+          <wp:inline distT="0" distB="0" distL="0" distR="0" wp14:anchorId="4F7B70BC" wp14:editId="3C329524">
+            <wp:extent cx="6190615" cy="3074035"/>
+            <wp:effectExtent l="0" t="0" r="635" b="0"/>
+            <wp:docPr id="585141497" name="Picture 1"/>
+            <wp:cNvGraphicFramePr>
+              <a:graphicFrameLocks xmlns:a="http://schemas.openxmlformats.org/drawingml/2006/main" noChangeAspect="1"/>
+            </wp:cNvGraphicFramePr>
+            <a:graphic xmlns:a="http://schemas.openxmlformats.org/drawingml/2006/main">
+              <a:graphicData uri="http://schemas.openxmlformats.org/drawingml/2006/picture">
+                <pic:pic xmlns:pic="http://schemas.openxmlformats.org/drawingml/2006/picture">
+                  <pic:nvPicPr>
+                    <pic:cNvPr id="585141497" name=""/>
+                    <pic:cNvPicPr/>
+                  </pic:nvPicPr>
+                  <pic:blipFill>
+                    <a:blip r:embed="rId14"/>
+                    <a:stretch>
+                      <a:fillRect/>
+                    </a:stretch>
+                  </pic:blipFill>
+                  <pic:spPr>
+                    <a:xfrm>
+                      <a:off x="0" y="0"/>
+                      <a:ext cx="6190615" cy="3074035"/>
+                    </a:xfrm>
+                    <a:prstGeom prst="rect">
+                      <a:avLst/>
+                    </a:prstGeom>
+                  </pic:spPr>
+                </pic:pic>
+              </a:graphicData>
+            </a:graphic>
+          </wp:inline>
+        </w:drawing>
+      </w:r>
+    </w:p>
+    <w:p>
+      <w:pPr>
+        <w:rPr>
+          <w:sz w:val="20"/>
+        </w:rPr>
+      </w:pPr>
+      <w:r>
+        <w:rPr>
+          <w:sz w:val="20"/>
+        </w:rPr>
+        <w:t xml:space="preserve">(2) Measure reconciliation - SUM(DATEDIFF(ReturnDatetime, StartDatetime)) computed directly on the OLTP Loan table = 108,801 days, identical to SUM(LoanDurationDays) in FactLoan, proving the duration measure was derived correctly for every row. </w:t>
+      </w:r>
+    </w:p>
+    <w:p>
+      <w:r>
+        <w:rPr>
+          <w:noProof/>
+        </w:rPr>
+        <w:drawing>
+          <wp:inline distT="0" distB="0" distL="0" distR="0" wp14:anchorId="13F0C992" wp14:editId="02547192">
+            <wp:extent cx="6190615" cy="2913380"/>
+            <wp:effectExtent l="0" t="0" r="635" b="1270"/>
+            <wp:docPr id="1628977179" name="Picture 9"/>
+            <wp:cNvGraphicFramePr>
+              <a:graphicFrameLocks xmlns:a="http://schemas.openxmlformats.org/drawingml/2006/main" noChangeAspect="1"/>
+            </wp:cNvGraphicFramePr>
+            <a:graphic xmlns:a="http://schemas.openxmlformats.org/drawingml/2006/main">
+              <a:graphicData uri="http://schemas.openxmlformats.org/drawingml/2006/picture">
+                <pic:pic xmlns:pic="http://schemas.openxmlformats.org/drawingml/2006/picture">
+                  <pic:nvPicPr>
+                    <pic:cNvPr id="0" name="Picture 1"/>
+                    <pic:cNvPicPr>
+                      <a:picLocks noChangeAspect="1" noChangeArrowheads="1"/>
+                    </pic:cNvPicPr>
+                  </pic:nvPicPr>
+                  <pic:blipFill>
+                    <a:blip r:embed="rId15">
+                      <a:extLst>
+                        <a:ext uri="{28A0092B-C50C-407E-A947-70E740481C1C}">
+                          <a14:useLocalDpi xmlns:a14="http://schemas.microsoft.com/office/drawing/2010/main" val="0"/>
+                        </a:ext>
+                      </a:extLst>
+                    </a:blip>
+                    <a:srcRect/>
+                    <a:stretch>
+                      <a:fillRect/>
+                    </a:stretch>
+                  </pic:blipFill>
+                  <pic:spPr bwMode="auto">
+                    <a:xfrm>
+                      <a:off x="0" y="0"/>
+                      <a:ext cx="6190615" cy="2913380"/>
+                    </a:xfrm>
+                    <a:prstGeom prst="rect">
+                      <a:avLst/>
+                    </a:prstGeom>
+                    <a:noFill/>
+                    <a:ln>
+                      <a:noFill/>
+                    </a:ln>
+                  </pic:spPr>
+                </pic:pic>
+              </a:graphicData>
+            </a:graphic>
+          </wp:inline>
+        </w:drawing>
+      </w:r>
+      <w:r>
+        <w:rPr>
+          <w:sz w:val="20"/>
+        </w:rPr>
+        <w:t xml:space="preserve"> </w:t>
+      </w:r>
+      <w:r>
+        <w:rPr>
+          <w:sz w:val="20"/>
+        </w:rPr>
+        <w:t>(3) Referential integrity - a LEFT JOIN from FactLoan to each dimension returns 0 orphan rows, and all foreign keys are enforced by constraints so no fact row can reference a missing dimension member. The verification queries are included at the bottom of DW_insert.sql.</w:t>
       </w:r>
     </w:p>
     <w:p>
@@ -4087,13 +3352,111 @@
     <w:p>
       <w:pPr>
         <w:pStyle w:val="ListParagraph"/>
-        <w:numPr>
-          <w:ilvl w:val="0"/>
-          <w:numId w:val="45"/>
-        </w:numPr>
       </w:pPr>
       <w:r>
         <w:lastRenderedPageBreak/>
+        <w:drawing>
+          <wp:inline distT="0" distB="0" distL="0" distR="0" wp14:anchorId="4970971F" wp14:editId="7F625B85">
+            <wp:extent cx="3962743" cy="3977985"/>
+            <wp:effectExtent l="0" t="0" r="0" b="3810"/>
+            <wp:docPr id="517891148" name="Picture 1"/>
+            <wp:cNvGraphicFramePr>
+              <a:graphicFrameLocks xmlns:a="http://schemas.openxmlformats.org/drawingml/2006/main" noChangeAspect="1"/>
+            </wp:cNvGraphicFramePr>
+            <a:graphic xmlns:a="http://schemas.openxmlformats.org/drawingml/2006/main">
+              <a:graphicData uri="http://schemas.openxmlformats.org/drawingml/2006/picture">
+                <pic:pic xmlns:pic="http://schemas.openxmlformats.org/drawingml/2006/picture">
+                  <pic:nvPicPr>
+                    <pic:cNvPr id="517891148" name=""/>
+                    <pic:cNvPicPr/>
+                  </pic:nvPicPr>
+                  <pic:blipFill>
+                    <a:blip r:embed="rId16"/>
+                    <a:stretch>
+                      <a:fillRect/>
+                    </a:stretch>
+                  </pic:blipFill>
+                  <pic:spPr>
+                    <a:xfrm>
+                      <a:off x="0" y="0"/>
+                      <a:ext cx="3962743" cy="3977985"/>
+                    </a:xfrm>
+                    <a:prstGeom prst="rect">
+                      <a:avLst/>
+                    </a:prstGeom>
+                  </pic:spPr>
+                </pic:pic>
+              </a:graphicData>
+            </a:graphic>
+          </wp:inline>
+        </w:drawing>
+      </w:r>
+    </w:p>
+    <w:p>
+      <w:pPr>
+        <w:pStyle w:val="ListParagraph"/>
+      </w:pPr>
+    </w:p>
+    <w:p>
+      <w:pPr>
+        <w:pStyle w:val="ListParagraph"/>
+      </w:pPr>
+      <w:r>
+        <w:t>Date (gpt help fill this up)</w:t>
+      </w:r>
+    </w:p>
+    <w:p>
+      <w:pPr>
+        <w:pStyle w:val="ListParagraph"/>
+      </w:pPr>
+      <w:r>
+        <w:drawing>
+          <wp:inline distT="0" distB="0" distL="0" distR="0" wp14:anchorId="47182438" wp14:editId="04324201">
+            <wp:extent cx="2987299" cy="2057578"/>
+            <wp:effectExtent l="0" t="0" r="3810" b="0"/>
+            <wp:docPr id="439923099" name="Picture 1"/>
+            <wp:cNvGraphicFramePr>
+              <a:graphicFrameLocks xmlns:a="http://schemas.openxmlformats.org/drawingml/2006/main" noChangeAspect="1"/>
+            </wp:cNvGraphicFramePr>
+            <a:graphic xmlns:a="http://schemas.openxmlformats.org/drawingml/2006/main">
+              <a:graphicData uri="http://schemas.openxmlformats.org/drawingml/2006/picture">
+                <pic:pic xmlns:pic="http://schemas.openxmlformats.org/drawingml/2006/picture">
+                  <pic:nvPicPr>
+                    <pic:cNvPr id="439923099" name=""/>
+                    <pic:cNvPicPr/>
+                  </pic:nvPicPr>
+                  <pic:blipFill>
+                    <a:blip r:embed="rId17"/>
+                    <a:stretch>
+                      <a:fillRect/>
+                    </a:stretch>
+                  </pic:blipFill>
+                  <pic:spPr>
+                    <a:xfrm>
+                      <a:off x="0" y="0"/>
+                      <a:ext cx="2987299" cy="2057578"/>
+                    </a:xfrm>
+                    <a:prstGeom prst="rect">
+                      <a:avLst/>
+                    </a:prstGeom>
+                  </pic:spPr>
+                </pic:pic>
+              </a:graphicData>
+            </a:graphic>
+          </wp:inline>
+        </w:drawing>
+      </w:r>
+    </w:p>
+    <w:p>
+      <w:pPr>
+        <w:pStyle w:val="ListParagraph"/>
+      </w:pPr>
+    </w:p>
+    <w:p>
+      <w:pPr>
+        <w:pStyle w:val="ListParagraph"/>
+      </w:pPr>
+      <w:r>
         <w:t xml:space="preserve">Describe and discuss your analysis done using the DW. </w:t>
       </w:r>
       <w:r>
@@ -4201,7 +3564,14 @@
         <w:rPr>
           <w:lang w:val="en-SG"/>
         </w:rPr>
-        <w:t>: Monthly completed loans rose from about 35 per month in 2020 to 2,838 in December 2025. A year-end surge appears repeatedly: December 2022 recorded 90 loans compared with 57 in November; December 2024 recorded 235 compared with 177; and December 2025 recorded 2,838 compared with 1,188. Average loan duration remained broadly stable at about 8 to 9.5 days.</w:t>
+        <w:t xml:space="preserve">: Monthly completed loans rose from about 35 per month in 2020 to 2,838 in December 2025. A year-end surge appears repeatedly: December 2022 recorded 90 loans compared with 57 in November; December 2024 recorded 235 compared with 177; and </w:t>
+      </w:r>
+      <w:r>
+        <w:rPr>
+          <w:lang w:val="en-SG"/>
+        </w:rPr>
+        <w:lastRenderedPageBreak/>
+        <w:t>December 2025 recorded 2,838 compared with 1,188. Average loan duration remained broadly stable at about 8 to 9.5 days.</w:t>
       </w:r>
     </w:p>
     <w:p>
@@ -4519,7 +3889,6 @@
           <w:bCs/>
           <w:lang w:val="en-SG"/>
         </w:rPr>
-        <w:lastRenderedPageBreak/>
         <w:t>Insight</w:t>
       </w:r>
       <w:r>
@@ -4615,7 +3984,14 @@
         <w:rPr>
           <w:lang w:val="en-SG"/>
         </w:rPr>
-        <w:t>: Higher-tier members keep books slightly longer but return them more punctually. Their higher borrowing limits do not appear to create a larger overdue problem. Reminders and late-return interventions would have the greatest effect when directed at Basic members.</w:t>
+        <w:t xml:space="preserve">: Higher-tier members keep books slightly longer but return them more punctually. Their higher borrowing limits do not appear to create a larger overdue problem. Reminders </w:t>
+      </w:r>
+      <w:r>
+        <w:rPr>
+          <w:lang w:val="en-SG"/>
+        </w:rPr>
+        <w:lastRenderedPageBreak/>
+        <w:t>and late-return interventions would have the greatest effect when directed at Basic members.</w:t>
       </w:r>
     </w:p>
     <w:p>
@@ -4915,10 +4291,10 @@
       </w:r>
     </w:p>
     <w:sectPr>
-      <w:headerReference w:type="even" r:id="rId14"/>
-      <w:headerReference w:type="default" r:id="rId15"/>
-      <w:footerReference w:type="default" r:id="rId16"/>
-      <w:headerReference w:type="first" r:id="rId17"/>
+      <w:headerReference w:type="even" r:id="rId18"/>
+      <w:headerReference w:type="default" r:id="rId19"/>
+      <w:footerReference w:type="default" r:id="rId20"/>
+      <w:headerReference w:type="first" r:id="rId21"/>
       <w:pgSz w:w="11909" w:h="16834" w:code="9"/>
       <w:pgMar w:top="1440" w:right="1080" w:bottom="1440" w:left="1080" w:header="720" w:footer="720" w:gutter="0"/>
       <w:pgNumType w:start="0"/>
@@ -4931,7 +4307,7 @@
 </file>
 
 <file path=word/endnotes.xml><?xml version="1.0" encoding="utf-8"?>
-<w:endnotes xmlns:wpc="http://schemas.microsoft.com/office/word/2010/wordprocessingCanvas" xmlns:cx="http://schemas.microsoft.com/office/drawing/2014/chartex" xmlns:cx1="http://schemas.microsoft.com/office/drawing/2015/9/8/chartex" xmlns:cx2="http://schemas.microsoft.com/office/drawing/2015/10/21/chartex" xmlns:cx3="http://schemas.microsoft.com/office/drawing/2016/5/9/chartex" xmlns:cx4="http://schemas.microsoft.com/office/drawing/2016/5/10/chartex" xmlns:cx5="http://schemas.microsoft.com/office/drawing/2016/5/11/chartex" xmlns:cx6="http://schemas.microsoft.com/office/drawing/2016/5/12/chartex" xmlns:cx7="http://schemas.microsoft.com/office/drawing/2016/5/13/chartex" xmlns:cx8="http://schemas.microsoft.com/office/drawing/2016/5/14/chartex" xmlns:mc="http://schemas.openxmlformats.org/markup-compatibility/2006" xmlns:aink="http://schemas.microsoft.com/office/drawing/2016/ink" xmlns:am3d="http://schemas.microsoft.com/office/drawing/2017/model3d" xmlns:o="urn:schemas-microsoft-com:office:office" xmlns:oel="http://schemas.microsoft.com/office/2019/extlst" xmlns:r="http://schemas.openxmlformats.org/officeDocument/2006/relationships" xmlns:m="http://schemas.openxmlformats.org/officeDocument/2006/math" xmlns:v="urn:schemas-microsoft-com:vml" xmlns:wp14="http://schemas.microsoft.com/office/word/2010/wordprocessingDrawing" xmlns:wp="http://schemas.openxmlformats.org/drawingml/2006/wordprocessingDrawing" xmlns:w10="urn:schemas-microsoft-com:office:word" xmlns:w="http://schemas.openxmlformats.org/wordprocessingml/2006/main" xmlns:w14="http://schemas.microsoft.com/office/word/2010/wordml" xmlns:w15="http://schemas.microsoft.com/office/word/2012/wordml" xmlns:w16cex="http://schemas.microsoft.com/office/word/2018/wordml/cex" xmlns:w16cid="http://schemas.microsoft.com/office/word/2016/wordml/cid" xmlns:w16="http://schemas.microsoft.com/office/word/2018/wordml" xmlns:w16du="http://schemas.microsoft.com/office/word/2023/wordml/word16du" xmlns:w16sdtdh="http://schemas.microsoft.com/office/word/2020/wordml/sdtdatahash" xmlns:w16sdtfl="http://schemas.microsoft.com/office/word/2024/wordml/sdtformatlock" xmlns:w16se="http://schemas.microsoft.com/office/word/2015/wordml/symex" xmlns:wpg="http://schemas.microsoft.com/office/word/2010/wordprocessingGroup" xmlns:wpi="http://schemas.microsoft.com/office/word/2010/wordprocessingInk" xmlns:wne="http://schemas.microsoft.com/office/word/2006/wordml" xmlns:wps="http://schemas.microsoft.com/office/word/2010/wordprocessingShape" mc:Ignorable="w14 w15 w16se w16cid w16 w16cex w16sdtdh w16sdtfl w16du wp14">
+<w:endnotes xmlns:wpc="http://schemas.microsoft.com/office/word/2010/wordprocessingCanvas" xmlns:cx="http://schemas.microsoft.com/office/drawing/2014/chartex" xmlns:cx1="http://schemas.microsoft.com/office/drawing/2015/9/8/chartex" xmlns:cx2="http://schemas.microsoft.com/office/drawing/2015/10/21/chartex" xmlns:cx3="http://schemas.microsoft.com/office/drawing/2016/5/9/chartex" xmlns:cx4="http://schemas.microsoft.com/office/drawing/2016/5/10/chartex" xmlns:cx5="http://schemas.microsoft.com/office/drawing/2016/5/11/chartex" xmlns:cx6="http://schemas.microsoft.com/office/drawing/2016/5/12/chartex" xmlns:cx7="http://schemas.microsoft.com/office/drawing/2016/5/13/chartex" xmlns:cx8="http://schemas.microsoft.com/office/drawing/2016/5/14/chartex" xmlns:mc="http://schemas.openxmlformats.org/markup-compatibility/2006" xmlns:aink="http://schemas.microsoft.com/office/drawing/2016/ink" xmlns:am3d="http://schemas.microsoft.com/office/drawing/2017/model3d" xmlns:o="urn:schemas-microsoft-com:office:office" xmlns:oel="http://schemas.microsoft.com/office/2019/extlst" xmlns:r="http://schemas.openxmlformats.org/officeDocument/2006/relationships" xmlns:m="http://schemas.openxmlformats.org/officeDocument/2006/math" xmlns:v="urn:schemas-microsoft-com:vml" xmlns:wp14="http://schemas.microsoft.com/office/word/2010/wordprocessingDrawing" xmlns:wp="http://schemas.openxmlformats.org/drawingml/2006/wordprocessingDrawing" xmlns:w10="urn:schemas-microsoft-com:office:word" xmlns:w="http://schemas.openxmlformats.org/wordprocessingml/2006/main" xmlns:w14="http://schemas.microsoft.com/office/word/2010/wordml" xmlns:w15="http://schemas.microsoft.com/office/word/2012/wordml" xmlns:w16cei="http://schemas.microsoft.com/office/word/2026/wordml/cei" xmlns:w16cex="http://schemas.microsoft.com/office/word/2018/wordml/cex" xmlns:w16cid="http://schemas.microsoft.com/office/word/2016/wordml/cid" xmlns:w16="http://schemas.microsoft.com/office/word/2018/wordml" xmlns:w16du="http://schemas.microsoft.com/office/word/2023/wordml/word16du" xmlns:w16sdtdh="http://schemas.microsoft.com/office/word/2020/wordml/sdtdatahash" xmlns:w16sdtfl="http://schemas.microsoft.com/office/word/2024/wordml/sdtformatlock" xmlns:w16se="http://schemas.microsoft.com/office/word/2015/wordml/symex" xmlns:wpg="http://schemas.microsoft.com/office/word/2010/wordprocessingGroup" xmlns:wpi="http://schemas.microsoft.com/office/word/2010/wordprocessingInk" xmlns:wne="http://schemas.microsoft.com/office/word/2006/wordml" xmlns:wps="http://schemas.microsoft.com/office/word/2010/wordprocessingShape" mc:Ignorable="w14 w15 w16se w16cid w16 w16cex w16sdtdh w16sdtfl w16du wp14">
   <w:endnote w:type="separator" w:id="-1">
     <w:p>
       <w:r>
@@ -4953,7 +4329,7 @@
 </file>
 
 <file path=word/footer1.xml><?xml version="1.0" encoding="utf-8"?>
-<w:ftr xmlns:wpc="http://schemas.microsoft.com/office/word/2010/wordprocessingCanvas" xmlns:cx="http://schemas.microsoft.com/office/drawing/2014/chartex" xmlns:cx1="http://schemas.microsoft.com/office/drawing/2015/9/8/chartex" xmlns:cx2="http://schemas.microsoft.com/office/drawing/2015/10/21/chartex" xmlns:cx3="http://schemas.microsoft.com/office/drawing/2016/5/9/chartex" xmlns:cx4="http://schemas.microsoft.com/office/drawing/2016/5/10/chartex" xmlns:cx5="http://schemas.microsoft.com/office/drawing/2016/5/11/chartex" xmlns:cx6="http://schemas.microsoft.com/office/drawing/2016/5/12/chartex" xmlns:cx7="http://schemas.microsoft.com/office/drawing/2016/5/13/chartex" xmlns:cx8="http://schemas.microsoft.com/office/drawing/2016/5/14/chartex" xmlns:mc="http://schemas.openxmlformats.org/markup-compatibility/2006" xmlns:aink="http://schemas.microsoft.com/office/drawing/2016/ink" xmlns:am3d="http://schemas.microsoft.com/office/drawing/2017/model3d" xmlns:o="urn:schemas-microsoft-com:office:office" xmlns:oel="http://schemas.microsoft.com/office/2019/extlst" xmlns:r="http://schemas.openxmlformats.org/officeDocument/2006/relationships" xmlns:m="http://schemas.openxmlformats.org/officeDocument/2006/math" xmlns:v="urn:schemas-microsoft-com:vml" xmlns:wp14="http://schemas.microsoft.com/office/word/2010/wordprocessingDrawing" xmlns:wp="http://schemas.openxmlformats.org/drawingml/2006/wordprocessingDrawing" xmlns:w10="urn:schemas-microsoft-com:office:word" xmlns:w="http://schemas.openxmlformats.org/wordprocessingml/2006/main" xmlns:w14="http://schemas.microsoft.com/office/word/2010/wordml" xmlns:w15="http://schemas.microsoft.com/office/word/2012/wordml" xmlns:w16cex="http://schemas.microsoft.com/office/word/2018/wordml/cex" xmlns:w16cid="http://schemas.microsoft.com/office/word/2016/wordml/cid" xmlns:w16="http://schemas.microsoft.com/office/word/2018/wordml" xmlns:w16du="http://schemas.microsoft.com/office/word/2023/wordml/word16du" xmlns:w16sdtdh="http://schemas.microsoft.com/office/word/2020/wordml/sdtdatahash" xmlns:w16sdtfl="http://schemas.microsoft.com/office/word/2024/wordml/sdtformatlock" xmlns:w16se="http://schemas.microsoft.com/office/word/2015/wordml/symex" xmlns:wpg="http://schemas.microsoft.com/office/word/2010/wordprocessingGroup" xmlns:wpi="http://schemas.microsoft.com/office/word/2010/wordprocessingInk" xmlns:wne="http://schemas.microsoft.com/office/word/2006/wordml" xmlns:wps="http://schemas.microsoft.com/office/word/2010/wordprocessingShape" mc:Ignorable="w14 w15 w16se w16cid w16 w16cex w16sdtdh w16sdtfl w16du wp14">
+<w:ftr xmlns:wpc="http://schemas.microsoft.com/office/word/2010/wordprocessingCanvas" xmlns:cx="http://schemas.microsoft.com/office/drawing/2014/chartex" xmlns:cx1="http://schemas.microsoft.com/office/drawing/2015/9/8/chartex" xmlns:cx2="http://schemas.microsoft.com/office/drawing/2015/10/21/chartex" xmlns:cx3="http://schemas.microsoft.com/office/drawing/2016/5/9/chartex" xmlns:cx4="http://schemas.microsoft.com/office/drawing/2016/5/10/chartex" xmlns:cx5="http://schemas.microsoft.com/office/drawing/2016/5/11/chartex" xmlns:cx6="http://schemas.microsoft.com/office/drawing/2016/5/12/chartex" xmlns:cx7="http://schemas.microsoft.com/office/drawing/2016/5/13/chartex" xmlns:cx8="http://schemas.microsoft.com/office/drawing/2016/5/14/chartex" xmlns:mc="http://schemas.openxmlformats.org/markup-compatibility/2006" xmlns:aink="http://schemas.microsoft.com/office/drawing/2016/ink" xmlns:am3d="http://schemas.microsoft.com/office/drawing/2017/model3d" xmlns:o="urn:schemas-microsoft-com:office:office" xmlns:oel="http://schemas.microsoft.com/office/2019/extlst" xmlns:r="http://schemas.openxmlformats.org/officeDocument/2006/relationships" xmlns:m="http://schemas.openxmlformats.org/officeDocument/2006/math" xmlns:v="urn:schemas-microsoft-com:vml" xmlns:wp14="http://schemas.microsoft.com/office/word/2010/wordprocessingDrawing" xmlns:wp="http://schemas.openxmlformats.org/drawingml/2006/wordprocessingDrawing" xmlns:w10="urn:schemas-microsoft-com:office:word" xmlns:w="http://schemas.openxmlformats.org/wordprocessingml/2006/main" xmlns:w14="http://schemas.microsoft.com/office/word/2010/wordml" xmlns:w15="http://schemas.microsoft.com/office/word/2012/wordml" xmlns:w16cei="http://schemas.microsoft.com/office/word/2026/wordml/cei" xmlns:w16cex="http://schemas.microsoft.com/office/word/2018/wordml/cex" xmlns:w16cid="http://schemas.microsoft.com/office/word/2016/wordml/cid" xmlns:w16="http://schemas.microsoft.com/office/word/2018/wordml" xmlns:w16du="http://schemas.microsoft.com/office/word/2023/wordml/word16du" xmlns:w16sdtdh="http://schemas.microsoft.com/office/word/2020/wordml/sdtdatahash" xmlns:w16sdtfl="http://schemas.microsoft.com/office/word/2024/wordml/sdtformatlock" xmlns:w16se="http://schemas.microsoft.com/office/word/2015/wordml/symex" xmlns:wpg="http://schemas.microsoft.com/office/word/2010/wordprocessingGroup" xmlns:wpi="http://schemas.microsoft.com/office/word/2010/wordprocessingInk" xmlns:wne="http://schemas.microsoft.com/office/word/2006/wordml" xmlns:wps="http://schemas.microsoft.com/office/word/2010/wordprocessingShape" mc:Ignorable="w14 w15 w16se w16cid w16 w16cex w16sdtdh w16sdtfl w16du wp14">
   <w:sdt>
     <w:sdtPr>
       <w:id w:val="1375117340"/>
@@ -4995,7 +4371,7 @@
 </file>
 
 <file path=word/footnotes.xml><?xml version="1.0" encoding="utf-8"?>
-<w:footnotes xmlns:wpc="http://schemas.microsoft.com/office/word/2010/wordprocessingCanvas" xmlns:cx="http://schemas.microsoft.com/office/drawing/2014/chartex" xmlns:cx1="http://schemas.microsoft.com/office/drawing/2015/9/8/chartex" xmlns:cx2="http://schemas.microsoft.com/office/drawing/2015/10/21/chartex" xmlns:cx3="http://schemas.microsoft.com/office/drawing/2016/5/9/chartex" xmlns:cx4="http://schemas.microsoft.com/office/drawing/2016/5/10/chartex" xmlns:cx5="http://schemas.microsoft.com/office/drawing/2016/5/11/chartex" xmlns:cx6="http://schemas.microsoft.com/office/drawing/2016/5/12/chartex" xmlns:cx7="http://schemas.microsoft.com/office/drawing/2016/5/13/chartex" xmlns:cx8="http://schemas.microsoft.com/office/drawing/2016/5/14/chartex" xmlns:mc="http://schemas.openxmlformats.org/markup-compatibility/2006" xmlns:aink="http://schemas.microsoft.com/office/drawing/2016/ink" xmlns:am3d="http://schemas.microsoft.com/office/drawing/2017/model3d" xmlns:o="urn:schemas-microsoft-com:office:office" xmlns:oel="http://schemas.microsoft.com/office/2019/extlst" xmlns:r="http://schemas.openxmlformats.org/officeDocument/2006/relationships" xmlns:m="http://schemas.openxmlformats.org/officeDocument/2006/math" xmlns:v="urn:schemas-microsoft-com:vml" xmlns:wp14="http://schemas.microsoft.com/office/word/2010/wordprocessingDrawing" xmlns:wp="http://schemas.openxmlformats.org/drawingml/2006/wordprocessingDrawing" xmlns:w10="urn:schemas-microsoft-com:office:word" xmlns:w="http://schemas.openxmlformats.org/wordprocessingml/2006/main" xmlns:w14="http://schemas.microsoft.com/office/word/2010/wordml" xmlns:w15="http://schemas.microsoft.com/office/word/2012/wordml" xmlns:w16cex="http://schemas.microsoft.com/office/word/2018/wordml/cex" xmlns:w16cid="http://schemas.microsoft.com/office/word/2016/wordml/cid" xmlns:w16="http://schemas.microsoft.com/office/word/2018/wordml" xmlns:w16du="http://schemas.microsoft.com/office/word/2023/wordml/word16du" xmlns:w16sdtdh="http://schemas.microsoft.com/office/word/2020/wordml/sdtdatahash" xmlns:w16sdtfl="http://schemas.microsoft.com/office/word/2024/wordml/sdtformatlock" xmlns:w16se="http://schemas.microsoft.com/office/word/2015/wordml/symex" xmlns:wpg="http://schemas.microsoft.com/office/word/2010/wordprocessingGroup" xmlns:wpi="http://schemas.microsoft.com/office/word/2010/wordprocessingInk" xmlns:wne="http://schemas.microsoft.com/office/word/2006/wordml" xmlns:wps="http://schemas.microsoft.com/office/word/2010/wordprocessingShape" mc:Ignorable="w14 w15 w16se w16cid w16 w16cex w16sdtdh w16sdtfl w16du wp14">
+<w:footnotes xmlns:wpc="http://schemas.microsoft.com/office/word/2010/wordprocessingCanvas" xmlns:cx="http://schemas.microsoft.com/office/drawing/2014/chartex" xmlns:cx1="http://schemas.microsoft.com/office/drawing/2015/9/8/chartex" xmlns:cx2="http://schemas.microsoft.com/office/drawing/2015/10/21/chartex" xmlns:cx3="http://schemas.microsoft.com/office/drawing/2016/5/9/chartex" xmlns:cx4="http://schemas.microsoft.com/office/drawing/2016/5/10/chartex" xmlns:cx5="http://schemas.microsoft.com/office/drawing/2016/5/11/chartex" xmlns:cx6="http://schemas.microsoft.com/office/drawing/2016/5/12/chartex" xmlns:cx7="http://schemas.microsoft.com/office/drawing/2016/5/13/chartex" xmlns:cx8="http://schemas.microsoft.com/office/drawing/2016/5/14/chartex" xmlns:mc="http://schemas.openxmlformats.org/markup-compatibility/2006" xmlns:aink="http://schemas.microsoft.com/office/drawing/2016/ink" xmlns:am3d="http://schemas.microsoft.com/office/drawing/2017/model3d" xmlns:o="urn:schemas-microsoft-com:office:office" xmlns:oel="http://schemas.microsoft.com/office/2019/extlst" xmlns:r="http://schemas.openxmlformats.org/officeDocument/2006/relationships" xmlns:m="http://schemas.openxmlformats.org/officeDocument/2006/math" xmlns:v="urn:schemas-microsoft-com:vml" xmlns:wp14="http://schemas.microsoft.com/office/word/2010/wordprocessingDrawing" xmlns:wp="http://schemas.openxmlformats.org/drawingml/2006/wordprocessingDrawing" xmlns:w10="urn:schemas-microsoft-com:office:word" xmlns:w="http://schemas.openxmlformats.org/wordprocessingml/2006/main" xmlns:w14="http://schemas.microsoft.com/office/word/2010/wordml" xmlns:w15="http://schemas.microsoft.com/office/word/2012/wordml" xmlns:w16cei="http://schemas.microsoft.com/office/word/2026/wordml/cei" xmlns:w16cex="http://schemas.microsoft.com/office/word/2018/wordml/cex" xmlns:w16cid="http://schemas.microsoft.com/office/word/2016/wordml/cid" xmlns:w16="http://schemas.microsoft.com/office/word/2018/wordml" xmlns:w16du="http://schemas.microsoft.com/office/word/2023/wordml/word16du" xmlns:w16sdtdh="http://schemas.microsoft.com/office/word/2020/wordml/sdtdatahash" xmlns:w16sdtfl="http://schemas.microsoft.com/office/word/2024/wordml/sdtformatlock" xmlns:w16se="http://schemas.microsoft.com/office/word/2015/wordml/symex" xmlns:wpg="http://schemas.microsoft.com/office/word/2010/wordprocessingGroup" xmlns:wpi="http://schemas.microsoft.com/office/word/2010/wordprocessingInk" xmlns:wne="http://schemas.microsoft.com/office/word/2006/wordml" xmlns:wps="http://schemas.microsoft.com/office/word/2010/wordprocessingShape" mc:Ignorable="w14 w15 w16se w16cid w16 w16cex w16sdtdh w16sdtfl w16du wp14">
   <w:footnote w:type="separator" w:id="-1">
     <w:p>
       <w:r>
@@ -5017,7 +4393,7 @@
 </file>
 
 <file path=word/header1.xml><?xml version="1.0" encoding="utf-8"?>
-<w:hdr xmlns:wpc="http://schemas.microsoft.com/office/word/2010/wordprocessingCanvas" xmlns:cx="http://schemas.microsoft.com/office/drawing/2014/chartex" xmlns:cx1="http://schemas.microsoft.com/office/drawing/2015/9/8/chartex" xmlns:cx2="http://schemas.microsoft.com/office/drawing/2015/10/21/chartex" xmlns:cx3="http://schemas.microsoft.com/office/drawing/2016/5/9/chartex" xmlns:cx4="http://schemas.microsoft.com/office/drawing/2016/5/10/chartex" xmlns:cx5="http://schemas.microsoft.com/office/drawing/2016/5/11/chartex" xmlns:cx6="http://schemas.microsoft.com/office/drawing/2016/5/12/chartex" xmlns:cx7="http://schemas.microsoft.com/office/drawing/2016/5/13/chartex" xmlns:cx8="http://schemas.microsoft.com/office/drawing/2016/5/14/chartex" xmlns:mc="http://schemas.openxmlformats.org/markup-compatibility/2006" xmlns:aink="http://schemas.microsoft.com/office/drawing/2016/ink" xmlns:am3d="http://schemas.microsoft.com/office/drawing/2017/model3d" xmlns:o="urn:schemas-microsoft-com:office:office" xmlns:oel="http://schemas.microsoft.com/office/2019/extlst" xmlns:r="http://schemas.openxmlformats.org/officeDocument/2006/relationships" xmlns:m="http://schemas.openxmlformats.org/officeDocument/2006/math" xmlns:v="urn:schemas-microsoft-com:vml" xmlns:wp14="http://schemas.microsoft.com/office/word/2010/wordprocessingDrawing" xmlns:wp="http://schemas.openxmlformats.org/drawingml/2006/wordprocessingDrawing" xmlns:w10="urn:schemas-microsoft-com:office:word" xmlns:w="http://schemas.openxmlformats.org/wordprocessingml/2006/main" xmlns:w14="http://schemas.microsoft.com/office/word/2010/wordml" xmlns:w15="http://schemas.microsoft.com/office/word/2012/wordml" xmlns:w16cex="http://schemas.microsoft.com/office/word/2018/wordml/cex" xmlns:w16cid="http://schemas.microsoft.com/office/word/2016/wordml/cid" xmlns:w16="http://schemas.microsoft.com/office/word/2018/wordml" xmlns:w16du="http://schemas.microsoft.com/office/word/2023/wordml/word16du" xmlns:w16sdtdh="http://schemas.microsoft.com/office/word/2020/wordml/sdtdatahash" xmlns:w16sdtfl="http://schemas.microsoft.com/office/word/2024/wordml/sdtformatlock" xmlns:w16se="http://schemas.microsoft.com/office/word/2015/wordml/symex" xmlns:wpg="http://schemas.microsoft.com/office/word/2010/wordprocessingGroup" xmlns:wpi="http://schemas.microsoft.com/office/word/2010/wordprocessingInk" xmlns:wne="http://schemas.microsoft.com/office/word/2006/wordml" xmlns:wps="http://schemas.microsoft.com/office/word/2010/wordprocessingShape" mc:Ignorable="w14 w15 w16se w16cid w16 w16cex w16sdtdh w16sdtfl w16du wp14">
+<w:hdr xmlns:wpc="http://schemas.microsoft.com/office/word/2010/wordprocessingCanvas" xmlns:cx="http://schemas.microsoft.com/office/drawing/2014/chartex" xmlns:cx1="http://schemas.microsoft.com/office/drawing/2015/9/8/chartex" xmlns:cx2="http://schemas.microsoft.com/office/drawing/2015/10/21/chartex" xmlns:cx3="http://schemas.microsoft.com/office/drawing/2016/5/9/chartex" xmlns:cx4="http://schemas.microsoft.com/office/drawing/2016/5/10/chartex" xmlns:cx5="http://schemas.microsoft.com/office/drawing/2016/5/11/chartex" xmlns:cx6="http://schemas.microsoft.com/office/drawing/2016/5/12/chartex" xmlns:cx7="http://schemas.microsoft.com/office/drawing/2016/5/13/chartex" xmlns:cx8="http://schemas.microsoft.com/office/drawing/2016/5/14/chartex" xmlns:mc="http://schemas.openxmlformats.org/markup-compatibility/2006" xmlns:aink="http://schemas.microsoft.com/office/drawing/2016/ink" xmlns:am3d="http://schemas.microsoft.com/office/drawing/2017/model3d" xmlns:o="urn:schemas-microsoft-com:office:office" xmlns:oel="http://schemas.microsoft.com/office/2019/extlst" xmlns:r="http://schemas.openxmlformats.org/officeDocument/2006/relationships" xmlns:m="http://schemas.openxmlformats.org/officeDocument/2006/math" xmlns:v="urn:schemas-microsoft-com:vml" xmlns:wp14="http://schemas.microsoft.com/office/word/2010/wordprocessingDrawing" xmlns:wp="http://schemas.openxmlformats.org/drawingml/2006/wordprocessingDrawing" xmlns:w10="urn:schemas-microsoft-com:office:word" xmlns:w="http://schemas.openxmlformats.org/wordprocessingml/2006/main" xmlns:w14="http://schemas.microsoft.com/office/word/2010/wordml" xmlns:w15="http://schemas.microsoft.com/office/word/2012/wordml" xmlns:w16cei="http://schemas.microsoft.com/office/word/2026/wordml/cei" xmlns:w16cex="http://schemas.microsoft.com/office/word/2018/wordml/cex" xmlns:w16cid="http://schemas.microsoft.com/office/word/2016/wordml/cid" xmlns:w16="http://schemas.microsoft.com/office/word/2018/wordml" xmlns:w16du="http://schemas.microsoft.com/office/word/2023/wordml/word16du" xmlns:w16sdtdh="http://schemas.microsoft.com/office/word/2020/wordml/sdtdatahash" xmlns:w16sdtfl="http://schemas.microsoft.com/office/word/2024/wordml/sdtformatlock" xmlns:w16se="http://schemas.microsoft.com/office/word/2015/wordml/symex" xmlns:wpg="http://schemas.microsoft.com/office/word/2010/wordprocessingGroup" xmlns:wpi="http://schemas.microsoft.com/office/word/2010/wordprocessingInk" xmlns:wne="http://schemas.microsoft.com/office/word/2006/wordml" xmlns:wps="http://schemas.microsoft.com/office/word/2010/wordprocessingShape" mc:Ignorable="w14 w15 w16se w16cid w16 w16cex w16sdtdh w16sdtfl w16du wp14">
   <w:p>
     <w:pPr>
       <w:pStyle w:val="Header"/>
@@ -5141,7 +4517,7 @@
 </file>
 
 <file path=word/header2.xml><?xml version="1.0" encoding="utf-8"?>
-<w:hdr xmlns:wpc="http://schemas.microsoft.com/office/word/2010/wordprocessingCanvas" xmlns:cx="http://schemas.microsoft.com/office/drawing/2014/chartex" xmlns:cx1="http://schemas.microsoft.com/office/drawing/2015/9/8/chartex" xmlns:cx2="http://schemas.microsoft.com/office/drawing/2015/10/21/chartex" xmlns:cx3="http://schemas.microsoft.com/office/drawing/2016/5/9/chartex" xmlns:cx4="http://schemas.microsoft.com/office/drawing/2016/5/10/chartex" xmlns:cx5="http://schemas.microsoft.com/office/drawing/2016/5/11/chartex" xmlns:cx6="http://schemas.microsoft.com/office/drawing/2016/5/12/chartex" xmlns:cx7="http://schemas.microsoft.com/office/drawing/2016/5/13/chartex" xmlns:cx8="http://schemas.microsoft.com/office/drawing/2016/5/14/chartex" xmlns:mc="http://schemas.openxmlformats.org/markup-compatibility/2006" xmlns:aink="http://schemas.microsoft.com/office/drawing/2016/ink" xmlns:am3d="http://schemas.microsoft.com/office/drawing/2017/model3d" xmlns:o="urn:schemas-microsoft-com:office:office" xmlns:oel="http://schemas.microsoft.com/office/2019/extlst" xmlns:r="http://schemas.openxmlformats.org/officeDocument/2006/relationships" xmlns:m="http://schemas.openxmlformats.org/officeDocument/2006/math" xmlns:v="urn:schemas-microsoft-com:vml" xmlns:wp14="http://schemas.microsoft.com/office/word/2010/wordprocessingDrawing" xmlns:wp="http://schemas.openxmlformats.org/drawingml/2006/wordprocessingDrawing" xmlns:w10="urn:schemas-microsoft-com:office:word" xmlns:w="http://schemas.openxmlformats.org/wordprocessingml/2006/main" xmlns:w14="http://schemas.microsoft.com/office/word/2010/wordml" xmlns:w15="http://schemas.microsoft.com/office/word/2012/wordml" xmlns:w16cex="http://schemas.microsoft.com/office/word/2018/wordml/cex" xmlns:w16cid="http://schemas.microsoft.com/office/word/2016/wordml/cid" xmlns:w16="http://schemas.microsoft.com/office/word/2018/wordml" xmlns:w16du="http://schemas.microsoft.com/office/word/2023/wordml/word16du" xmlns:w16sdtdh="http://schemas.microsoft.com/office/word/2020/wordml/sdtdatahash" xmlns:w16sdtfl="http://schemas.microsoft.com/office/word/2024/wordml/sdtformatlock" xmlns:w16se="http://schemas.microsoft.com/office/word/2015/wordml/symex" xmlns:wpg="http://schemas.microsoft.com/office/word/2010/wordprocessingGroup" xmlns:wpi="http://schemas.microsoft.com/office/word/2010/wordprocessingInk" xmlns:wne="http://schemas.microsoft.com/office/word/2006/wordml" xmlns:wps="http://schemas.microsoft.com/office/word/2010/wordprocessingShape" mc:Ignorable="w14 w15 w16se w16cid w16 w16cex w16sdtdh w16sdtfl w16du wp14">
+<w:hdr xmlns:wpc="http://schemas.microsoft.com/office/word/2010/wordprocessingCanvas" xmlns:cx="http://schemas.microsoft.com/office/drawing/2014/chartex" xmlns:cx1="http://schemas.microsoft.com/office/drawing/2015/9/8/chartex" xmlns:cx2="http://schemas.microsoft.com/office/drawing/2015/10/21/chartex" xmlns:cx3="http://schemas.microsoft.com/office/drawing/2016/5/9/chartex" xmlns:cx4="http://schemas.microsoft.com/office/drawing/2016/5/10/chartex" xmlns:cx5="http://schemas.microsoft.com/office/drawing/2016/5/11/chartex" xmlns:cx6="http://schemas.microsoft.com/office/drawing/2016/5/12/chartex" xmlns:cx7="http://schemas.microsoft.com/office/drawing/2016/5/13/chartex" xmlns:cx8="http://schemas.microsoft.com/office/drawing/2016/5/14/chartex" xmlns:mc="http://schemas.openxmlformats.org/markup-compatibility/2006" xmlns:aink="http://schemas.microsoft.com/office/drawing/2016/ink" xmlns:am3d="http://schemas.microsoft.com/office/drawing/2017/model3d" xmlns:o="urn:schemas-microsoft-com:office:office" xmlns:oel="http://schemas.microsoft.com/office/2019/extlst" xmlns:r="http://schemas.openxmlformats.org/officeDocument/2006/relationships" xmlns:m="http://schemas.openxmlformats.org/officeDocument/2006/math" xmlns:v="urn:schemas-microsoft-com:vml" xmlns:wp14="http://schemas.microsoft.com/office/word/2010/wordprocessingDrawing" xmlns:wp="http://schemas.openxmlformats.org/drawingml/2006/wordprocessingDrawing" xmlns:w10="urn:schemas-microsoft-com:office:word" xmlns:w="http://schemas.openxmlformats.org/wordprocessingml/2006/main" xmlns:w14="http://schemas.microsoft.com/office/word/2010/wordml" xmlns:w15="http://schemas.microsoft.com/office/word/2012/wordml" xmlns:w16cei="http://schemas.microsoft.com/office/word/2026/wordml/cei" xmlns:w16cex="http://schemas.microsoft.com/office/word/2018/wordml/cex" xmlns:w16cid="http://schemas.microsoft.com/office/word/2016/wordml/cid" xmlns:w16="http://schemas.microsoft.com/office/word/2018/wordml" xmlns:w16du="http://schemas.microsoft.com/office/word/2023/wordml/word16du" xmlns:w16sdtdh="http://schemas.microsoft.com/office/word/2020/wordml/sdtdatahash" xmlns:w16sdtfl="http://schemas.microsoft.com/office/word/2024/wordml/sdtformatlock" xmlns:w16se="http://schemas.microsoft.com/office/word/2015/wordml/symex" xmlns:wpg="http://schemas.microsoft.com/office/word/2010/wordprocessingGroup" xmlns:wpi="http://schemas.microsoft.com/office/word/2010/wordprocessingInk" xmlns:wne="http://schemas.microsoft.com/office/word/2006/wordml" xmlns:wps="http://schemas.microsoft.com/office/word/2010/wordprocessingShape" mc:Ignorable="w14 w15 w16se w16cid w16 w16cex w16sdtdh w16sdtfl w16du wp14">
   <w:p>
     <w:pPr>
       <w:pStyle w:val="Header"/>
@@ -5267,7 +4643,7 @@
 </file>
 
 <file path=word/header3.xml><?xml version="1.0" encoding="utf-8"?>
-<w:hdr xmlns:wpc="http://schemas.microsoft.com/office/word/2010/wordprocessingCanvas" xmlns:cx="http://schemas.microsoft.com/office/drawing/2014/chartex" xmlns:cx1="http://schemas.microsoft.com/office/drawing/2015/9/8/chartex" xmlns:cx2="http://schemas.microsoft.com/office/drawing/2015/10/21/chartex" xmlns:cx3="http://schemas.microsoft.com/office/drawing/2016/5/9/chartex" xmlns:cx4="http://schemas.microsoft.com/office/drawing/2016/5/10/chartex" xmlns:cx5="http://schemas.microsoft.com/office/drawing/2016/5/11/chartex" xmlns:cx6="http://schemas.microsoft.com/office/drawing/2016/5/12/chartex" xmlns:cx7="http://schemas.microsoft.com/office/drawing/2016/5/13/chartex" xmlns:cx8="http://schemas.microsoft.com/office/drawing/2016/5/14/chartex" xmlns:mc="http://schemas.openxmlformats.org/markup-compatibility/2006" xmlns:aink="http://schemas.microsoft.com/office/drawing/2016/ink" xmlns:am3d="http://schemas.microsoft.com/office/drawing/2017/model3d" xmlns:o="urn:schemas-microsoft-com:office:office" xmlns:oel="http://schemas.microsoft.com/office/2019/extlst" xmlns:r="http://schemas.openxmlformats.org/officeDocument/2006/relationships" xmlns:m="http://schemas.openxmlformats.org/officeDocument/2006/math" xmlns:v="urn:schemas-microsoft-com:vml" xmlns:wp14="http://schemas.microsoft.com/office/word/2010/wordprocessingDrawing" xmlns:wp="http://schemas.openxmlformats.org/drawingml/2006/wordprocessingDrawing" xmlns:w10="urn:schemas-microsoft-com:office:word" xmlns:w="http://schemas.openxmlformats.org/wordprocessingml/2006/main" xmlns:w14="http://schemas.microsoft.com/office/word/2010/wordml" xmlns:w15="http://schemas.microsoft.com/office/word/2012/wordml" xmlns:w16cex="http://schemas.microsoft.com/office/word/2018/wordml/cex" xmlns:w16cid="http://schemas.microsoft.com/office/word/2016/wordml/cid" xmlns:w16="http://schemas.microsoft.com/office/word/2018/wordml" xmlns:w16du="http://schemas.microsoft.com/office/word/2023/wordml/word16du" xmlns:w16sdtdh="http://schemas.microsoft.com/office/word/2020/wordml/sdtdatahash" xmlns:w16sdtfl="http://schemas.microsoft.com/office/word/2024/wordml/sdtformatlock" xmlns:w16se="http://schemas.microsoft.com/office/word/2015/wordml/symex" xmlns:wpg="http://schemas.microsoft.com/office/word/2010/wordprocessingGroup" xmlns:wpi="http://schemas.microsoft.com/office/word/2010/wordprocessingInk" xmlns:wne="http://schemas.microsoft.com/office/word/2006/wordml" xmlns:wps="http://schemas.microsoft.com/office/word/2010/wordprocessingShape" mc:Ignorable="w14 w15 w16se w16cid w16 w16cex w16sdtdh w16sdtfl w16du wp14">
+<w:hdr xmlns:wpc="http://schemas.microsoft.com/office/word/2010/wordprocessingCanvas" xmlns:cx="http://schemas.microsoft.com/office/drawing/2014/chartex" xmlns:cx1="http://schemas.microsoft.com/office/drawing/2015/9/8/chartex" xmlns:cx2="http://schemas.microsoft.com/office/drawing/2015/10/21/chartex" xmlns:cx3="http://schemas.microsoft.com/office/drawing/2016/5/9/chartex" xmlns:cx4="http://schemas.microsoft.com/office/drawing/2016/5/10/chartex" xmlns:cx5="http://schemas.microsoft.com/office/drawing/2016/5/11/chartex" xmlns:cx6="http://schemas.microsoft.com/office/drawing/2016/5/12/chartex" xmlns:cx7="http://schemas.microsoft.com/office/drawing/2016/5/13/chartex" xmlns:cx8="http://schemas.microsoft.com/office/drawing/2016/5/14/chartex" xmlns:mc="http://schemas.openxmlformats.org/markup-compatibility/2006" xmlns:aink="http://schemas.microsoft.com/office/drawing/2016/ink" xmlns:am3d="http://schemas.microsoft.com/office/drawing/2017/model3d" xmlns:o="urn:schemas-microsoft-com:office:office" xmlns:oel="http://schemas.microsoft.com/office/2019/extlst" xmlns:r="http://schemas.openxmlformats.org/officeDocument/2006/relationships" xmlns:m="http://schemas.openxmlformats.org/officeDocument/2006/math" xmlns:v="urn:schemas-microsoft-com:vml" xmlns:wp14="http://schemas.microsoft.com/office/word/2010/wordprocessingDrawing" xmlns:wp="http://schemas.openxmlformats.org/drawingml/2006/wordprocessingDrawing" xmlns:w10="urn:schemas-microsoft-com:office:word" xmlns:w="http://schemas.openxmlformats.org/wordprocessingml/2006/main" xmlns:w14="http://schemas.microsoft.com/office/word/2010/wordml" xmlns:w15="http://schemas.microsoft.com/office/word/2012/wordml" xmlns:w16cei="http://schemas.microsoft.com/office/word/2026/wordml/cei" xmlns:w16cex="http://schemas.microsoft.com/office/word/2018/wordml/cex" xmlns:w16cid="http://schemas.microsoft.com/office/word/2016/wordml/cid" xmlns:w16="http://schemas.microsoft.com/office/word/2018/wordml" xmlns:w16du="http://schemas.microsoft.com/office/word/2023/wordml/word16du" xmlns:w16sdtdh="http://schemas.microsoft.com/office/word/2020/wordml/sdtdatahash" xmlns:w16sdtfl="http://schemas.microsoft.com/office/word/2024/wordml/sdtformatlock" xmlns:w16se="http://schemas.microsoft.com/office/word/2015/wordml/symex" xmlns:wpg="http://schemas.microsoft.com/office/word/2010/wordprocessingGroup" xmlns:wpi="http://schemas.microsoft.com/office/word/2010/wordprocessingInk" xmlns:wne="http://schemas.microsoft.com/office/word/2006/wordml" xmlns:wps="http://schemas.microsoft.com/office/word/2010/wordprocessingShape" mc:Ignorable="w14 w15 w16se w16cid w16 w16cex w16sdtdh w16sdtfl w16du wp14">
   <w:p>
     <w:pPr>
       <w:pStyle w:val="Header"/>
@@ -5397,7 +4773,7 @@
 </file>
 
 <file path=word/numbering.xml><?xml version="1.0" encoding="utf-8"?>
-<w:numbering xmlns:wpc="http://schemas.microsoft.com/office/word/2010/wordprocessingCanvas" xmlns:cx="http://schemas.microsoft.com/office/drawing/2014/chartex" xmlns:cx1="http://schemas.microsoft.com/office/drawing/2015/9/8/chartex" xmlns:cx2="http://schemas.microsoft.com/office/drawing/2015/10/21/chartex" xmlns:cx3="http://schemas.microsoft.com/office/drawing/2016/5/9/chartex" xmlns:cx4="http://schemas.microsoft.com/office/drawing/2016/5/10/chartex" xmlns:cx5="http://schemas.microsoft.com/office/drawing/2016/5/11/chartex" xmlns:cx6="http://schemas.microsoft.com/office/drawing/2016/5/12/chartex" xmlns:cx7="http://schemas.microsoft.com/office/drawing/2016/5/13/chartex" xmlns:cx8="http://schemas.microsoft.com/office/drawing/2016/5/14/chartex" xmlns:mc="http://schemas.openxmlformats.org/markup-compatibility/2006" xmlns:aink="http://schemas.microsoft.com/office/drawing/2016/ink" xmlns:am3d="http://schemas.microsoft.com/office/drawing/2017/model3d" xmlns:o="urn:schemas-microsoft-com:office:office" xmlns:oel="http://schemas.microsoft.com/office/2019/extlst" xmlns:r="http://schemas.openxmlformats.org/officeDocument/2006/relationships" xmlns:m="http://schemas.openxmlformats.org/officeDocument/2006/math" xmlns:v="urn:schemas-microsoft-com:vml" xmlns:wp14="http://schemas.microsoft.com/office/word/2010/wordprocessingDrawing" xmlns:wp="http://schemas.openxmlformats.org/drawingml/2006/wordprocessingDrawing" xmlns:w10="urn:schemas-microsoft-com:office:word" xmlns:w="http://schemas.openxmlformats.org/wordprocessingml/2006/main" xmlns:w14="http://schemas.microsoft.com/office/word/2010/wordml" xmlns:w15="http://schemas.microsoft.com/office/word/2012/wordml" xmlns:w16cex="http://schemas.microsoft.com/office/word/2018/wordml/cex" xmlns:w16cid="http://schemas.microsoft.com/office/word/2016/wordml/cid" xmlns:w16="http://schemas.microsoft.com/office/word/2018/wordml" xmlns:w16du="http://schemas.microsoft.com/office/word/2023/wordml/word16du" xmlns:w16sdtdh="http://schemas.microsoft.com/office/word/2020/wordml/sdtdatahash" xmlns:w16sdtfl="http://schemas.microsoft.com/office/word/2024/wordml/sdtformatlock" xmlns:w16se="http://schemas.microsoft.com/office/word/2015/wordml/symex" xmlns:wpg="http://schemas.microsoft.com/office/word/2010/wordprocessingGroup" xmlns:wpi="http://schemas.microsoft.com/office/word/2010/wordprocessingInk" xmlns:wne="http://schemas.microsoft.com/office/word/2006/wordml" xmlns:wps="http://schemas.microsoft.com/office/word/2010/wordprocessingShape" mc:Ignorable="w14 w15 w16se w16cid w16 w16cex w16sdtdh w16sdtfl w16du wp14">
+<w:numbering xmlns:wpc="http://schemas.microsoft.com/office/word/2010/wordprocessingCanvas" xmlns:cx="http://schemas.microsoft.com/office/drawing/2014/chartex" xmlns:cx1="http://schemas.microsoft.com/office/drawing/2015/9/8/chartex" xmlns:cx2="http://schemas.microsoft.com/office/drawing/2015/10/21/chartex" xmlns:cx3="http://schemas.microsoft.com/office/drawing/2016/5/9/chartex" xmlns:cx4="http://schemas.microsoft.com/office/drawing/2016/5/10/chartex" xmlns:cx5="http://schemas.microsoft.com/office/drawing/2016/5/11/chartex" xmlns:cx6="http://schemas.microsoft.com/office/drawing/2016/5/12/chartex" xmlns:cx7="http://schemas.microsoft.com/office/drawing/2016/5/13/chartex" xmlns:cx8="http://schemas.microsoft.com/office/drawing/2016/5/14/chartex" xmlns:mc="http://schemas.openxmlformats.org/markup-compatibility/2006" xmlns:aink="http://schemas.microsoft.com/office/drawing/2016/ink" xmlns:am3d="http://schemas.microsoft.com/office/drawing/2017/model3d" xmlns:o="urn:schemas-microsoft-com:office:office" xmlns:oel="http://schemas.microsoft.com/office/2019/extlst" xmlns:r="http://schemas.openxmlformats.org/officeDocument/2006/relationships" xmlns:m="http://schemas.openxmlformats.org/officeDocument/2006/math" xmlns:v="urn:schemas-microsoft-com:vml" xmlns:wp14="http://schemas.microsoft.com/office/word/2010/wordprocessingDrawing" xmlns:wp="http://schemas.openxmlformats.org/drawingml/2006/wordprocessingDrawing" xmlns:w10="urn:schemas-microsoft-com:office:word" xmlns:w="http://schemas.openxmlformats.org/wordprocessingml/2006/main" xmlns:w14="http://schemas.microsoft.com/office/word/2010/wordml" xmlns:w15="http://schemas.microsoft.com/office/word/2012/wordml" xmlns:w16cei="http://schemas.microsoft.com/office/word/2026/wordml/cei" xmlns:w16cex="http://schemas.microsoft.com/office/word/2018/wordml/cex" xmlns:w16cid="http://schemas.microsoft.com/office/word/2016/wordml/cid" xmlns:w16="http://schemas.microsoft.com/office/word/2018/wordml" xmlns:w16du="http://schemas.microsoft.com/office/word/2023/wordml/word16du" xmlns:w16sdtdh="http://schemas.microsoft.com/office/word/2020/wordml/sdtdatahash" xmlns:w16sdtfl="http://schemas.microsoft.com/office/word/2024/wordml/sdtformatlock" xmlns:w16se="http://schemas.microsoft.com/office/word/2015/wordml/symex" xmlns:wpg="http://schemas.microsoft.com/office/word/2010/wordprocessingGroup" xmlns:wpi="http://schemas.microsoft.com/office/word/2010/wordprocessingInk" xmlns:wne="http://schemas.microsoft.com/office/word/2006/wordml" xmlns:wps="http://schemas.microsoft.com/office/word/2010/wordprocessingShape" mc:Ignorable="w14 w15 w16se w16cid w16 w16cex w16sdtdh w16sdtfl w16du wp14">
   <w:abstractNum w:abstractNumId="0" w15:restartNumberingAfterBreak="0">
     <w:nsid w:val="02A51885"/>
     <w:multiLevelType w:val="hybridMultilevel"/>
@@ -10761,6 +10137,7 @@
   <w:style w:type="character" w:default="1" w:styleId="DefaultParagraphFont">
     <w:name w:val="Default Paragraph Font"/>
     <w:uiPriority w:val="1"/>
+    <w:semiHidden/>
     <w:unhideWhenUsed/>
   </w:style>
   <w:style w:type="table" w:default="1" w:styleId="TableNormal">
@@ -12464,7 +11841,12 @@
 </file>
 
 <file path=customXml/item2.xml><?xml version="1.0" encoding="utf-8"?>
-<b:Sources xmlns:b="http://schemas.openxmlformats.org/officeDocument/2006/bibliography" xmlns="http://schemas.openxmlformats.org/officeDocument/2006/bibliography" SelectedStyle="\MLA.XSL" StyleName="MLA"/>
+<?mso-contentType ?>
+<FormTemplates xmlns="http://schemas.microsoft.com/sharepoint/v3/contenttype/forms">
+  <Display>DocumentLibraryForm</Display>
+  <Edit>DocumentLibraryForm</Edit>
+  <New>DocumentLibraryForm</New>
+</FormTemplates>
 </file>
 
 <file path=customXml/item3.xml><?xml version="1.0" encoding="utf-8"?>
@@ -12680,12 +12062,7 @@
 </file>
 
 <file path=customXml/item4.xml><?xml version="1.0" encoding="utf-8"?>
-<?mso-contentType ?>
-<FormTemplates xmlns="http://schemas.microsoft.com/sharepoint/v3/contenttype/forms">
-  <Display>DocumentLibraryForm</Display>
-  <Edit>DocumentLibraryForm</Edit>
-  <New>DocumentLibraryForm</New>
-</FormTemplates>
+<b:Sources xmlns:b="http://schemas.openxmlformats.org/officeDocument/2006/bibliography" xmlns="http://schemas.openxmlformats.org/officeDocument/2006/bibliography" SelectedStyle="\MLA.XSL" StyleName="MLA"/>
 </file>
 
 <file path=customXml/itemProps1.xml><?xml version="1.0" encoding="utf-8"?>
@@ -12701,9 +12078,9 @@
 </file>
 
 <file path=customXml/itemProps2.xml><?xml version="1.0" encoding="utf-8"?>
-<ds:datastoreItem xmlns:ds="http://schemas.openxmlformats.org/officeDocument/2006/customXml" ds:itemID="{6A404842-743E-4BBC-99A7-70A911F17733}">
+<ds:datastoreItem xmlns:ds="http://schemas.openxmlformats.org/officeDocument/2006/customXml" ds:itemID="{C793F174-B33D-4AAE-9E3B-9A362A6F4892}">
   <ds:schemaRefs>
-    <ds:schemaRef ds:uri="http://schemas.openxmlformats.org/officeDocument/2006/bibliography"/>
+    <ds:schemaRef ds:uri="http://schemas.microsoft.com/sharepoint/v3/contenttype/forms"/>
   </ds:schemaRefs>
 </ds:datastoreItem>
 </file>
@@ -12729,9 +12106,9 @@
 </file>
 
 <file path=customXml/itemProps4.xml><?xml version="1.0" encoding="utf-8"?>
-<ds:datastoreItem xmlns:ds="http://schemas.openxmlformats.org/officeDocument/2006/customXml" ds:itemID="{C793F174-B33D-4AAE-9E3B-9A362A6F4892}">
+<ds:datastoreItem xmlns:ds="http://schemas.openxmlformats.org/officeDocument/2006/customXml" ds:itemID="{6A404842-743E-4BBC-99A7-70A911F17733}">
   <ds:schemaRefs>
-    <ds:schemaRef ds:uri="http://schemas.microsoft.com/sharepoint/v3/contenttype/forms"/>
+    <ds:schemaRef ds:uri="http://schemas.openxmlformats.org/officeDocument/2006/bibliography"/>
   </ds:schemaRefs>
 </ds:datastoreItem>
 </file>
</xml_diff>